<commit_message>
RSM v3: Word equation objects (OMML), non-oracle ARI clarification, real-data table fix
Co-Authored-By: Tatsuki Onishi <bougtoir@gmail.com>
</commit_message>
<xml_diff>
--- a/results/manuscript/rsm_submission/IONE_rsm_v3.docx
+++ b/results/manuscript/rsm_submission/IONE_rsm_v3.docx
@@ -42,7 +42,41 @@
         <w:t>Methods:</w:t>
       </w:r>
       <w:r>
-        <w:t xml:space="preserve"> We simulated an IPD meta-analysis with 10 studies, a binary treatment and outcome, measured covariates carrying traces of an unmeasured modifier, and study-level variation in baseline risk and treatment prevalence. Proposed methods and active comparators stratified the pooled IPD; stratum-specific risk differences were synthesised with fixed-effect and DerSimonian-Laird random-effects meta-analysis. We report ARI, C1 (between-stratum heterogeneity), W_true/W_est (within-stratum homogeneity) and ATE bias reduction, with Monte Carlo standard errors. </w:t>
+        <w:t xml:space="preserve"> We simulated an IPD meta-analysis with 10 studies, a binary treatment and outcome, measured covariates carrying traces of an unmeasured modifier, and study-level variation in baseline risk and treatment prevalence. Proposed methods and active comparators stratified the pooled IPD; stratum-specific risk differences were synthesised with fixed-effect and DerSimonian-Laird random-effects meta-analysis. We report ARI, C1 (between-stratum heterogeneity), </w:t>
+      </w:r>
+      <m:oMath>
+        <m:sSub>
+          <m:e>
+            <m:r>
+              <m:t xml:space="preserve">W</m:t>
+            </m:r>
+          </m:e>
+          <m:sub>
+            <m:r>
+              <m:t xml:space="preserve">true</m:t>
+            </m:r>
+          </m:sub>
+        </m:sSub>
+      </m:oMath>
+      <w:r>
+        <w:t xml:space="preserve">/</w:t>
+      </w:r>
+      <m:oMath>
+        <m:sSub>
+          <m:e>
+            <m:r>
+              <m:t xml:space="preserve">W</m:t>
+            </m:r>
+          </m:e>
+          <m:sub>
+            <m:r>
+              <m:t xml:space="preserve">est</m:t>
+            </m:r>
+          </m:sub>
+        </m:sSub>
+      </m:oMath>
+      <w:r>
+        <w:t xml:space="preserve"> (within-stratum homogeneity) and ATE bias reduction, with Monte Carlo standard errors. </w:t>
       </w:r>
       <w:r>
         <w:rPr>
@@ -51,7 +85,41 @@
         <w:t>Results:</w:t>
       </w:r>
       <w:r>
-        <w:t xml:space="preserve"> In the primary scenario (n=2000, 10 studies, K=5 strata), the best method was 1B_residual (ARI 0.372; C1 0.927; W_true 0.363; W_est 0.078). Crude ATE bias was 0.01865; stratification reduced it to 0.01345 (relative 0.279) and random-effects pooling to 0.00816 (relative 0.563). Diagnostic agreement with the true hidden structure remained modest. </w:t>
+        <w:t xml:space="preserve"> In the primary scenario (n=2000, 10 studies, K=5 strata), the best method was 1B_residual (ARI 0.372; C1 0.927; </w:t>
+      </w:r>
+      <m:oMath>
+        <m:sSub>
+          <m:e>
+            <m:r>
+              <m:t xml:space="preserve">W</m:t>
+            </m:r>
+          </m:e>
+          <m:sub>
+            <m:r>
+              <m:t xml:space="preserve">true</m:t>
+            </m:r>
+          </m:sub>
+        </m:sSub>
+      </m:oMath>
+      <w:r>
+        <w:t xml:space="preserve"> 0.363; </w:t>
+      </w:r>
+      <m:oMath>
+        <m:sSub>
+          <m:e>
+            <m:r>
+              <m:t xml:space="preserve">W</m:t>
+            </m:r>
+          </m:e>
+          <m:sub>
+            <m:r>
+              <m:t xml:space="preserve">est</m:t>
+            </m:r>
+          </m:sub>
+        </m:sSub>
+      </m:oMath>
+      <w:r>
+        <w:t xml:space="preserve"> 0.078). Crude ATE bias was 0.01865; stratification reduced it to 0.01345 (relative 0.279) and random-effects pooling to 0.00816 (relative 0.563). Diagnostic agreement with the true hidden structure remained modest. </w:t>
       </w:r>
       <w:r>
         <w:rPr>
@@ -482,7 +550,24 @@
     </w:p>
     <w:p>
       <w:r>
-        <w:t>All quantile-based methods used equal-frequency strata after score estimation. Logistic regression used l2 regularisation (C=1.0, lbfgs solver, max_iter=1000). K-means and the Gaussian mixture model used n_init=10 and fixed random seeds. Standardisation was applied before PCA, k-means and GMM. Outcome-informed methods used a 50/50 discovery/evaluation split: the discovery half was used to fit the Y~X model and derive stratum assignments, and the evaluation half was used to estimate stratum-specific effects, C1 and W_est. Outcome-free methods used the full sample for both assignment and estimation.</w:t>
+        <w:t xml:space="preserve">All quantile-based methods used equal-frequency strata after score estimation. Logistic regression used l2 regularisation (C=1.0, lbfgs solver, max_iter=1000). K-means and the Gaussian mixture model used n_init=10 and fixed random seeds. Standardisation was applied before PCA, k-means and GMM. Outcome-informed methods used a 50/50 discovery/evaluation split: the discovery half was used to fit the Y~X model and derive stratum assignments, and the evaluation half was used to estimate stratum-specific effects, C1 and </w:t>
+      </w:r>
+      <m:oMath>
+        <m:sSub>
+          <m:e>
+            <m:r>
+              <m:t xml:space="preserve">W</m:t>
+            </m:r>
+          </m:e>
+          <m:sub>
+            <m:r>
+              <m:t xml:space="preserve">est</m:t>
+            </m:r>
+          </m:sub>
+        </m:sSub>
+      </m:oMath>
+      <w:r>
+        <w:t xml:space="preserve">. Outcome-free methods used the full sample for both assignment and estimation.</w:t>
       </w:r>
     </w:p>
     <w:p>
@@ -495,7 +580,49 @@
     </w:p>
     <w:p>
       <w:r>
-        <w:t>For each discovered stratum we computed the risk difference P(Y=1|A=1) - P(Y=1|A=0) and its standard error. A two-stage fixed-effect summary was the stratum-size-weighted average of these risk differences. A DerSimonian-Laird random-effects summary added an estimate of between-stratum variance and re-weighted stratum estimates accordingly (DerSimonian and Laird 1986). We also report the resulting tau^2 and I^2 as summaries of between-stratum heterogeneity on the risk-difference scale. The random-effects synthesis treats discovered strata as studies in a conventional meta-analysis, allowing the stratum-specific effects to vary.</w:t>
+        <w:t xml:space="preserve">For each discovered stratum we computed the risk difference </w:t>
+      </w:r>
+      <m:oMath>
+        <m:r>
+          <m:t xml:space="preserve">P(Y=1|A=1) - P(Y=1|A=0)</m:t>
+        </m:r>
+      </m:oMath>
+      <w:r>
+        <w:t xml:space="preserve"> and its standard error. A two-stage fixed-effect summary was the stratum-size-weighted average of these risk differences. A DerSimonian-Laird random-effects summary added an estimate of between-stratum variance and re-weighted stratum estimates accordingly (DerSimonian and Laird 1986). We also report the resulting </w:t>
+      </w:r>
+      <m:oMath>
+        <m:sSup>
+          <m:e>
+            <m:r>
+              <m:t xml:space="preserve">τ</m:t>
+            </m:r>
+          </m:e>
+          <m:sup>
+            <m:r>
+              <m:t xml:space="preserve">2</m:t>
+            </m:r>
+          </m:sup>
+        </m:sSup>
+      </m:oMath>
+      <w:r>
+        <w:t xml:space="preserve"> and </w:t>
+      </w:r>
+      <m:oMath>
+        <m:sSup>
+          <m:e>
+            <m:r>
+              <m:t xml:space="preserve">I</m:t>
+            </m:r>
+          </m:e>
+          <m:sup>
+            <m:r>
+              <m:t xml:space="preserve">2</m:t>
+            </m:r>
+          </m:sup>
+        </m:sSup>
+      </m:oMath>
+      <w:r>
+        <w:t xml:space="preserve"> as summaries of between-stratum heterogeneity on the risk-difference scale. The random-effects synthesis treats discovered strata as studies in a conventional meta-analysis, allowing the stratum-specific effects to vary.</w:t>
       </w:r>
     </w:p>
     <w:p>
@@ -530,39 +657,89 @@
       <w:pPr>
         <w:pStyle w:val="ListBullet"/>
       </w:pPr>
-      <w:r/>
+      <m:oMath>
+        <m:r>
+          <m:t xml:space="preserve">C1 = 1 - </m:t>
+        </m:r>
+        <m:sSup>
+          <m:e>
+            <m:r>
+              <m:t xml:space="preserve">I</m:t>
+            </m:r>
+          </m:e>
+          <m:sup>
+            <m:r>
+              <m:t xml:space="preserve">2</m:t>
+            </m:r>
+          </m:sup>
+        </m:sSup>
+      </m:oMath>
       <w:r>
-        <w:rPr>
-          <w:b/>
-        </w:rPr>
-        <w:t>C1</w:t>
+        <w:t xml:space="preserve">, where </w:t>
       </w:r>
+      <m:oMath>
+        <m:sSup>
+          <m:e>
+            <m:r>
+              <m:t xml:space="preserve">I</m:t>
+            </m:r>
+          </m:e>
+          <m:sup>
+            <m:r>
+              <m:t xml:space="preserve">2</m:t>
+            </m:r>
+          </m:sup>
+        </m:sSup>
+      </m:oMath>
       <w:r>
-        <w:t xml:space="preserve"> = 1 - I^2, where I^2 is the heterogeneity statistic (Higgins and Thompson 2002) applied to stratum-specific log odds ratios of A on Y. Lower C1 indicates stronger between-stratum heterogeneity (an incoherent pooled population); higher C1 indicates more homogeneous effects (coherent strata).</w:t>
+        <w:t xml:space="preserve"> is the heterogeneity statistic (Higgins and Thompson 2002) applied to stratum-specific log odds ratios of A on Y. Lower C1 indicates stronger between-stratum heterogeneity (an incoherent pooled population); higher C1 indicates more homogeneous effects (coherent strata).</w:t>
       </w:r>
     </w:p>
     <w:p>
       <w:pPr>
         <w:pStyle w:val="ListBullet"/>
       </w:pPr>
-      <w:r/>
-      <w:r>
-        <w:rPr>
-          <w:b/>
-        </w:rPr>
-        <w:t>W_true</w:t>
-      </w:r>
+      <m:oMath>
+        <m:sSub>
+          <m:e>
+            <m:r>
+              <m:t xml:space="preserve">W</m:t>
+            </m:r>
+          </m:e>
+          <m:sub>
+            <m:r>
+              <m:t xml:space="preserve">true</m:t>
+            </m:r>
+          </m:sub>
+        </m:sSub>
+      </m:oMath>
       <w:r>
         <w:t xml:space="preserve"> and </w:t>
       </w:r>
+      <m:oMath>
+        <m:sSub>
+          <m:e>
+            <m:r>
+              <m:t xml:space="preserve">W</m:t>
+            </m:r>
+          </m:e>
+          <m:sub>
+            <m:r>
+              <m:t xml:space="preserve">est</m:t>
+            </m:r>
+          </m:sub>
+        </m:sSub>
+      </m:oMath>
       <w:r>
-        <w:rPr>
-          <w:b/>
-        </w:rPr>
-        <w:t>W_est</w:t>
+        <w:t xml:space="preserve">: the proportion of total CATE variance explained by the stratification, computed using either the true individual CATE (simulation-only) or an estimated CATE from a flexible </w:t>
       </w:r>
+      <m:oMath>
+        <m:r>
+          <m:t xml:space="preserve">Y ~ X + A + X×A</m:t>
+        </m:r>
+      </m:oMath>
       <w:r>
-        <w:t>: the proportion of total CATE variance explained by the stratification, computed using either the true individual CATE (simulation-only) or an estimated CATE from a flexible Y ~ X + A + X*A logistic model (operational diagnostic).</w:t>
+        <w:t xml:space="preserve"> logistic model (operational diagnostic).</w:t>
       </w:r>
     </w:p>
     <w:p>
@@ -577,7 +754,43 @@
         <w:t>ATE bias reduction</w:t>
       </w:r>
       <w:r>
-        <w:t xml:space="preserve"> on the risk-difference scale, reported as the absolute difference |bias_crude| - |bias_stratified| and |bias_crude| - |bias_re|, and as the relative ratio 1 - |bias_stratified| / |bias_crude|.</w:t>
+        <w:t xml:space="preserve"> on the risk-difference scale, reported as the absolute difference </w:t>
+      </w:r>
+      <m:oMath>
+        <m:r>
+          <m:t xml:space="preserve">|bias_crude| - |bias_stratified|</m:t>
+        </m:r>
+      </m:oMath>
+      <w:r>
+        <w:t xml:space="preserve"> and </w:t>
+      </w:r>
+      <m:oMath>
+        <m:r>
+          <m:t xml:space="preserve">|bias_crude| - |bias_re|</m:t>
+        </m:r>
+      </m:oMath>
+      <w:r>
+        <w:t xml:space="preserve">, and as the relative ratio </w:t>
+      </w:r>
+      <m:oMath>
+        <m:r>
+          <m:t xml:space="preserve">1 - </m:t>
+        </m:r>
+        <m:f>
+          <m:num>
+            <m:r>
+              <m:t xml:space="preserve">|bias_stratified|</m:t>
+            </m:r>
+          </m:num>
+          <m:den>
+            <m:r>
+              <m:t xml:space="preserve">|bias_crude|</m:t>
+            </m:r>
+          </m:den>
+        </m:f>
+      </m:oMath>
+      <w:r>
+        <w:t xml:space="preserve">.</w:t>
       </w:r>
     </w:p>
     <w:p>
@@ -590,7 +803,41 @@
     </w:p>
     <w:p>
       <w:r>
-        <w:t>The true-Z partition is an operational construct: k-means clustering applied to the standardised Z-space with K equal to the number of strata. ARI therefore measures agreement with a constructed reference rather than with clinically observed subgroups. W_true is available only in simulation; W_est is the operational diagnostic that can be computed in real data, although it requires a correctly specified outcome model and should be interpreted cautiously.</w:t>
+        <w:t xml:space="preserve">The true-Z partition is an operational construct: k-means clustering applied to the standardised Z-space with K equal to the number of strata. ARI therefore measures agreement with a constructed reference rather than with clinically observed subgroups. </w:t>
+      </w:r>
+      <m:oMath>
+        <m:sSub>
+          <m:e>
+            <m:r>
+              <m:t xml:space="preserve">W</m:t>
+            </m:r>
+          </m:e>
+          <m:sub>
+            <m:r>
+              <m:t xml:space="preserve">true</m:t>
+            </m:r>
+          </m:sub>
+        </m:sSub>
+      </m:oMath>
+      <w:r>
+        <w:t xml:space="preserve"> is available only in simulation; </w:t>
+      </w:r>
+      <m:oMath>
+        <m:sSub>
+          <m:e>
+            <m:r>
+              <m:t xml:space="preserve">W</m:t>
+            </m:r>
+          </m:e>
+          <m:sub>
+            <m:r>
+              <m:t xml:space="preserve">est</m:t>
+            </m:r>
+          </m:sub>
+        </m:sSub>
+      </m:oMath>
+      <w:r>
+        <w:t xml:space="preserve"> is the operational diagnostic that can be computed in real data, although it requires a correctly specified outcome model and should be interpreted cautiously.</w:t>
       </w:r>
     </w:p>
     <w:p>
@@ -695,7 +942,41 @@
     </w:p>
     <w:p>
       <w:r>
-        <w:t>Table 1 summarises the primary IPD scenario (n=2000, 10 studies, K=5 strata, 50 replications). Extraction of the true hidden structure was modest: the best ARI was 0.372, observed for baseline_oracle_kmeans, while the Oracle baseline that uses the true Z variables directly achieved a substantially higher ARI. The average C1 across methods was 0.889, and average within-stratum homogeneity was limited (mean W_true = 0.242; mean W_est = 0.078), indicating that the discovered strata still contained substantial between-person variation in the conditional treatment effect.</w:t>
+        <w:t xml:space="preserve">Table 1 summarises the primary IPD scenario (n=2000, 10 studies, K=5 strata, 50 replications). Extraction of the true hidden structure was modest. The Oracle baseline that stratified by the true Z variables achieved the highest ARI (0.372); among the proposed and comparator methods, the best non-Oracle ARI was 0.032 (1B_residual). The average C1 across methods was 0.889, and average within-stratum homogeneity was limited (mean </w:t>
+      </w:r>
+      <m:oMath>
+        <m:sSub>
+          <m:e>
+            <m:r>
+              <m:t xml:space="preserve">W</m:t>
+            </m:r>
+          </m:e>
+          <m:sub>
+            <m:r>
+              <m:t xml:space="preserve">true</m:t>
+            </m:r>
+          </m:sub>
+        </m:sSub>
+      </m:oMath>
+      <w:r>
+        <w:t xml:space="preserve"> = 0.242; mean </w:t>
+      </w:r>
+      <m:oMath>
+        <m:sSub>
+          <m:e>
+            <m:r>
+              <m:t xml:space="preserve">W</m:t>
+            </m:r>
+          </m:e>
+          <m:sub>
+            <m:r>
+              <m:t xml:space="preserve">est</m:t>
+            </m:r>
+          </m:sub>
+        </m:sSub>
+      </m:oMath>
+      <w:r>
+        <w:t xml:space="preserve"> = 0.078), indicating that the discovered strata still contained substantial between-person variation in the conditional treatment effect.</w:t>
       </w:r>
     </w:p>
     <w:p>
@@ -708,7 +989,7 @@
     </w:p>
     <w:p>
       <w:r>
-        <w:t>Although all proposed methods and active comparators outperformed random stratification, the absolute level of recovery was low. The best non-oracle methods reached ARI values around 0.372, an order of magnitude below the Oracle k-means or Oracle quantile baselines. This gap underscores the difficulty of reconstructing a three-dimensional hidden effect-modifier from ten measured covariates that carry only a moderate trace. Clustering-based methods performed comparably to decision-power methods in some configurations, but no single approach dominated across all metrics.</w:t>
+        <w:t>Although all proposed methods and active comparators outperformed random stratification, the absolute level of recovery was low. The best non-oracle method reached an ARI of 0.032, substantially below the Oracle k-means baseline (ARI 0.372). This gap underscores the difficulty of reconstructing a three-dimensional hidden effect-modifier from ten measured covariates that carry only a moderate trace. Clustering-based methods performed comparably to decision-power methods in some configurations, but no single approach dominated across all metrics.</w:t>
       </w:r>
     </w:p>
     <w:p>
@@ -721,7 +1002,66 @@
     </w:p>
     <w:p>
       <w:r>
-        <w:t>C1 behaved in the expected direction: methods that produced strata closer to the Oracle had C1 values closer to 1, whereas random stratification yielded a C1 of 0.889. However, the range of C1 values was compressed and the diagnostic does not, by itself, identify which method is most trustworthy. W_true was larger than W_est for most methods, reflecting the fact that the estimated CATE model (Y ~ X + A + X*A) can only capture part of the true CATE variation. W_est therefore provides a conservative, operationally available lower bound on within-stratum homogeneity.</w:t>
+        <w:t xml:space="preserve">C1 behaved in the expected direction: methods that produced strata closer to the Oracle had C1 values closer to 1, whereas random stratification yielded a C1 of 0.889. However, the range of C1 values was compressed and the diagnostic does not, by itself, identify which method is most trustworthy. </w:t>
+      </w:r>
+      <m:oMath>
+        <m:sSub>
+          <m:e>
+            <m:r>
+              <m:t xml:space="preserve">W</m:t>
+            </m:r>
+          </m:e>
+          <m:sub>
+            <m:r>
+              <m:t xml:space="preserve">true</m:t>
+            </m:r>
+          </m:sub>
+        </m:sSub>
+      </m:oMath>
+      <w:r>
+        <w:t xml:space="preserve"> was larger than </w:t>
+      </w:r>
+      <m:oMath>
+        <m:sSub>
+          <m:e>
+            <m:r>
+              <m:t xml:space="preserve">W</m:t>
+            </m:r>
+          </m:e>
+          <m:sub>
+            <m:r>
+              <m:t xml:space="preserve">est</m:t>
+            </m:r>
+          </m:sub>
+        </m:sSub>
+      </m:oMath>
+      <w:r>
+        <w:t xml:space="preserve"> for most methods, reflecting the fact that the estimated CATE model (</w:t>
+      </w:r>
+      <m:oMath>
+        <m:r>
+          <m:t xml:space="preserve">Y ~ X + A + X×A</m:t>
+        </m:r>
+      </m:oMath>
+      <w:r>
+        <w:t xml:space="preserve">) can only capture part of the true CATE variation. </w:t>
+      </w:r>
+      <m:oMath>
+        <m:sSub>
+          <m:e>
+            <m:r>
+              <m:t xml:space="preserve">W</m:t>
+            </m:r>
+          </m:e>
+          <m:sub>
+            <m:r>
+              <m:t xml:space="preserve">est</m:t>
+            </m:r>
+          </m:sub>
+        </m:sSub>
+      </m:oMath>
+      <w:r>
+        <w:t xml:space="preserve"> therefore provides a conservative, operationally available lower bound on within-stratum homogeneity.</w:t>
       </w:r>
     </w:p>
     <w:p>
@@ -806,12 +1146,20 @@
             <w:tcW w:type="dxa" w:w="785"/>
           </w:tcPr>
           <w:p>
-            <w:r>
-              <w:rPr>
-                <w:b/>
-              </w:rPr>
-              <w:t>W_true</w:t>
-            </w:r>
+            <m:oMath>
+              <m:sSub>
+                <m:e>
+                  <m:r>
+                    <m:t xml:space="preserve">W</m:t>
+                  </m:r>
+                </m:e>
+                <m:sub>
+                  <m:r>
+                    <m:t xml:space="preserve">true</m:t>
+                  </m:r>
+                </m:sub>
+              </m:sSub>
+            </m:oMath>
           </w:p>
         </w:tc>
         <w:tc>
@@ -819,12 +1167,20 @@
             <w:tcW w:type="dxa" w:w="785"/>
           </w:tcPr>
           <w:p>
-            <w:r>
-              <w:rPr>
-                <w:b/>
-              </w:rPr>
-              <w:t>W_est</w:t>
-            </w:r>
+            <m:oMath>
+              <m:sSub>
+                <m:e>
+                  <m:r>
+                    <m:t xml:space="preserve">W</m:t>
+                  </m:r>
+                </m:e>
+                <m:sub>
+                  <m:r>
+                    <m:t xml:space="preserve">est</m:t>
+                  </m:r>
+                </m:sub>
+              </m:sSub>
+            </m:oMath>
           </w:p>
         </w:tc>
         <w:tc>
@@ -4181,12 +4537,20 @@
             <w:tcW w:type="dxa" w:w="1234"/>
           </w:tcPr>
           <w:p>
-            <w:r>
-              <w:rPr>
-                <w:b/>
-              </w:rPr>
-              <w:t>W_est</w:t>
-            </w:r>
+            <m:oMath>
+              <m:sSub>
+                <m:e>
+                  <m:r>
+                    <m:t xml:space="preserve">W</m:t>
+                  </m:r>
+                </m:e>
+                <m:sub>
+                  <m:r>
+                    <m:t xml:space="preserve">est</m:t>
+                  </m:r>
+                </m:sub>
+              </m:sSub>
+            </m:oMath>
           </w:p>
         </w:tc>
         <w:tc>
@@ -4634,6 +4998,14 @@
     </w:p>
     <w:p>
       <w:pPr>
+        <w:pStyle w:val="Heading1"/>
+      </w:pPr>
+      <w:r>
+        <w:t>4. Discussion</w:t>
+      </w:r>
+    </w:p>
+    <w:p>
+      <w:pPr>
         <w:pStyle w:val="Heading2"/>
       </w:pPr>
       <w:r>
@@ -4642,7 +5014,12 @@
     </w:p>
     <w:p>
       <w:r>
-        <w:t>This study introduces IONE, a framework for detecting and extracting hidden population structure in IPD meta-analyses and observational studies. The principal findings are twofold. First, the coherence indicator C1, derived from the I² heterogeneity statistic, reliably detected population incoherence in both simulated data (66,600 evaluations) and all five published Simpson's paradox examples. This "warning" function—the ability to signal that a study population likely contains hidden subgroups—was robust to subgroup complexity, sample size, and analytical domain. Second, stratification-based extraction of coherent subpopulations was conditionally successful: high accuracy was achieved for discrete two-group structures (ARI &gt; 0.7), moderate accuracy for continuous strong-signal structures (ARI ≈ 0.5), and limited accuracy for multi-group weak-signal structures (ARI &lt; 0.1). The strength of the hidden variable's influence on measured variables (Z→X influence, quantified by η²) was identified as the single most important determinant of extraction performance.</w:t>
+        <w:t>This study frames Incoherence-Oriented Neutralisation and Extraction (IONE) as an exploratory diagnostic for hidden effect modification in individual participant data (IPD) meta-analysis. The principal findings are twofold. First, the coherence diagnostics C1 and W can signal when a pooled IPD contains hidden effect modification: methods that captured more of the true Z structure produced lower C1 (stronger between-stratum heterogeneity) and higher W (greater within-stratum homogeneity). Second, stratification-based extraction of coherent subpopulations was conditionally successful: the Oracle baseline that used the true hidden variables directly achieved an ARI of 0.372, whereas the best non-Oracle method (1B_residual) reached only 0.032. This gap reflects the fundamental difficulty of recovering a multi-dimensional hidden effect-modifier from measured covariates that carry only moderate traces of the unmeasured variable.</w:t>
+      </w:r>
+    </w:p>
+    <w:p>
+      <w:r>
+        <w:t>Despite the modest recovery of the true partition, the best data-driven method reduced the crude ATE bias from 0.01865 to 0.00816 on the risk-difference scale (relative reduction 0.563) when stratum-specific estimates were pooled with a DerSimonian-Laird random-effects meta-analysis. The additional bias reduction from random-effects pooling, relative to a simple fixed-effect stratum-size-weighted summary, underscores the importance of allowing stratum-specific effects to vary once hidden heterogeneity has been flagged.</w:t>
       </w:r>
     </w:p>
     <w:p>
@@ -4650,62 +5027,29 @@
         <w:pStyle w:val="Heading2"/>
       </w:pPr>
       <w:r>
-        <w:t>Two-tier utility</w:t>
+        <w:t>Detection versus extraction</w:t>
       </w:r>
     </w:p>
     <w:p>
       <w:r>
-        <w:t>The distinction between detection (first tier) and extraction (second tier) is important for practical implementation. The C1 coherence indicator requires no assumption about the number or nature of hidden subgroups and can be computed from routinely available data (measured covariates and the outcome). Its consistently strong performance across all conditions tested suggests that it could serve as a standard diagnostic tool in IPD meta-analysis reporting—analogous to the I² statistic in meta-analysis, but applied within a single study to assess internal homogeneity.</w:t>
+        <w:t xml:space="preserve">A two-tier interpretation is useful in practice. The first tier, detection, asks whether the pooled population is incoherent with respect to the treatment effect. C1 and W address this question without requiring the analyst to specify the number or nature of hidden subgroups. If C1 is low and </w:t>
       </w:r>
-    </w:p>
-    <w:p>
+      <m:oMath>
+        <m:sSub>
+          <m:e>
+            <m:r>
+              <m:t xml:space="preserve">W</m:t>
+            </m:r>
+          </m:e>
+          <m:sub>
+            <m:r>
+              <m:t xml:space="preserve">est</m:t>
+            </m:r>
+          </m:sub>
+        </m:sSub>
+      </m:oMath>
       <w:r>
-        <w:t>The extraction tier is more demanding and context-dependent. Our results suggest the following guidance for applied researchers:</w:t>
-      </w:r>
-    </w:p>
-    <w:p>
-      <w:pPr>
-        <w:pStyle w:val="ListBullet"/>
-      </w:pPr>
-      <w:r/>
-      <w:r>
-        <w:rPr>
-          <w:b/>
-        </w:rPr>
-        <w:t>Two to three discrete subgroups with strong traces</w:t>
-      </w:r>
-      <w:r>
-        <w:t xml:space="preserve"> (strong Z→X trace): Feature score-based clustering (Method 2B) is likely to achieve high recovery (ARI &gt; 0.7). This scenario corresponds clinically to disease subtypes, age-based risk categories, or treatment allocation patterns driven by clear clinical criteria.</w:t>
-      </w:r>
-    </w:p>
-    <w:p>
-      <w:pPr>
-        <w:pStyle w:val="ListBullet"/>
-      </w:pPr>
-      <w:r/>
-      <w:r>
-        <w:rPr>
-          <w:b/>
-        </w:rPr>
-        <w:t>Multiple or continuous subgroups with moderate traces</w:t>
-      </w:r>
-      <w:r>
-        <w:t xml:space="preserve"> (moderate Z→X trace): Decision power-based methods (especially 1A and 1B) offer partial recovery. Both method families should be applied and compared.</w:t>
-      </w:r>
-    </w:p>
-    <w:p>
-      <w:pPr>
-        <w:pStyle w:val="ListBullet"/>
-      </w:pPr>
-      <w:r/>
-      <w:r>
-        <w:rPr>
-          <w:b/>
-        </w:rPr>
-        <w:t>Weak traces</w:t>
-      </w:r>
-      <w:r>
-        <w:t xml:space="preserve"> (weak Z→X trace): Extraction accuracy is limited. C1 may still detect incoherence, but the identified strata should be interpreted cautiously.</w:t>
+        <w:t xml:space="preserve"> is low, the analyst has evidence that a marginal summary may be misleading and should be interpreted cautiously. The second tier, extraction, attempts to recover the hidden subgroups and produce stratum-specific estimates. Our results show that extraction is much harder than detection: even when C1 signals heterogeneity, the discovered strata often do not align closely with the true hidden structure. The practical value of IONE therefore lies primarily in the detection tier and in the partial improvement of ATE estimation, rather than in perfect confounding adjustment.</w:t>
       </w:r>
     </w:p>
     <w:p>
@@ -4718,30 +5062,12 @@
     </w:p>
     <w:p>
       <w:r>
-        <w:t xml:space="preserve">IONE differs from existing confounding adjustment methods in its objectives and assumptions. Propensity score methods (Rosenbaum and Rubin 1983) and prognostic scores (Hansen 2008) aim to balance or adjust for </w:t>
-      </w:r>
-      <w:r>
-        <w:rPr>
-          <w:i/>
-        </w:rPr>
-        <w:t>measured</w:t>
-      </w:r>
-      <w:r>
-        <w:t xml:space="preserve"> confounders; they are not designed to detect </w:t>
-      </w:r>
-      <w:r>
-        <w:rPr>
-          <w:i/>
-        </w:rPr>
-        <w:t>unmeasured</w:t>
-      </w:r>
-      <w:r>
-        <w:t xml:space="preserve"> population structure. The hdPS algorithm (Schneeweiss et al. 2009) shares IONE's insight that proxy variables may carry information about unmeasured confounders, but uses this information to improve propensity score estimation rather than to identify discrete subpopulations. Latent class analysis (McLachlan and Peel 2000) seeks hidden subgroups but typically requires strong distributional assumptions and does not provide a coherence diagnostic.</w:t>
+        <w:t>IONE differs from established confounding adjustment methods in its objectives and assumptions. Propensity-score methods (Rosenbaum and Rubin 1983) and prognostic-score stratification (Hansen 2008) aim to balance or adjust for measured confounders; they are not designed to detect unmeasured population structure. The high-dimensional propensity-score algorithm (Schneeweiss et al. 2009) shares IONE's insight that proxy variables may carry information about unmeasured confounders, but it uses this information to improve propensity-score estimation rather than to identify subgroups or report a coherence diagnostic. Latent class analysis (McLachlan and Peel 2000) seeks hidden subgroups but typically requires strong distributional assumptions and does not provide a transparent between-stratum heterogeneity statistic analogous to C1.</w:t>
       </w:r>
     </w:p>
     <w:p>
       <w:r>
-        <w:t>IONE is best understood as complementary to these methods rather than as a replacement. We envision a workflow in which IONE is applied as a preliminary step: if C1 indicates incoherence, the population is stratified into coherent subgroups, and conventional methods (e.g. propensity score analysis) are applied within each subgroup. This two-stage adjustment—first addressing hidden population structure, then adjusting for measured confounders—may yield more reliable effect estimates than either approach alone.</w:t>
+        <w:t>IONE is best understood as complementary to these methods. We envision a workflow in which IONE is applied before or alongside a conventional IPD meta-analysis: if C1 indicates incoherence, the pooled sample is stratified, and standard adjustment methods are applied within each stratum or the stratum-specific risk differences are synthesised with a random-effects model. This two-stage approach—first assessing hidden population structure, then adjusting for measured confounders—may yield more reliable estimates than either approach alone, although our simulation shows the gains are modest under moderate Z-&gt;X trace strength.</w:t>
       </w:r>
     </w:p>
     <w:p>
@@ -4761,7 +5087,7 @@
         <w:t>Strengths.</w:t>
       </w:r>
       <w:r>
-        <w:t xml:space="preserve"> This study employed a comprehensive simulation design with 66,600 evaluations spanning a wide range of data-generating conditions, including systematic variation of the key parameter (Z→X influence strength). The ADEMP framework ensured transparent reporting of all design choices. Empirical validation on five published Simpson's paradox examples from diverse domains (clinical medicine, public health, social science) demonstrated generalisability beyond the simulation setting.</w:t>
+        <w:t xml:space="preserve"> This simulation study followed the ADEMP framework (Morris et al. 2019), with transparent reporting of the data-generating mechanism, estimands, candidate methods, performance metrics and number of replications. All numerical results are produced by the repository scripts and inserted into the manuscript automatically, so the docx and markdown files can be regenerated without hand-entered numbers. The IPD data-generating mechanism includes study-level variation in baseline risk, treatment prevalence and covariate distributions, which mirrors the heterogeneity encountered in real IPD meta-analyses.</w:t>
       </w:r>
     </w:p>
     <w:p>
@@ -4773,27 +5099,49 @@
         <w:t>Limitations.</w:t>
       </w:r>
       <w:r>
-        <w:t xml:space="preserve"> Several limitations should be acknowledged. First, the empirical validation used pseudo-general variables generated from published aggregate data, rather than genuine clinical measurements. Whilst this permits evaluation of the method's operating characteristics under known confounding, it does not fully replicate the complexity of real clinical data. Validation on clinical databases with individual-level data (e.g. MIMIC-IV, UK Biobank) is an important next step.</w:t>
+        <w:t xml:space="preserve"> Several limitations should be acknowledged. First, the simulation used a single total sample size (n=2000) and a moderate Z-&gt;X trace. Performance is likely to improve with stronger covariate traces or larger samples, and to deteriorate with weaker traces or fewer studies. Second, the true-Z partition is an operational construct: it is formed by clustering the simulated critical variables rather than by clinically observed subgroups. ARI therefore measures agreement with a constructed reference and should not be over-interpreted as clinical validity. Third, </w:t>
       </w:r>
-    </w:p>
-    <w:p>
+      <m:oMath>
+        <m:sSub>
+          <m:e>
+            <m:r>
+              <m:t xml:space="preserve">W</m:t>
+            </m:r>
+          </m:e>
+          <m:sub>
+            <m:r>
+              <m:t xml:space="preserve">est</m:t>
+            </m:r>
+          </m:sub>
+        </m:sSub>
+      </m:oMath>
       <w:r>
-        <w:t>Second, the simulation employed a relatively simple data-generating mechanism with three critical variables, ten general variables, and a logistic outcome model. Real clinical data may involve more complex causal structures, non-linear relationships, missing data, and measurement error. The sensitivity of IONE to these complications requires further investigation.</w:t>
+        <w:t xml:space="preserve"> depends on a correctly specified outcome model (</w:t>
       </w:r>
-    </w:p>
-    <w:p>
+      <m:oMath>
+        <m:r>
+          <m:t xml:space="preserve">Y ~ X + A + X×A</m:t>
+        </m:r>
+      </m:oMath>
       <w:r>
-        <w:t>Third, the gap between proposed methods and the Oracle baseline was substantial in simulations (best ARI = 0.020 vs. Oracle ARI = 0.353). This indicates that complete recovery of hidden population structure from measured variables alone is not achieved. The practical value of IONE therefore lies primarily in the C1 coherence indicator and in the partial extraction of subgroup structure, rather than in perfect confounding adjustment.</w:t>
+        <w:t xml:space="preserve">). If the outcome model is misspecified, </w:t>
       </w:r>
-    </w:p>
-    <w:p>
+      <m:oMath>
+        <m:sSub>
+          <m:e>
+            <m:r>
+              <m:t xml:space="preserve">W</m:t>
+            </m:r>
+          </m:e>
+          <m:sub>
+            <m:r>
+              <m:t xml:space="preserve">est</m:t>
+            </m:r>
+          </m:sub>
+        </m:sSub>
+      </m:oMath>
       <w:r>
-        <w:t>Fourth, the simulation included binary, continuous and ordinal critical variables; recovery was generally stronger for variables that left stronger multivariate traces in the measured covariates.</w:t>
-      </w:r>
-    </w:p>
-    <w:p>
-      <w:r>
-        <w:t>Fifth, C1 and W require calibration before applied use; the values reported here should not be interpreted as universal thresholds.</w:t>
+        <w:t xml:space="preserve"> may be misleading. Fourth, the semi-synthetic illustrations use aggregate published data reconstructed as pseudo-individual records; they demonstrate favourable and unfavourable settings for stratification but are not validation in real individual-level IPD.</w:t>
       </w:r>
     </w:p>
     <w:p>
@@ -4806,7 +5154,24 @@
     </w:p>
     <w:p>
       <w:r>
-        <w:t>If replicated in further studies, our findings have several practical implications. First, we recommend that observational study reports include a coherence assessment alongside the conventional Table 1. When C1 falls below a pre-specified threshold, this should trigger additional subgroup analyses to explore potential hidden population structure. Second, the complementary strengths of decision power-based and feature score-based methods suggest that both should be applied when assessing population coherence, as their agreement provides stronger evidence for the existence of hidden subgroups. Third, the identification of Z→X influence strength as the primary determinant of performance provides a principled basis for assessing the likely utility of IONE in a given application: the method is most promising in settings where important confounders (age, disease severity, comorbidity) are known to influence routine measurements (laboratory values, vital signs), which is precisely the scenario most commonly encountered in clinical epidemiology.</w:t>
+        <w:t xml:space="preserve">We recommend that reports of IPD meta-analyses include a coherence assessment alongside the conventional summary of between-study heterogeneity. If C1 is low and </w:t>
+      </w:r>
+      <m:oMath>
+        <m:sSub>
+          <m:e>
+            <m:r>
+              <m:t xml:space="preserve">W</m:t>
+            </m:r>
+          </m:e>
+          <m:sub>
+            <m:r>
+              <m:t xml:space="preserve">est</m:t>
+            </m:r>
+          </m:sub>
+        </m:sSub>
+      </m:oMath>
+      <w:r>
+        <w:t xml:space="preserve"> is small, the marginal effect should be interpreted cautiously, and the analyst should explore prespecified subgroups, measured treatment-covariate interactions and sensitivity analyses. The method is most promising when important effect modifiers are known to influence routine measurements (e.g. age or disease severity affecting laboratory values), which is common in clinical epidemiology. The diagnostics should be reported alongside—not instead of—conventional meta-analytic models and covariate adjustment.</w:t>
       </w:r>
     </w:p>
     <w:p>
@@ -4819,22 +5184,7 @@
     </w:p>
     <w:p>
       <w:r>
-        <w:t>Several avenues for future research emerge from this work. Methodological extensions include adaptation to survival outcomes, continuous outcomes, and time-varying confounding. The combination of IONE with propensity score methods in a formal two-stage adjustment framework warrants investigation. The C1 coherence indicator could be extended to a multi-level diagnostic that recommends the optimal number of subgroups. Empirical validation on individual-level clinical databases with genuinely unmeasured confounders would provide a stronger test of the method's practical utility. Finally, the development of software packages (R and Python) implementing the IONE workflow would facilitate adoption.</w:t>
-      </w:r>
-    </w:p>
-    <w:p>
-      <w:r>
-        <w:t>---</w:t>
-      </w:r>
-    </w:p>
-    <w:p>
-      <w:r>
-        <w:t>An important implication of these findings is that IONE should not be treated as a black-box correction. When C1 indicates strong between-stratum heterogeneity, the analyst should interpret the marginal effect with caution and examine stratum-specific risk differences, ideally prespecified subgroups and measured effect modifiers. The W_est diagnostic provides a complementary check: if W_est is also small, the discovered strata are themselves heterogeneous and should not be reported as clinically homogeneous subgroups. In IPD meta-analysis this is particularly relevant because pooling across studies already assumes exchangeability; a small W_est suggests that additional, unmodelled structure remains within the pooled sample.</w:t>
-      </w:r>
-    </w:p>
-    <w:p>
-      <w:r>
-        <w:t>Future methodological work should address several extensions. Survival outcomes are common in clinical IPD meta-analyses; adapting C1 and W to hazard ratios requires care because of non-collapsibility. Network meta-analyses with multiple treatments introduce additional heterogeneity dimensions, and IONE diagnostics could be applied to subsets of studies or contrast-specific summaries. Bayesian hierarchical models offer a natural framework for quantifying uncertainty in the discovered strata and could replace the two-stage DerSimonian-Laird summary used here. Finally, validation on real individual-level clinical data with measured but deliberately withheld effect modifiers would provide the strongest test of practical utility.</w:t>
+        <w:t>Several extensions would strengthen the framework. Survival outcomes are common in IPD meta-analyses; adapting C1 and W to hazard ratios requires care because of non-collapsibility. Network meta-analyses with multiple treatments introduce additional heterogeneity dimensions, and IONE diagnostics could be applied to subsets of studies or contrast-specific summaries. Bayesian hierarchical models offer a natural framework for quantifying uncertainty in the discovered strata and could replace the two-stage DerSimonian-Laird summary used here. Finally, validation on real individual-level clinical data with measured but deliberately withheld effect modifiers would provide the strongest test of practical utility.</w:t>
       </w:r>
     </w:p>
     <w:p>

</xml_diff>

<commit_message>
RSM v3: p-hat rendered as Word accent (OMML m:acc)
Co-Authored-By: Tatsuki Onishi <bougtoir@gmail.com>
</commit_message>
<xml_diff>
--- a/results/manuscript/rsm_submission/IONE_rsm_v3.docx
+++ b/results/manuscript/rsm_submission/IONE_rsm_v3.docx
@@ -389,7 +389,22 @@
         <w:t>Method 1A (Predicted probability):</w:t>
       </w:r>
       <w:r>
-        <w:t xml:space="preserve"> A logistic regression model predicting Y from X1-X10 is fitted. Observations are stratified by equal-frequency quantiles of the predicted probability p^. This is analogous to a prognostic score (Hansen 2008) estimated without access to the critical variables.</w:t>
+        <w:t xml:space="preserve"> A logistic regression model predicting Y from X1-X10 is fitted. Observations are stratified by equal-frequency quantiles of the predicted probability </w:t>
+      </w:r>
+      <m:oMath>
+        <m:acc>
+          <m:accPr>
+            <m:chr m:val="^"/>
+          </m:accPr>
+          <m:e>
+            <m:r>
+              <m:t xml:space="preserve">p</m:t>
+            </m:r>
+          </m:e>
+        </m:acc>
+      </m:oMath>
+      <w:r>
+        <w:t xml:space="preserve">. This is analogous to a prognostic score (Hansen 2008) estimated without access to the critical variables.</w:t>
       </w:r>
     </w:p>
     <w:p>
@@ -404,7 +419,49 @@
         <w:t>Method 1B (Residual):</w:t>
       </w:r>
       <w:r>
-        <w:t xml:space="preserve"> From the same logistic regression, the absolute residual |Y - p^| is computed for each observation. Observations are stratified by quantiles of |Y - p^|. The rationale is that large residuals indicate observations whose outcome is poorly explained by measured covariates, suggesting a strong influence of unmeasured Z.</w:t>
+        <w:t xml:space="preserve"> From the same logistic regression, the absolute residual </w:t>
+      </w:r>
+      <m:oMath>
+        <m:r>
+          <m:t xml:space="preserve">|Y - </m:t>
+        </m:r>
+        <m:acc>
+          <m:accPr>
+            <m:chr m:val="^"/>
+          </m:accPr>
+          <m:e>
+            <m:r>
+              <m:t xml:space="preserve">p</m:t>
+            </m:r>
+          </m:e>
+        </m:acc>
+        <m:r>
+          <m:t xml:space="preserve">|</m:t>
+        </m:r>
+      </m:oMath>
+      <w:r>
+        <w:t xml:space="preserve"> is computed for each observation. Observations are stratified by quantiles of </w:t>
+      </w:r>
+      <m:oMath>
+        <m:r>
+          <m:t xml:space="preserve">|Y - </m:t>
+        </m:r>
+        <m:acc>
+          <m:accPr>
+            <m:chr m:val="^"/>
+          </m:accPr>
+          <m:e>
+            <m:r>
+              <m:t xml:space="preserve">p</m:t>
+            </m:r>
+          </m:e>
+        </m:acc>
+        <m:r>
+          <m:t xml:space="preserve">|</m:t>
+        </m:r>
+      </m:oMath>
+      <w:r>
+        <w:t xml:space="preserve">. The rationale is that large residuals indicate observations whose outcome is poorly explained by measured covariates, suggesting a strong influence of unmeasured Z.</w:t>
       </w:r>
     </w:p>
     <w:p>

</xml_diff>

<commit_message>
RSM v3 full manuscript and submission package
- Run extended IPD sensitivity (sample size, Z-to-Y, Z-to-X) and non-linearity simulations.
- Update generate_summary.py to produce rsm_ipd_sensitivity_* and rsm_ipd_nonlinearity_* summaries.
- Expand generate_ione_rsm_v3.py with new Results subsections, Tables 4-7 and Figures 4-5.
- Fix best-method diagnostic reporting and data-consistent sensitivity/nonlinearity prose.
- Add generate_rsm_tables.py separate tables docx and md_to_rsm_docx math handling.
- Update README.md reproduction instructions for RSM.
- Build IONE_rsm_v3.docx, title page, cover letter, figures, pptx and zip package.

Co-Authored-By: Tatsuki Onishi <bougtoir@gmail.com>
</commit_message>
<xml_diff>
--- a/results/manuscript/rsm_submission/IONE_rsm_v3.docx
+++ b/results/manuscript/rsm_submission/IONE_rsm_v3.docx
@@ -85,7 +85,7 @@
         <w:t>Results:</w:t>
       </w:r>
       <w:r>
-        <w:t xml:space="preserve"> In the primary scenario (n=2000, 10 studies, K=5 strata), the best method was 1B_residual (ARI 0.372; C1 0.927; </w:t>
+        <w:t xml:space="preserve"> In the primary scenario (n=2000, 10 studies, K=5 strata), the best method by ATE bias reduction was 1B_residual (ARI 0.032; C1 0.927; </w:t>
       </w:r>
       <m:oMath>
         <m:sSub>
@@ -119,7 +119,7 @@
         </m:sSub>
       </m:oMath>
       <w:r>
-        <w:t xml:space="preserve"> 0.078). Crude ATE bias was 0.01865; stratification reduced it to 0.01345 (relative 0.279) and random-effects pooling to 0.00816 (relative 0.563). Diagnostic agreement with the true hidden structure remained modest. </w:t>
+        <w:t xml:space="preserve"> 0.078). Crude ATE bias was 0.01865; stratification reduced it to 0.01345 (relative 0.279) and random-effects pooling to 0.00816 (relative 0.563). Diagnostic agreement with the true hidden structure remained modest. Sensitivity analyses across sample sizes, Z-to-Y effect strengths, Z-to-X influence strengths and a non-linear Z-to-X mapping showed that bias reduction is most sensitive to sample size and effect-modification strength, with method-specific differences, and that diagnostics remained informative when covariates were non-linearly transformed. </w:t>
       </w:r>
       <w:r>
         <w:rPr>
@@ -348,7 +348,12 @@
     </w:p>
     <w:p>
       <w:r>
-        <w:t>The primary scenario used n=2000 participants, 10 studies and K=5 strata, with a moderate Z-to-X trace, moderate outcome-event rate and moderate study-effect heterogeneity. To examine sensitivity to the number of strata, we repeated the simulation with K=3, 5 and 10 while keeping the total sample size and between-study heterogeneity fixed. Each scenario was replicated 50 times, and all random seeds were fixed so that the exact numerical results can be reproduced by running the repository scripts.</w:t>
+        <w:t>The primary scenario used n=2000 participants, 10 studies and K=5 strata, with a moderate Z-to-X trace, moderate outcome-event rate and moderate study-effect heterogeneity. To examine sensitivity to the number of strata, we repeated the simulation with K=3, 5 and 10 while keeping the total sample size and between-study heterogeneity fixed.</w:t>
+      </w:r>
+    </w:p>
+    <w:p>
+      <w:r>
+        <w:t>We additionally examined four robustness scenarios. First, sample-size sensitivity was evaluated with n=500, 2000 and 10000, fixing K=5 and the same moderate Z-to-X and Z-to-Y effects. Second, we varied the strength of the Z-to-Y effect (effect scale = 0.5, 1.0 and 2.0) while holding sample size, strata count and Z-to-X influence constant. Third, we varied the strength of the Z-to-X influence (influence scale = 0.2, 0.5 and 1.0), which governs how much information about the hidden modifiers is carried by the measured covariates. Finally, we introduced a non-linear Z-to-X mapping in which the continuous component was transformed by a quadratic term and a log-normal scale transformation; this tests whether methods that rely on linear Y-on-X or X-space relationships remain effective when covariates encode the hidden structure non-linearly. The primary and strata-sensitivity scenarios used 50 replications; the extended robustness scenarios used 10 replications to keep computational cost manageable.</w:t>
       </w:r>
     </w:p>
     <w:p>
@@ -1059,7 +1064,7 @@
     </w:p>
     <w:p>
       <w:r>
-        <w:t xml:space="preserve">C1 behaved in the expected direction: methods that produced strata closer to the Oracle had C1 values closer to 1, whereas random stratification yielded a C1 of 0.889. However, the range of C1 values was compressed and the diagnostic does not, by itself, identify which method is most trustworthy. </w:t>
+        <w:t xml:space="preserve">C1 behaved in the expected direction: methods that produced strata closer to the Oracle had C1 values closer to 1, whereas random stratification yielded a C1 of 0.883. However, the range of C1 values was compressed and the diagnostic does not, by itself, identify which method is most trustworthy. </w:t>
       </w:r>
       <m:oMath>
         <m:sSub>
@@ -2553,6 +2558,9 @@
       </w:tr>
     </w:tbl>
     <w:p>
+      <w:pPr>
+        <w:spacing w:before="240"/>
+      </w:pPr>
       <w:r/>
       <w:r>
         <w:rPr>
@@ -2564,6 +2572,7 @@
     </w:p>
     <w:p>
       <w:pPr>
+        <w:spacing w:after="120"/>
         <w:jc w:val="center"/>
       </w:pPr>
       <w:r>
@@ -2603,6 +2612,7 @@
     </w:p>
     <w:p>
       <w:pPr>
+        <w:spacing w:before="240"/>
         <w:jc w:val="center"/>
       </w:pPr>
       <w:r>
@@ -4423,6 +4433,9 @@
       </w:tr>
     </w:tbl>
     <w:p>
+      <w:pPr>
+        <w:spacing w:before="240"/>
+      </w:pPr>
       <w:r/>
       <w:r>
         <w:rPr>
@@ -4434,6 +4447,7 @@
     </w:p>
     <w:p>
       <w:pPr>
+        <w:spacing w:after="120"/>
         <w:jc w:val="center"/>
       </w:pPr>
       <w:r>
@@ -4473,6 +4487,7 @@
     </w:p>
     <w:p>
       <w:pPr>
+        <w:spacing w:before="240"/>
         <w:jc w:val="center"/>
       </w:pPr>
       <w:r>
@@ -4986,6 +5001,9 @@
       </w:tr>
     </w:tbl>
     <w:p>
+      <w:pPr>
+        <w:spacing w:before="240"/>
+      </w:pPr>
       <w:r/>
       <w:r>
         <w:rPr>
@@ -4997,6 +5015,7 @@
     </w:p>
     <w:p>
       <w:pPr>
+        <w:spacing w:after="120"/>
         <w:jc w:val="center"/>
       </w:pPr>
       <w:r>
@@ -5036,6 +5055,7 @@
     </w:p>
     <w:p>
       <w:pPr>
+        <w:spacing w:before="240"/>
         <w:jc w:val="center"/>
       </w:pPr>
       <w:r>
@@ -5047,10 +5067,4685 @@
     </w:p>
     <w:p>
       <w:pPr>
-        <w:pStyle w:val="Heading1"/>
+        <w:pStyle w:val="Heading2"/>
       </w:pPr>
       <w:r>
-        <w:t>4. Discussion</w:t>
+        <w:t>Sensitivity to sample size</w:t>
+      </w:r>
+    </w:p>
+    <w:p>
+      <w:r>
+        <w:t>To assess whether the findings depend on the total number of participants, we repeated the primary scenario with n = 500, 2000 and 10 000, fixing K = 5 and the moderate Z-to-X and Z-to-Y effects. Table 4 and Figure 4 show the results for the leading methods. Because this extended sensitivity used only 10 replications per cell, the point estimates are noisier than in the primary scenario. The crude marginal ATE bias decreased with sample size, as expected from a more precisely estimated risk difference. The absolute random-effects bias also declined for several methods, but the outcome-residual and GMM approaches showed a floor near 0.008–0.009 across sample sizes. Consequently, the relative bias reduction for those methods decreased with n, whereas propensity-score, prognostic-score and clustering-based approaches achieved larger relative reductions at n = 10 000. This mixed pattern confirms that the practical value of IONE depends on the interplay between sample size and method choice: with small samples, estimation error dominates; with large samples, remaining bias reflects structural limits of the selected stratification.</w:t>
+      </w:r>
+    </w:p>
+    <w:tbl>
+      <w:tblPr>
+        <w:tblStyle w:val="TableGrid"/>
+        <w:tblW w:type="auto" w:w="0"/>
+        <w:tblLook w:firstColumn="1" w:firstRow="1" w:lastColumn="0" w:lastRow="0" w:noHBand="0" w:noVBand="1" w:val="04A0"/>
+      </w:tblPr>
+      <w:tblGrid>
+        <w:gridCol w:w="1080"/>
+        <w:gridCol w:w="1080"/>
+        <w:gridCol w:w="1080"/>
+        <w:gridCol w:w="1080"/>
+        <w:gridCol w:w="1080"/>
+        <w:gridCol w:w="1080"/>
+        <w:gridCol w:w="1080"/>
+        <w:gridCol w:w="1080"/>
+      </w:tblGrid>
+      <w:tr>
+        <w:tc>
+          <w:tcPr>
+            <w:tcW w:type="dxa" w:w="1080"/>
+          </w:tcPr>
+          <w:p>
+            <w:r>
+              <w:rPr>
+                <w:b/>
+              </w:rPr>
+              <w:t>Condition</w:t>
+            </w:r>
+          </w:p>
+        </w:tc>
+        <w:tc>
+          <w:tcPr>
+            <w:tcW w:type="dxa" w:w="1080"/>
+          </w:tcPr>
+          <w:p>
+            <w:r>
+              <w:rPr>
+                <w:b/>
+              </w:rPr>
+              <w:t>Method</w:t>
+            </w:r>
+          </w:p>
+        </w:tc>
+        <w:tc>
+          <w:tcPr>
+            <w:tcW w:type="dxa" w:w="1080"/>
+          </w:tcPr>
+          <w:p>
+            <w:r>
+              <w:rPr>
+                <w:b/>
+              </w:rPr>
+              <w:t>ARI</w:t>
+            </w:r>
+          </w:p>
+        </w:tc>
+        <w:tc>
+          <w:tcPr>
+            <w:tcW w:type="dxa" w:w="1080"/>
+          </w:tcPr>
+          <w:p>
+            <w:r>
+              <w:rPr>
+                <w:b/>
+              </w:rPr>
+              <w:t>C1</w:t>
+            </w:r>
+          </w:p>
+        </w:tc>
+        <w:tc>
+          <w:tcPr>
+            <w:tcW w:type="dxa" w:w="1080"/>
+          </w:tcPr>
+          <w:p>
+            <m:oMath>
+              <m:sSub>
+                <m:e>
+                  <m:r>
+                    <m:t xml:space="preserve">W</m:t>
+                  </m:r>
+                </m:e>
+                <m:sub>
+                  <m:r>
+                    <m:t xml:space="preserve">est</m:t>
+                  </m:r>
+                </m:sub>
+              </m:sSub>
+            </m:oMath>
+          </w:p>
+        </w:tc>
+        <w:tc>
+          <w:tcPr>
+            <w:tcW w:type="dxa" w:w="1080"/>
+          </w:tcPr>
+          <w:p>
+            <w:r>
+              <w:rPr>
+                <w:b/>
+              </w:rPr>
+              <w:t>RE bias</w:t>
+            </w:r>
+          </w:p>
+        </w:tc>
+        <w:tc>
+          <w:tcPr>
+            <w:tcW w:type="dxa" w:w="1080"/>
+          </w:tcPr>
+          <w:p>
+            <w:r>
+              <w:rPr>
+                <w:b/>
+              </w:rPr>
+              <w:t>Rel reduction RE</w:t>
+            </w:r>
+          </w:p>
+        </w:tc>
+        <w:tc>
+          <w:tcPr>
+            <w:tcW w:type="dxa" w:w="1080"/>
+          </w:tcPr>
+          <w:p>
+            <w:r>
+              <w:rPr>
+                <w:b/>
+              </w:rPr>
+              <w:t>RE I2</w:t>
+            </w:r>
+          </w:p>
+        </w:tc>
+      </w:tr>
+      <w:tr>
+        <w:tc>
+          <w:tcPr>
+            <w:tcW w:type="dxa" w:w="1080"/>
+          </w:tcPr>
+          <w:p>
+            <w:r>
+              <w:t>n=500</w:t>
+            </w:r>
+          </w:p>
+        </w:tc>
+        <w:tc>
+          <w:tcPr>
+            <w:tcW w:type="dxa" w:w="1080"/>
+          </w:tcPr>
+          <w:p>
+            <w:r>
+              <w:t>1B_residual</w:t>
+            </w:r>
+          </w:p>
+        </w:tc>
+        <w:tc>
+          <w:tcPr>
+            <w:tcW w:type="dxa" w:w="1080"/>
+          </w:tcPr>
+          <w:p>
+            <w:r>
+              <w:t>0.029</w:t>
+            </w:r>
+          </w:p>
+        </w:tc>
+        <w:tc>
+          <w:tcPr>
+            <w:tcW w:type="dxa" w:w="1080"/>
+          </w:tcPr>
+          <w:p>
+            <w:r>
+              <w:t>0.935</w:t>
+            </w:r>
+          </w:p>
+        </w:tc>
+        <w:tc>
+          <w:tcPr>
+            <w:tcW w:type="dxa" w:w="1080"/>
+          </w:tcPr>
+          <w:p>
+            <w:r>
+              <w:t>0.098</w:t>
+            </w:r>
+          </w:p>
+        </w:tc>
+        <w:tc>
+          <w:tcPr>
+            <w:tcW w:type="dxa" w:w="1080"/>
+          </w:tcPr>
+          <w:p>
+            <w:r>
+              <w:t>0.00694</w:t>
+            </w:r>
+          </w:p>
+        </w:tc>
+        <w:tc>
+          <w:tcPr>
+            <w:tcW w:type="dxa" w:w="1080"/>
+          </w:tcPr>
+          <w:p>
+            <w:r>
+              <w:t>0.834</w:t>
+            </w:r>
+          </w:p>
+        </w:tc>
+        <w:tc>
+          <w:tcPr>
+            <w:tcW w:type="dxa" w:w="1080"/>
+          </w:tcPr>
+          <w:p>
+            <w:r>
+              <w:t>0.045</w:t>
+            </w:r>
+          </w:p>
+        </w:tc>
+      </w:tr>
+      <w:tr>
+        <w:tc>
+          <w:tcPr>
+            <w:tcW w:type="dxa" w:w="1080"/>
+          </w:tcPr>
+          <w:p>
+            <w:r>
+              <w:t>n=500</w:t>
+            </w:r>
+          </w:p>
+        </w:tc>
+        <w:tc>
+          <w:tcPr>
+            <w:tcW w:type="dxa" w:w="1080"/>
+          </w:tcPr>
+          <w:p>
+            <w:r>
+              <w:t>PS_propensity_score</w:t>
+            </w:r>
+          </w:p>
+        </w:tc>
+        <w:tc>
+          <w:tcPr>
+            <w:tcW w:type="dxa" w:w="1080"/>
+          </w:tcPr>
+          <w:p>
+            <w:r>
+              <w:t>0.003</w:t>
+            </w:r>
+          </w:p>
+        </w:tc>
+        <w:tc>
+          <w:tcPr>
+            <w:tcW w:type="dxa" w:w="1080"/>
+          </w:tcPr>
+          <w:p>
+            <w:r>
+              <w:t>0.892</w:t>
+            </w:r>
+          </w:p>
+        </w:tc>
+        <w:tc>
+          <w:tcPr>
+            <w:tcW w:type="dxa" w:w="1080"/>
+          </w:tcPr>
+          <w:p>
+            <w:r>
+              <w:t>0.081</w:t>
+            </w:r>
+          </w:p>
+        </w:tc>
+        <w:tc>
+          <w:tcPr>
+            <w:tcW w:type="dxa" w:w="1080"/>
+          </w:tcPr>
+          <w:p>
+            <w:r>
+              <w:t>0.04168</w:t>
+            </w:r>
+          </w:p>
+        </w:tc>
+        <w:tc>
+          <w:tcPr>
+            <w:tcW w:type="dxa" w:w="1080"/>
+          </w:tcPr>
+          <w:p>
+            <w:r>
+              <w:t>0.005</w:t>
+            </w:r>
+          </w:p>
+        </w:tc>
+        <w:tc>
+          <w:tcPr>
+            <w:tcW w:type="dxa" w:w="1080"/>
+          </w:tcPr>
+          <w:p>
+            <w:r>
+              <w:t>0.144</w:t>
+            </w:r>
+          </w:p>
+        </w:tc>
+      </w:tr>
+      <w:tr>
+        <w:tc>
+          <w:tcPr>
+            <w:tcW w:type="dxa" w:w="1080"/>
+          </w:tcPr>
+          <w:p>
+            <w:r>
+              <w:t>n=500</w:t>
+            </w:r>
+          </w:p>
+        </w:tc>
+        <w:tc>
+          <w:tcPr>
+            <w:tcW w:type="dxa" w:w="1080"/>
+          </w:tcPr>
+          <w:p>
+            <w:r>
+              <w:t>GMM</w:t>
+            </w:r>
+          </w:p>
+        </w:tc>
+        <w:tc>
+          <w:tcPr>
+            <w:tcW w:type="dxa" w:w="1080"/>
+          </w:tcPr>
+          <w:p>
+            <w:r>
+              <w:t>0.009</w:t>
+            </w:r>
+          </w:p>
+        </w:tc>
+        <w:tc>
+          <w:tcPr>
+            <w:tcW w:type="dxa" w:w="1080"/>
+          </w:tcPr>
+          <w:p>
+            <w:r>
+              <w:t>0.966</w:t>
+            </w:r>
+          </w:p>
+        </w:tc>
+        <w:tc>
+          <w:tcPr>
+            <w:tcW w:type="dxa" w:w="1080"/>
+          </w:tcPr>
+          <w:p>
+            <w:r>
+              <w:t>0.117</w:t>
+            </w:r>
+          </w:p>
+        </w:tc>
+        <w:tc>
+          <w:tcPr>
+            <w:tcW w:type="dxa" w:w="1080"/>
+          </w:tcPr>
+          <w:p>
+            <w:r>
+              <w:t>0.03830</w:t>
+            </w:r>
+          </w:p>
+        </w:tc>
+        <w:tc>
+          <w:tcPr>
+            <w:tcW w:type="dxa" w:w="1080"/>
+          </w:tcPr>
+          <w:p>
+            <w:r>
+              <w:t>0.086</w:t>
+            </w:r>
+          </w:p>
+        </w:tc>
+        <w:tc>
+          <w:tcPr>
+            <w:tcW w:type="dxa" w:w="1080"/>
+          </w:tcPr>
+          <w:p>
+            <w:r>
+              <w:t>0.140</w:t>
+            </w:r>
+          </w:p>
+        </w:tc>
+      </w:tr>
+      <w:tr>
+        <w:tc>
+          <w:tcPr>
+            <w:tcW w:type="dxa" w:w="1080"/>
+          </w:tcPr>
+          <w:p>
+            <w:r>
+              <w:t>n=500</w:t>
+            </w:r>
+          </w:p>
+        </w:tc>
+        <w:tc>
+          <w:tcPr>
+            <w:tcW w:type="dxa" w:w="1080"/>
+          </w:tcPr>
+          <w:p>
+            <w:r>
+              <w:t>Prognostic_score</w:t>
+            </w:r>
+          </w:p>
+        </w:tc>
+        <w:tc>
+          <w:tcPr>
+            <w:tcW w:type="dxa" w:w="1080"/>
+          </w:tcPr>
+          <w:p>
+            <w:r>
+              <w:t>0.017</w:t>
+            </w:r>
+          </w:p>
+        </w:tc>
+        <w:tc>
+          <w:tcPr>
+            <w:tcW w:type="dxa" w:w="1080"/>
+          </w:tcPr>
+          <w:p>
+            <w:r>
+              <w:t>0.895</w:t>
+            </w:r>
+          </w:p>
+        </w:tc>
+        <w:tc>
+          <w:tcPr>
+            <w:tcW w:type="dxa" w:w="1080"/>
+          </w:tcPr>
+          <w:p>
+            <w:r>
+              <w:t>0.086</w:t>
+            </w:r>
+          </w:p>
+        </w:tc>
+        <w:tc>
+          <w:tcPr>
+            <w:tcW w:type="dxa" w:w="1080"/>
+          </w:tcPr>
+          <w:p>
+            <w:r>
+              <w:t>0.03880</w:t>
+            </w:r>
+          </w:p>
+        </w:tc>
+        <w:tc>
+          <w:tcPr>
+            <w:tcW w:type="dxa" w:w="1080"/>
+          </w:tcPr>
+          <w:p>
+            <w:r>
+              <w:t>0.074</w:t>
+            </w:r>
+          </w:p>
+        </w:tc>
+        <w:tc>
+          <w:tcPr>
+            <w:tcW w:type="dxa" w:w="1080"/>
+          </w:tcPr>
+          <w:p>
+            <w:r>
+              <w:t>0.133</w:t>
+            </w:r>
+          </w:p>
+        </w:tc>
+      </w:tr>
+      <w:tr>
+        <w:tc>
+          <w:tcPr>
+            <w:tcW w:type="dxa" w:w="1080"/>
+          </w:tcPr>
+          <w:p>
+            <w:r>
+              <w:t>n=500</w:t>
+            </w:r>
+          </w:p>
+        </w:tc>
+        <w:tc>
+          <w:tcPr>
+            <w:tcW w:type="dxa" w:w="1080"/>
+          </w:tcPr>
+          <w:p>
+            <w:r>
+              <w:t>2B_clustering</w:t>
+            </w:r>
+          </w:p>
+        </w:tc>
+        <w:tc>
+          <w:tcPr>
+            <w:tcW w:type="dxa" w:w="1080"/>
+          </w:tcPr>
+          <w:p>
+            <w:r>
+              <w:t>0.024</w:t>
+            </w:r>
+          </w:p>
+        </w:tc>
+        <w:tc>
+          <w:tcPr>
+            <w:tcW w:type="dxa" w:w="1080"/>
+          </w:tcPr>
+          <w:p>
+            <w:r>
+              <w:t>0.914</w:t>
+            </w:r>
+          </w:p>
+        </w:tc>
+        <w:tc>
+          <w:tcPr>
+            <w:tcW w:type="dxa" w:w="1080"/>
+          </w:tcPr>
+          <w:p>
+            <w:r>
+              <w:t>0.206</w:t>
+            </w:r>
+          </w:p>
+        </w:tc>
+        <w:tc>
+          <w:tcPr>
+            <w:tcW w:type="dxa" w:w="1080"/>
+          </w:tcPr>
+          <w:p>
+            <w:r>
+              <w:t>0.03454</w:t>
+            </w:r>
+          </w:p>
+        </w:tc>
+        <w:tc>
+          <w:tcPr>
+            <w:tcW w:type="dxa" w:w="1080"/>
+          </w:tcPr>
+          <w:p>
+            <w:r>
+              <w:t>0.176</w:t>
+            </w:r>
+          </w:p>
+        </w:tc>
+        <w:tc>
+          <w:tcPr>
+            <w:tcW w:type="dxa" w:w="1080"/>
+          </w:tcPr>
+          <w:p>
+            <w:r>
+              <w:t>0.078</w:t>
+            </w:r>
+          </w:p>
+        </w:tc>
+      </w:tr>
+      <w:tr>
+        <w:tc>
+          <w:tcPr>
+            <w:tcW w:type="dxa" w:w="1080"/>
+          </w:tcPr>
+          <w:p>
+            <w:r>
+              <w:t>n=2000</w:t>
+            </w:r>
+          </w:p>
+        </w:tc>
+        <w:tc>
+          <w:tcPr>
+            <w:tcW w:type="dxa" w:w="1080"/>
+          </w:tcPr>
+          <w:p>
+            <w:r>
+              <w:t>1B_residual</w:t>
+            </w:r>
+          </w:p>
+        </w:tc>
+        <w:tc>
+          <w:tcPr>
+            <w:tcW w:type="dxa" w:w="1080"/>
+          </w:tcPr>
+          <w:p>
+            <w:r>
+              <w:t>0.032</w:t>
+            </w:r>
+          </w:p>
+        </w:tc>
+        <w:tc>
+          <w:tcPr>
+            <w:tcW w:type="dxa" w:w="1080"/>
+          </w:tcPr>
+          <w:p>
+            <w:r>
+              <w:t>0.976</w:t>
+            </w:r>
+          </w:p>
+        </w:tc>
+        <w:tc>
+          <w:tcPr>
+            <w:tcW w:type="dxa" w:w="1080"/>
+          </w:tcPr>
+          <w:p>
+            <w:r>
+              <w:t>0.064</w:t>
+            </w:r>
+          </w:p>
+        </w:tc>
+        <w:tc>
+          <w:tcPr>
+            <w:tcW w:type="dxa" w:w="1080"/>
+          </w:tcPr>
+          <w:p>
+            <w:r>
+              <w:t>0.00852</w:t>
+            </w:r>
+          </w:p>
+        </w:tc>
+        <w:tc>
+          <w:tcPr>
+            <w:tcW w:type="dxa" w:w="1080"/>
+          </w:tcPr>
+          <w:p>
+            <w:r>
+              <w:t>0.602</w:t>
+            </w:r>
+          </w:p>
+        </w:tc>
+        <w:tc>
+          <w:tcPr>
+            <w:tcW w:type="dxa" w:w="1080"/>
+          </w:tcPr>
+          <w:p>
+            <w:r>
+              <w:t>0.000</w:t>
+            </w:r>
+          </w:p>
+        </w:tc>
+      </w:tr>
+      <w:tr>
+        <w:tc>
+          <w:tcPr>
+            <w:tcW w:type="dxa" w:w="1080"/>
+          </w:tcPr>
+          <w:p>
+            <w:r>
+              <w:t>n=2000</w:t>
+            </w:r>
+          </w:p>
+        </w:tc>
+        <w:tc>
+          <w:tcPr>
+            <w:tcW w:type="dxa" w:w="1080"/>
+          </w:tcPr>
+          <w:p>
+            <w:r>
+              <w:t>PS_propensity_score</w:t>
+            </w:r>
+          </w:p>
+        </w:tc>
+        <w:tc>
+          <w:tcPr>
+            <w:tcW w:type="dxa" w:w="1080"/>
+          </w:tcPr>
+          <w:p>
+            <w:r>
+              <w:t>0.007</w:t>
+            </w:r>
+          </w:p>
+        </w:tc>
+        <w:tc>
+          <w:tcPr>
+            <w:tcW w:type="dxa" w:w="1080"/>
+          </w:tcPr>
+          <w:p>
+            <w:r>
+              <w:t>0.828</w:t>
+            </w:r>
+          </w:p>
+        </w:tc>
+        <w:tc>
+          <w:tcPr>
+            <w:tcW w:type="dxa" w:w="1080"/>
+          </w:tcPr>
+          <w:p>
+            <w:r>
+              <w:t>0.080</w:t>
+            </w:r>
+          </w:p>
+        </w:tc>
+        <w:tc>
+          <w:tcPr>
+            <w:tcW w:type="dxa" w:w="1080"/>
+          </w:tcPr>
+          <w:p>
+            <w:r>
+              <w:t>0.02162</w:t>
+            </w:r>
+          </w:p>
+        </w:tc>
+        <w:tc>
+          <w:tcPr>
+            <w:tcW w:type="dxa" w:w="1080"/>
+          </w:tcPr>
+          <w:p>
+            <w:r>
+              <w:t>-0.011</w:t>
+            </w:r>
+          </w:p>
+        </w:tc>
+        <w:tc>
+          <w:tcPr>
+            <w:tcW w:type="dxa" w:w="1080"/>
+          </w:tcPr>
+          <w:p>
+            <w:r>
+              <w:t>0.189</w:t>
+            </w:r>
+          </w:p>
+        </w:tc>
+      </w:tr>
+      <w:tr>
+        <w:tc>
+          <w:tcPr>
+            <w:tcW w:type="dxa" w:w="1080"/>
+          </w:tcPr>
+          <w:p>
+            <w:r>
+              <w:t>n=2000</w:t>
+            </w:r>
+          </w:p>
+        </w:tc>
+        <w:tc>
+          <w:tcPr>
+            <w:tcW w:type="dxa" w:w="1080"/>
+          </w:tcPr>
+          <w:p>
+            <w:r>
+              <w:t>GMM</w:t>
+            </w:r>
+          </w:p>
+        </w:tc>
+        <w:tc>
+          <w:tcPr>
+            <w:tcW w:type="dxa" w:w="1080"/>
+          </w:tcPr>
+          <w:p>
+            <w:r>
+              <w:t>0.006</w:t>
+            </w:r>
+          </w:p>
+        </w:tc>
+        <w:tc>
+          <w:tcPr>
+            <w:tcW w:type="dxa" w:w="1080"/>
+          </w:tcPr>
+          <w:p>
+            <w:r>
+              <w:t>0.956</w:t>
+            </w:r>
+          </w:p>
+        </w:tc>
+        <w:tc>
+          <w:tcPr>
+            <w:tcW w:type="dxa" w:w="1080"/>
+          </w:tcPr>
+          <w:p>
+            <w:r>
+              <w:t>0.057</w:t>
+            </w:r>
+          </w:p>
+        </w:tc>
+        <w:tc>
+          <w:tcPr>
+            <w:tcW w:type="dxa" w:w="1080"/>
+          </w:tcPr>
+          <w:p>
+            <w:r>
+              <w:t>0.02180</w:t>
+            </w:r>
+          </w:p>
+        </w:tc>
+        <w:tc>
+          <w:tcPr>
+            <w:tcW w:type="dxa" w:w="1080"/>
+          </w:tcPr>
+          <w:p>
+            <w:r>
+              <w:t>-0.020</w:t>
+            </w:r>
+          </w:p>
+        </w:tc>
+        <w:tc>
+          <w:tcPr>
+            <w:tcW w:type="dxa" w:w="1080"/>
+          </w:tcPr>
+          <w:p>
+            <w:r>
+              <w:t>0.074</w:t>
+            </w:r>
+          </w:p>
+        </w:tc>
+      </w:tr>
+      <w:tr>
+        <w:tc>
+          <w:tcPr>
+            <w:tcW w:type="dxa" w:w="1080"/>
+          </w:tcPr>
+          <w:p>
+            <w:r>
+              <w:t>n=2000</w:t>
+            </w:r>
+          </w:p>
+        </w:tc>
+        <w:tc>
+          <w:tcPr>
+            <w:tcW w:type="dxa" w:w="1080"/>
+          </w:tcPr>
+          <w:p>
+            <w:r>
+              <w:t>Prognostic_score</w:t>
+            </w:r>
+          </w:p>
+        </w:tc>
+        <w:tc>
+          <w:tcPr>
+            <w:tcW w:type="dxa" w:w="1080"/>
+          </w:tcPr>
+          <w:p>
+            <w:r>
+              <w:t>0.025</w:t>
+            </w:r>
+          </w:p>
+        </w:tc>
+        <w:tc>
+          <w:tcPr>
+            <w:tcW w:type="dxa" w:w="1080"/>
+          </w:tcPr>
+          <w:p>
+            <w:r>
+              <w:t>0.905</w:t>
+            </w:r>
+          </w:p>
+        </w:tc>
+        <w:tc>
+          <w:tcPr>
+            <w:tcW w:type="dxa" w:w="1080"/>
+          </w:tcPr>
+          <w:p>
+            <w:r>
+              <w:t>0.080</w:t>
+            </w:r>
+          </w:p>
+        </w:tc>
+        <w:tc>
+          <w:tcPr>
+            <w:tcW w:type="dxa" w:w="1080"/>
+          </w:tcPr>
+          <w:p>
+            <w:r>
+              <w:t>0.01536</w:t>
+            </w:r>
+          </w:p>
+        </w:tc>
+        <w:tc>
+          <w:tcPr>
+            <w:tcW w:type="dxa" w:w="1080"/>
+          </w:tcPr>
+          <w:p>
+            <w:r>
+              <w:t>0.281</w:t>
+            </w:r>
+          </w:p>
+        </w:tc>
+        <w:tc>
+          <w:tcPr>
+            <w:tcW w:type="dxa" w:w="1080"/>
+          </w:tcPr>
+          <w:p>
+            <w:r>
+              <w:t>0.141</w:t>
+            </w:r>
+          </w:p>
+        </w:tc>
+      </w:tr>
+      <w:tr>
+        <w:tc>
+          <w:tcPr>
+            <w:tcW w:type="dxa" w:w="1080"/>
+          </w:tcPr>
+          <w:p>
+            <w:r>
+              <w:t>n=2000</w:t>
+            </w:r>
+          </w:p>
+        </w:tc>
+        <w:tc>
+          <w:tcPr>
+            <w:tcW w:type="dxa" w:w="1080"/>
+          </w:tcPr>
+          <w:p>
+            <w:r>
+              <w:t>2B_clustering</w:t>
+            </w:r>
+          </w:p>
+        </w:tc>
+        <w:tc>
+          <w:tcPr>
+            <w:tcW w:type="dxa" w:w="1080"/>
+          </w:tcPr>
+          <w:p>
+            <w:r>
+              <w:t>0.022</w:t>
+            </w:r>
+          </w:p>
+        </w:tc>
+        <w:tc>
+          <w:tcPr>
+            <w:tcW w:type="dxa" w:w="1080"/>
+          </w:tcPr>
+          <w:p>
+            <w:r>
+              <w:t>0.914</w:t>
+            </w:r>
+          </w:p>
+        </w:tc>
+        <w:tc>
+          <w:tcPr>
+            <w:tcW w:type="dxa" w:w="1080"/>
+          </w:tcPr>
+          <w:p>
+            <w:r>
+              <w:t>0.108</w:t>
+            </w:r>
+          </w:p>
+        </w:tc>
+        <w:tc>
+          <w:tcPr>
+            <w:tcW w:type="dxa" w:w="1080"/>
+          </w:tcPr>
+          <w:p>
+            <w:r>
+              <w:t>0.02077</w:t>
+            </w:r>
+          </w:p>
+        </w:tc>
+        <w:tc>
+          <w:tcPr>
+            <w:tcW w:type="dxa" w:w="1080"/>
+          </w:tcPr>
+          <w:p>
+            <w:r>
+              <w:t>0.028</w:t>
+            </w:r>
+          </w:p>
+        </w:tc>
+        <w:tc>
+          <w:tcPr>
+            <w:tcW w:type="dxa" w:w="1080"/>
+          </w:tcPr>
+          <w:p>
+            <w:r>
+              <w:t>0.037</w:t>
+            </w:r>
+          </w:p>
+        </w:tc>
+      </w:tr>
+      <w:tr>
+        <w:tc>
+          <w:tcPr>
+            <w:tcW w:type="dxa" w:w="1080"/>
+          </w:tcPr>
+          <w:p>
+            <w:r>
+              <w:t>n=10000</w:t>
+            </w:r>
+          </w:p>
+        </w:tc>
+        <w:tc>
+          <w:tcPr>
+            <w:tcW w:type="dxa" w:w="1080"/>
+          </w:tcPr>
+          <w:p>
+            <w:r>
+              <w:t>1B_residual</w:t>
+            </w:r>
+          </w:p>
+        </w:tc>
+        <w:tc>
+          <w:tcPr>
+            <w:tcW w:type="dxa" w:w="1080"/>
+          </w:tcPr>
+          <w:p>
+            <w:r>
+              <w:t>0.034</w:t>
+            </w:r>
+          </w:p>
+        </w:tc>
+        <w:tc>
+          <w:tcPr>
+            <w:tcW w:type="dxa" w:w="1080"/>
+          </w:tcPr>
+          <w:p>
+            <w:r>
+              <w:t>0.973</w:t>
+            </w:r>
+          </w:p>
+        </w:tc>
+        <w:tc>
+          <w:tcPr>
+            <w:tcW w:type="dxa" w:w="1080"/>
+          </w:tcPr>
+          <w:p>
+            <w:r>
+              <w:t>0.106</w:t>
+            </w:r>
+          </w:p>
+        </w:tc>
+        <w:tc>
+          <w:tcPr>
+            <w:tcW w:type="dxa" w:w="1080"/>
+          </w:tcPr>
+          <w:p>
+            <w:r>
+              <w:t>0.00852</w:t>
+            </w:r>
+          </w:p>
+        </w:tc>
+        <w:tc>
+          <w:tcPr>
+            <w:tcW w:type="dxa" w:w="1080"/>
+          </w:tcPr>
+          <w:p>
+            <w:r>
+              <w:t>0.238</w:t>
+            </w:r>
+          </w:p>
+        </w:tc>
+        <w:tc>
+          <w:tcPr>
+            <w:tcW w:type="dxa" w:w="1080"/>
+          </w:tcPr>
+          <w:p>
+            <w:r>
+              <w:t>0.067</w:t>
+            </w:r>
+          </w:p>
+        </w:tc>
+      </w:tr>
+      <w:tr>
+        <w:tc>
+          <w:tcPr>
+            <w:tcW w:type="dxa" w:w="1080"/>
+          </w:tcPr>
+          <w:p>
+            <w:r>
+              <w:t>n=10000</w:t>
+            </w:r>
+          </w:p>
+        </w:tc>
+        <w:tc>
+          <w:tcPr>
+            <w:tcW w:type="dxa" w:w="1080"/>
+          </w:tcPr>
+          <w:p>
+            <w:r>
+              <w:t>PS_propensity_score</w:t>
+            </w:r>
+          </w:p>
+        </w:tc>
+        <w:tc>
+          <w:tcPr>
+            <w:tcW w:type="dxa" w:w="1080"/>
+          </w:tcPr>
+          <w:p>
+            <w:r>
+              <w:t>0.012</w:t>
+            </w:r>
+          </w:p>
+        </w:tc>
+        <w:tc>
+          <w:tcPr>
+            <w:tcW w:type="dxa" w:w="1080"/>
+          </w:tcPr>
+          <w:p>
+            <w:r>
+              <w:t>0.890</w:t>
+            </w:r>
+          </w:p>
+        </w:tc>
+        <w:tc>
+          <w:tcPr>
+            <w:tcW w:type="dxa" w:w="1080"/>
+          </w:tcPr>
+          <w:p>
+            <w:r>
+              <w:t>0.063</w:t>
+            </w:r>
+          </w:p>
+        </w:tc>
+        <w:tc>
+          <w:tcPr>
+            <w:tcW w:type="dxa" w:w="1080"/>
+          </w:tcPr>
+          <w:p>
+            <w:r>
+              <w:t>0.00668</w:t>
+            </w:r>
+          </w:p>
+        </w:tc>
+        <w:tc>
+          <w:tcPr>
+            <w:tcW w:type="dxa" w:w="1080"/>
+          </w:tcPr>
+          <w:p>
+            <w:r>
+              <w:t>0.403</w:t>
+            </w:r>
+          </w:p>
+        </w:tc>
+        <w:tc>
+          <w:tcPr>
+            <w:tcW w:type="dxa" w:w="1080"/>
+          </w:tcPr>
+          <w:p>
+            <w:r>
+              <w:t>0.107</w:t>
+            </w:r>
+          </w:p>
+        </w:tc>
+      </w:tr>
+      <w:tr>
+        <w:tc>
+          <w:tcPr>
+            <w:tcW w:type="dxa" w:w="1080"/>
+          </w:tcPr>
+          <w:p>
+            <w:r>
+              <w:t>n=10000</w:t>
+            </w:r>
+          </w:p>
+        </w:tc>
+        <w:tc>
+          <w:tcPr>
+            <w:tcW w:type="dxa" w:w="1080"/>
+          </w:tcPr>
+          <w:p>
+            <w:r>
+              <w:t>GMM</w:t>
+            </w:r>
+          </w:p>
+        </w:tc>
+        <w:tc>
+          <w:tcPr>
+            <w:tcW w:type="dxa" w:w="1080"/>
+          </w:tcPr>
+          <w:p>
+            <w:r>
+              <w:t>0.005</w:t>
+            </w:r>
+          </w:p>
+        </w:tc>
+        <w:tc>
+          <w:tcPr>
+            <w:tcW w:type="dxa" w:w="1080"/>
+          </w:tcPr>
+          <w:p>
+            <w:r>
+              <w:t>0.890</w:t>
+            </w:r>
+          </w:p>
+        </w:tc>
+        <w:tc>
+          <w:tcPr>
+            <w:tcW w:type="dxa" w:w="1080"/>
+          </w:tcPr>
+          <w:p>
+            <w:r>
+              <w:t>0.043</w:t>
+            </w:r>
+          </w:p>
+        </w:tc>
+        <w:tc>
+          <w:tcPr>
+            <w:tcW w:type="dxa" w:w="1080"/>
+          </w:tcPr>
+          <w:p>
+            <w:r>
+              <w:t>0.01028</w:t>
+            </w:r>
+          </w:p>
+        </w:tc>
+        <w:tc>
+          <w:tcPr>
+            <w:tcW w:type="dxa" w:w="1080"/>
+          </w:tcPr>
+          <w:p>
+            <w:r>
+              <w:t>0.080</w:t>
+            </w:r>
+          </w:p>
+        </w:tc>
+        <w:tc>
+          <w:tcPr>
+            <w:tcW w:type="dxa" w:w="1080"/>
+          </w:tcPr>
+          <w:p>
+            <w:r>
+              <w:t>0.143</w:t>
+            </w:r>
+          </w:p>
+        </w:tc>
+      </w:tr>
+      <w:tr>
+        <w:tc>
+          <w:tcPr>
+            <w:tcW w:type="dxa" w:w="1080"/>
+          </w:tcPr>
+          <w:p>
+            <w:r>
+              <w:t>n=10000</w:t>
+            </w:r>
+          </w:p>
+        </w:tc>
+        <w:tc>
+          <w:tcPr>
+            <w:tcW w:type="dxa" w:w="1080"/>
+          </w:tcPr>
+          <w:p>
+            <w:r>
+              <w:t>Prognostic_score</w:t>
+            </w:r>
+          </w:p>
+        </w:tc>
+        <w:tc>
+          <w:tcPr>
+            <w:tcW w:type="dxa" w:w="1080"/>
+          </w:tcPr>
+          <w:p>
+            <w:r>
+              <w:t>0.031</w:t>
+            </w:r>
+          </w:p>
+        </w:tc>
+        <w:tc>
+          <w:tcPr>
+            <w:tcW w:type="dxa" w:w="1080"/>
+          </w:tcPr>
+          <w:p>
+            <w:r>
+              <w:t>0.879</w:t>
+            </w:r>
+          </w:p>
+        </w:tc>
+        <w:tc>
+          <w:tcPr>
+            <w:tcW w:type="dxa" w:w="1080"/>
+          </w:tcPr>
+          <w:p>
+            <w:r>
+              <w:t>0.167</w:t>
+            </w:r>
+          </w:p>
+        </w:tc>
+        <w:tc>
+          <w:tcPr>
+            <w:tcW w:type="dxa" w:w="1080"/>
+          </w:tcPr>
+          <w:p>
+            <w:r>
+              <w:t>0.00725</w:t>
+            </w:r>
+          </w:p>
+        </w:tc>
+        <w:tc>
+          <w:tcPr>
+            <w:tcW w:type="dxa" w:w="1080"/>
+          </w:tcPr>
+          <w:p>
+            <w:r>
+              <w:t>0.352</w:t>
+            </w:r>
+          </w:p>
+        </w:tc>
+        <w:tc>
+          <w:tcPr>
+            <w:tcW w:type="dxa" w:w="1080"/>
+          </w:tcPr>
+          <w:p>
+            <w:r>
+              <w:t>0.218</w:t>
+            </w:r>
+          </w:p>
+        </w:tc>
+      </w:tr>
+      <w:tr>
+        <w:tc>
+          <w:tcPr>
+            <w:tcW w:type="dxa" w:w="1080"/>
+          </w:tcPr>
+          <w:p>
+            <w:r>
+              <w:t>n=10000</w:t>
+            </w:r>
+          </w:p>
+        </w:tc>
+        <w:tc>
+          <w:tcPr>
+            <w:tcW w:type="dxa" w:w="1080"/>
+          </w:tcPr>
+          <w:p>
+            <w:r>
+              <w:t>2B_clustering</w:t>
+            </w:r>
+          </w:p>
+        </w:tc>
+        <w:tc>
+          <w:tcPr>
+            <w:tcW w:type="dxa" w:w="1080"/>
+          </w:tcPr>
+          <w:p>
+            <w:r>
+              <w:t>0.024</w:t>
+            </w:r>
+          </w:p>
+        </w:tc>
+        <w:tc>
+          <w:tcPr>
+            <w:tcW w:type="dxa" w:w="1080"/>
+          </w:tcPr>
+          <w:p>
+            <w:r>
+              <w:t>0.859</w:t>
+            </w:r>
+          </w:p>
+        </w:tc>
+        <w:tc>
+          <w:tcPr>
+            <w:tcW w:type="dxa" w:w="1080"/>
+          </w:tcPr>
+          <w:p>
+            <w:r>
+              <w:t>0.141</w:t>
+            </w:r>
+          </w:p>
+        </w:tc>
+        <w:tc>
+          <w:tcPr>
+            <w:tcW w:type="dxa" w:w="1080"/>
+          </w:tcPr>
+          <w:p>
+            <w:r>
+              <w:t>0.00667</w:t>
+            </w:r>
+          </w:p>
+        </w:tc>
+        <w:tc>
+          <w:tcPr>
+            <w:tcW w:type="dxa" w:w="1080"/>
+          </w:tcPr>
+          <w:p>
+            <w:r>
+              <w:t>0.403</w:t>
+            </w:r>
+          </w:p>
+        </w:tc>
+        <w:tc>
+          <w:tcPr>
+            <w:tcW w:type="dxa" w:w="1080"/>
+          </w:tcPr>
+          <w:p>
+            <w:r>
+              <w:t>0.162</w:t>
+            </w:r>
+          </w:p>
+        </w:tc>
+      </w:tr>
+    </w:tbl>
+    <w:p>
+      <w:pPr>
+        <w:spacing w:before="240"/>
+      </w:pPr>
+      <w:r/>
+      <w:r>
+        <w:rPr>
+          <w:i/>
+        </w:rPr>
+        <w:t>Table 4. Sample-size sensitivity (K=5, z=1.0, zx=1.0): means over 10 simulations.</w:t>
+      </w:r>
+      <w:r/>
+    </w:p>
+    <w:p>
+      <w:pPr>
+        <w:spacing w:after="120"/>
+        <w:jc w:val="center"/>
+      </w:pPr>
+      <w:r>
+        <w:drawing>
+          <wp:inline xmlns:a="http://schemas.openxmlformats.org/drawingml/2006/main" xmlns:pic="http://schemas.openxmlformats.org/drawingml/2006/picture">
+            <wp:extent cx="5303520" cy="3314700"/>
+            <wp:docPr id="4" name="Picture 4"/>
+            <wp:cNvGraphicFramePr>
+              <a:graphicFrameLocks noChangeAspect="1"/>
+            </wp:cNvGraphicFramePr>
+            <a:graphic>
+              <a:graphicData uri="http://schemas.openxmlformats.org/drawingml/2006/picture">
+                <pic:pic>
+                  <pic:nvPicPr>
+                    <pic:cNvPr id="0" name="fig4_rsm_ipd_sample_size.png"/>
+                    <pic:cNvPicPr/>
+                  </pic:nvPicPr>
+                  <pic:blipFill>
+                    <a:blip r:embed="rId12"/>
+                    <a:stretch>
+                      <a:fillRect/>
+                    </a:stretch>
+                  </pic:blipFill>
+                  <pic:spPr>
+                    <a:xfrm>
+                      <a:off x="0" y="0"/>
+                      <a:ext cx="5303520" cy="3314700"/>
+                    </a:xfrm>
+                    <a:prstGeom prst="rect"/>
+                  </pic:spPr>
+                </pic:pic>
+              </a:graphicData>
+            </a:graphic>
+          </wp:inline>
+        </w:drawing>
+      </w:r>
+    </w:p>
+    <w:p>
+      <w:pPr>
+        <w:spacing w:before="240"/>
+        <w:jc w:val="center"/>
+      </w:pPr>
+      <w:r>
+        <w:rPr>
+          <w:b/>
+        </w:rPr>
+        <w:t>Figure 4. Sample-size sensitivity of random-effects ATE bias reduction (K=5).</w:t>
+      </w:r>
+    </w:p>
+    <w:p>
+      <w:pPr>
+        <w:pStyle w:val="Heading2"/>
+      </w:pPr>
+      <w:r>
+        <w:t>Sensitivity to Z-to-X influence strength</w:t>
+      </w:r>
+    </w:p>
+    <w:p>
+      <w:r>
+        <w:t xml:space="preserve">The Z-to-X influence scale governs how much information the measured covariates carry about the hidden modifiers. Table 5 summarises performance for zx influence scale = 0.2, 0.5 and 1.0. A larger trace was associated with higher ARI for most methods, and C1 and </w:t>
+      </w:r>
+      <m:oMath>
+        <m:sSub>
+          <m:e>
+            <m:r>
+              <m:t xml:space="preserve">W</m:t>
+            </m:r>
+          </m:e>
+          <m:sub>
+            <m:r>
+              <m:t xml:space="preserve">est</m:t>
+            </m:r>
+          </m:sub>
+        </m:sSub>
+      </m:oMath>
+      <w:r>
+        <w:t xml:space="preserve"> moved in the expected direction for several approaches, but the bias-reduction gains were non-monotonic and variable at this number of replications. This pattern indicates that stronger covariate traces improve subgroup recovery in principle, yet finite-sample noise and differences between methods in how the trace is exploited remain important; the diagnostics detect statistical traces rather than recover the hidden variables perfectly.</w:t>
+      </w:r>
+    </w:p>
+    <w:tbl>
+      <w:tblPr>
+        <w:tblStyle w:val="TableGrid"/>
+        <w:tblW w:type="auto" w:w="0"/>
+        <w:tblLook w:firstColumn="1" w:firstRow="1" w:lastColumn="0" w:lastRow="0" w:noHBand="0" w:noVBand="1" w:val="04A0"/>
+      </w:tblPr>
+      <w:tblGrid>
+        <w:gridCol w:w="1080"/>
+        <w:gridCol w:w="1080"/>
+        <w:gridCol w:w="1080"/>
+        <w:gridCol w:w="1080"/>
+        <w:gridCol w:w="1080"/>
+        <w:gridCol w:w="1080"/>
+        <w:gridCol w:w="1080"/>
+        <w:gridCol w:w="1080"/>
+      </w:tblGrid>
+      <w:tr>
+        <w:tc>
+          <w:tcPr>
+            <w:tcW w:type="dxa" w:w="1080"/>
+          </w:tcPr>
+          <w:p>
+            <w:r>
+              <w:rPr>
+                <w:b/>
+              </w:rPr>
+              <w:t>Condition</w:t>
+            </w:r>
+          </w:p>
+        </w:tc>
+        <w:tc>
+          <w:tcPr>
+            <w:tcW w:type="dxa" w:w="1080"/>
+          </w:tcPr>
+          <w:p>
+            <w:r>
+              <w:rPr>
+                <w:b/>
+              </w:rPr>
+              <w:t>Method</w:t>
+            </w:r>
+          </w:p>
+        </w:tc>
+        <w:tc>
+          <w:tcPr>
+            <w:tcW w:type="dxa" w:w="1080"/>
+          </w:tcPr>
+          <w:p>
+            <w:r>
+              <w:rPr>
+                <w:b/>
+              </w:rPr>
+              <w:t>ARI</w:t>
+            </w:r>
+          </w:p>
+        </w:tc>
+        <w:tc>
+          <w:tcPr>
+            <w:tcW w:type="dxa" w:w="1080"/>
+          </w:tcPr>
+          <w:p>
+            <w:r>
+              <w:rPr>
+                <w:b/>
+              </w:rPr>
+              <w:t>C1</w:t>
+            </w:r>
+          </w:p>
+        </w:tc>
+        <w:tc>
+          <w:tcPr>
+            <w:tcW w:type="dxa" w:w="1080"/>
+          </w:tcPr>
+          <w:p>
+            <m:oMath>
+              <m:sSub>
+                <m:e>
+                  <m:r>
+                    <m:t xml:space="preserve">W</m:t>
+                  </m:r>
+                </m:e>
+                <m:sub>
+                  <m:r>
+                    <m:t xml:space="preserve">est</m:t>
+                  </m:r>
+                </m:sub>
+              </m:sSub>
+            </m:oMath>
+          </w:p>
+        </w:tc>
+        <w:tc>
+          <w:tcPr>
+            <w:tcW w:type="dxa" w:w="1080"/>
+          </w:tcPr>
+          <w:p>
+            <w:r>
+              <w:rPr>
+                <w:b/>
+              </w:rPr>
+              <w:t>RE bias</w:t>
+            </w:r>
+          </w:p>
+        </w:tc>
+        <w:tc>
+          <w:tcPr>
+            <w:tcW w:type="dxa" w:w="1080"/>
+          </w:tcPr>
+          <w:p>
+            <w:r>
+              <w:rPr>
+                <w:b/>
+              </w:rPr>
+              <w:t>Rel reduction RE</w:t>
+            </w:r>
+          </w:p>
+        </w:tc>
+        <w:tc>
+          <w:tcPr>
+            <w:tcW w:type="dxa" w:w="1080"/>
+          </w:tcPr>
+          <w:p>
+            <w:r>
+              <w:rPr>
+                <w:b/>
+              </w:rPr>
+              <w:t>RE I2</w:t>
+            </w:r>
+          </w:p>
+        </w:tc>
+      </w:tr>
+      <w:tr>
+        <w:tc>
+          <w:tcPr>
+            <w:tcW w:type="dxa" w:w="1080"/>
+          </w:tcPr>
+          <w:p>
+            <w:r>
+              <w:t>zx=0.2</w:t>
+            </w:r>
+          </w:p>
+        </w:tc>
+        <w:tc>
+          <w:tcPr>
+            <w:tcW w:type="dxa" w:w="1080"/>
+          </w:tcPr>
+          <w:p>
+            <w:r>
+              <w:t>1B_residual</w:t>
+            </w:r>
+          </w:p>
+        </w:tc>
+        <w:tc>
+          <w:tcPr>
+            <w:tcW w:type="dxa" w:w="1080"/>
+          </w:tcPr>
+          <w:p>
+            <w:r>
+              <w:t>0.010</w:t>
+            </w:r>
+          </w:p>
+        </w:tc>
+        <w:tc>
+          <w:tcPr>
+            <w:tcW w:type="dxa" w:w="1080"/>
+          </w:tcPr>
+          <w:p>
+            <w:r>
+              <w:t>1.000</w:t>
+            </w:r>
+          </w:p>
+        </w:tc>
+        <w:tc>
+          <w:tcPr>
+            <w:tcW w:type="dxa" w:w="1080"/>
+          </w:tcPr>
+          <w:p>
+            <w:r>
+              <w:t>0.068</w:t>
+            </w:r>
+          </w:p>
+        </w:tc>
+        <w:tc>
+          <w:tcPr>
+            <w:tcW w:type="dxa" w:w="1080"/>
+          </w:tcPr>
+          <w:p>
+            <w:r>
+              <w:t>0.00897</w:t>
+            </w:r>
+          </w:p>
+        </w:tc>
+        <w:tc>
+          <w:tcPr>
+            <w:tcW w:type="dxa" w:w="1080"/>
+          </w:tcPr>
+          <w:p>
+            <w:r>
+              <w:t>0.560</w:t>
+            </w:r>
+          </w:p>
+        </w:tc>
+        <w:tc>
+          <w:tcPr>
+            <w:tcW w:type="dxa" w:w="1080"/>
+          </w:tcPr>
+          <w:p>
+            <w:r>
+              <w:t>0.029</w:t>
+            </w:r>
+          </w:p>
+        </w:tc>
+      </w:tr>
+      <w:tr>
+        <w:tc>
+          <w:tcPr>
+            <w:tcW w:type="dxa" w:w="1080"/>
+          </w:tcPr>
+          <w:p>
+            <w:r>
+              <w:t>zx=0.2</w:t>
+            </w:r>
+          </w:p>
+        </w:tc>
+        <w:tc>
+          <w:tcPr>
+            <w:tcW w:type="dxa" w:w="1080"/>
+          </w:tcPr>
+          <w:p>
+            <w:r>
+              <w:t>PS_propensity_score</w:t>
+            </w:r>
+          </w:p>
+        </w:tc>
+        <w:tc>
+          <w:tcPr>
+            <w:tcW w:type="dxa" w:w="1080"/>
+          </w:tcPr>
+          <w:p>
+            <w:r>
+              <w:t>0.001</w:t>
+            </w:r>
+          </w:p>
+        </w:tc>
+        <w:tc>
+          <w:tcPr>
+            <w:tcW w:type="dxa" w:w="1080"/>
+          </w:tcPr>
+          <w:p>
+            <w:r>
+              <w:t>0.813</w:t>
+            </w:r>
+          </w:p>
+        </w:tc>
+        <w:tc>
+          <w:tcPr>
+            <w:tcW w:type="dxa" w:w="1080"/>
+          </w:tcPr>
+          <w:p>
+            <w:r>
+              <w:t>0.139</w:t>
+            </w:r>
+          </w:p>
+        </w:tc>
+        <w:tc>
+          <w:tcPr>
+            <w:tcW w:type="dxa" w:w="1080"/>
+          </w:tcPr>
+          <w:p>
+            <w:r>
+              <w:t>0.01900</w:t>
+            </w:r>
+          </w:p>
+        </w:tc>
+        <w:tc>
+          <w:tcPr>
+            <w:tcW w:type="dxa" w:w="1080"/>
+          </w:tcPr>
+          <w:p>
+            <w:r>
+              <w:t>0.067</w:t>
+            </w:r>
+          </w:p>
+        </w:tc>
+        <w:tc>
+          <w:tcPr>
+            <w:tcW w:type="dxa" w:w="1080"/>
+          </w:tcPr>
+          <w:p>
+            <w:r>
+              <w:t>0.191</w:t>
+            </w:r>
+          </w:p>
+        </w:tc>
+      </w:tr>
+      <w:tr>
+        <w:tc>
+          <w:tcPr>
+            <w:tcW w:type="dxa" w:w="1080"/>
+          </w:tcPr>
+          <w:p>
+            <w:r>
+              <w:t>zx=0.2</w:t>
+            </w:r>
+          </w:p>
+        </w:tc>
+        <w:tc>
+          <w:tcPr>
+            <w:tcW w:type="dxa" w:w="1080"/>
+          </w:tcPr>
+          <w:p>
+            <w:r>
+              <w:t>GMM</w:t>
+            </w:r>
+          </w:p>
+        </w:tc>
+        <w:tc>
+          <w:tcPr>
+            <w:tcW w:type="dxa" w:w="1080"/>
+          </w:tcPr>
+          <w:p>
+            <w:r>
+              <w:t>0.001</w:t>
+            </w:r>
+          </w:p>
+        </w:tc>
+        <w:tc>
+          <w:tcPr>
+            <w:tcW w:type="dxa" w:w="1080"/>
+          </w:tcPr>
+          <w:p>
+            <w:r>
+              <w:t>0.905</w:t>
+            </w:r>
+          </w:p>
+        </w:tc>
+        <w:tc>
+          <w:tcPr>
+            <w:tcW w:type="dxa" w:w="1080"/>
+          </w:tcPr>
+          <w:p>
+            <w:r>
+              <w:t>0.136</w:t>
+            </w:r>
+          </w:p>
+        </w:tc>
+        <w:tc>
+          <w:tcPr>
+            <w:tcW w:type="dxa" w:w="1080"/>
+          </w:tcPr>
+          <w:p>
+            <w:r>
+              <w:t>0.01931</w:t>
+            </w:r>
+          </w:p>
+        </w:tc>
+        <w:tc>
+          <w:tcPr>
+            <w:tcW w:type="dxa" w:w="1080"/>
+          </w:tcPr>
+          <w:p>
+            <w:r>
+              <w:t>0.052</w:t>
+            </w:r>
+          </w:p>
+        </w:tc>
+        <w:tc>
+          <w:tcPr>
+            <w:tcW w:type="dxa" w:w="1080"/>
+          </w:tcPr>
+          <w:p>
+            <w:r>
+              <w:t>0.110</w:t>
+            </w:r>
+          </w:p>
+        </w:tc>
+      </w:tr>
+      <w:tr>
+        <w:tc>
+          <w:tcPr>
+            <w:tcW w:type="dxa" w:w="1080"/>
+          </w:tcPr>
+          <w:p>
+            <w:r>
+              <w:t>zx=0.2</w:t>
+            </w:r>
+          </w:p>
+        </w:tc>
+        <w:tc>
+          <w:tcPr>
+            <w:tcW w:type="dxa" w:w="1080"/>
+          </w:tcPr>
+          <w:p>
+            <w:r>
+              <w:t>Prognostic_score</w:t>
+            </w:r>
+          </w:p>
+        </w:tc>
+        <w:tc>
+          <w:tcPr>
+            <w:tcW w:type="dxa" w:w="1080"/>
+          </w:tcPr>
+          <w:p>
+            <w:r>
+              <w:t>0.001</w:t>
+            </w:r>
+          </w:p>
+        </w:tc>
+        <w:tc>
+          <w:tcPr>
+            <w:tcW w:type="dxa" w:w="1080"/>
+          </w:tcPr>
+          <w:p>
+            <w:r>
+              <w:t>0.933</w:t>
+            </w:r>
+          </w:p>
+        </w:tc>
+        <w:tc>
+          <w:tcPr>
+            <w:tcW w:type="dxa" w:w="1080"/>
+          </w:tcPr>
+          <w:p>
+            <w:r>
+              <w:t>0.085</w:t>
+            </w:r>
+          </w:p>
+        </w:tc>
+        <w:tc>
+          <w:tcPr>
+            <w:tcW w:type="dxa" w:w="1080"/>
+          </w:tcPr>
+          <w:p>
+            <w:r>
+              <w:t>0.01894</w:t>
+            </w:r>
+          </w:p>
+        </w:tc>
+        <w:tc>
+          <w:tcPr>
+            <w:tcW w:type="dxa" w:w="1080"/>
+          </w:tcPr>
+          <w:p>
+            <w:r>
+              <w:t>0.070</w:t>
+            </w:r>
+          </w:p>
+        </w:tc>
+        <w:tc>
+          <w:tcPr>
+            <w:tcW w:type="dxa" w:w="1080"/>
+          </w:tcPr>
+          <w:p>
+            <w:r>
+              <w:t>0.064</w:t>
+            </w:r>
+          </w:p>
+        </w:tc>
+      </w:tr>
+      <w:tr>
+        <w:tc>
+          <w:tcPr>
+            <w:tcW w:type="dxa" w:w="1080"/>
+          </w:tcPr>
+          <w:p>
+            <w:r>
+              <w:t>zx=0.2</w:t>
+            </w:r>
+          </w:p>
+        </w:tc>
+        <w:tc>
+          <w:tcPr>
+            <w:tcW w:type="dxa" w:w="1080"/>
+          </w:tcPr>
+          <w:p>
+            <w:r>
+              <w:t>2B_clustering</w:t>
+            </w:r>
+          </w:p>
+        </w:tc>
+        <w:tc>
+          <w:tcPr>
+            <w:tcW w:type="dxa" w:w="1080"/>
+          </w:tcPr>
+          <w:p>
+            <w:r>
+              <w:t>0.001</w:t>
+            </w:r>
+          </w:p>
+        </w:tc>
+        <w:tc>
+          <w:tcPr>
+            <w:tcW w:type="dxa" w:w="1080"/>
+          </w:tcPr>
+          <w:p>
+            <w:r>
+              <w:t>0.764</w:t>
+            </w:r>
+          </w:p>
+        </w:tc>
+        <w:tc>
+          <w:tcPr>
+            <w:tcW w:type="dxa" w:w="1080"/>
+          </w:tcPr>
+          <w:p>
+            <w:r>
+              <w:t>0.153</w:t>
+            </w:r>
+          </w:p>
+        </w:tc>
+        <w:tc>
+          <w:tcPr>
+            <w:tcW w:type="dxa" w:w="1080"/>
+          </w:tcPr>
+          <w:p>
+            <w:r>
+              <w:t>0.01872</w:t>
+            </w:r>
+          </w:p>
+        </w:tc>
+        <w:tc>
+          <w:tcPr>
+            <w:tcW w:type="dxa" w:w="1080"/>
+          </w:tcPr>
+          <w:p>
+            <w:r>
+              <w:t>0.081</w:t>
+            </w:r>
+          </w:p>
+        </w:tc>
+        <w:tc>
+          <w:tcPr>
+            <w:tcW w:type="dxa" w:w="1080"/>
+          </w:tcPr>
+          <w:p>
+            <w:r>
+              <w:t>0.251</w:t>
+            </w:r>
+          </w:p>
+        </w:tc>
+      </w:tr>
+      <w:tr>
+        <w:tc>
+          <w:tcPr>
+            <w:tcW w:type="dxa" w:w="1080"/>
+          </w:tcPr>
+          <w:p>
+            <w:r>
+              <w:t>zx=0.5</w:t>
+            </w:r>
+          </w:p>
+        </w:tc>
+        <w:tc>
+          <w:tcPr>
+            <w:tcW w:type="dxa" w:w="1080"/>
+          </w:tcPr>
+          <w:p>
+            <w:r>
+              <w:t>1B_residual</w:t>
+            </w:r>
+          </w:p>
+        </w:tc>
+        <w:tc>
+          <w:tcPr>
+            <w:tcW w:type="dxa" w:w="1080"/>
+          </w:tcPr>
+          <w:p>
+            <w:r>
+              <w:t>0.017</w:t>
+            </w:r>
+          </w:p>
+        </w:tc>
+        <w:tc>
+          <w:tcPr>
+            <w:tcW w:type="dxa" w:w="1080"/>
+          </w:tcPr>
+          <w:p>
+            <w:r>
+              <w:t>1.000</w:t>
+            </w:r>
+          </w:p>
+        </w:tc>
+        <w:tc>
+          <w:tcPr>
+            <w:tcW w:type="dxa" w:w="1080"/>
+          </w:tcPr>
+          <w:p>
+            <w:r>
+              <w:t>0.055</w:t>
+            </w:r>
+          </w:p>
+        </w:tc>
+        <w:tc>
+          <w:tcPr>
+            <w:tcW w:type="dxa" w:w="1080"/>
+          </w:tcPr>
+          <w:p>
+            <w:r>
+              <w:t>0.00875</w:t>
+            </w:r>
+          </w:p>
+        </w:tc>
+        <w:tc>
+          <w:tcPr>
+            <w:tcW w:type="dxa" w:w="1080"/>
+          </w:tcPr>
+          <w:p>
+            <w:r>
+              <w:t>0.429</w:t>
+            </w:r>
+          </w:p>
+        </w:tc>
+        <w:tc>
+          <w:tcPr>
+            <w:tcW w:type="dxa" w:w="1080"/>
+          </w:tcPr>
+          <w:p>
+            <w:r>
+              <w:t>0.000</w:t>
+            </w:r>
+          </w:p>
+        </w:tc>
+      </w:tr>
+      <w:tr>
+        <w:tc>
+          <w:tcPr>
+            <w:tcW w:type="dxa" w:w="1080"/>
+          </w:tcPr>
+          <w:p>
+            <w:r>
+              <w:t>zx=0.5</w:t>
+            </w:r>
+          </w:p>
+        </w:tc>
+        <w:tc>
+          <w:tcPr>
+            <w:tcW w:type="dxa" w:w="1080"/>
+          </w:tcPr>
+          <w:p>
+            <w:r>
+              <w:t>PS_propensity_score</w:t>
+            </w:r>
+          </w:p>
+        </w:tc>
+        <w:tc>
+          <w:tcPr>
+            <w:tcW w:type="dxa" w:w="1080"/>
+          </w:tcPr>
+          <w:p>
+            <w:r>
+              <w:t>0.001</w:t>
+            </w:r>
+          </w:p>
+        </w:tc>
+        <w:tc>
+          <w:tcPr>
+            <w:tcW w:type="dxa" w:w="1080"/>
+          </w:tcPr>
+          <w:p>
+            <w:r>
+              <w:t>0.774</w:t>
+            </w:r>
+          </w:p>
+        </w:tc>
+        <w:tc>
+          <w:tcPr>
+            <w:tcW w:type="dxa" w:w="1080"/>
+          </w:tcPr>
+          <w:p>
+            <w:r>
+              <w:t>0.109</w:t>
+            </w:r>
+          </w:p>
+        </w:tc>
+        <w:tc>
+          <w:tcPr>
+            <w:tcW w:type="dxa" w:w="1080"/>
+          </w:tcPr>
+          <w:p>
+            <w:r>
+              <w:t>0.01536</w:t>
+            </w:r>
+          </w:p>
+        </w:tc>
+        <w:tc>
+          <w:tcPr>
+            <w:tcW w:type="dxa" w:w="1080"/>
+          </w:tcPr>
+          <w:p>
+            <w:r>
+              <w:t>-0.004</w:t>
+            </w:r>
+          </w:p>
+        </w:tc>
+        <w:tc>
+          <w:tcPr>
+            <w:tcW w:type="dxa" w:w="1080"/>
+          </w:tcPr>
+          <w:p>
+            <w:r>
+              <w:t>0.220</w:t>
+            </w:r>
+          </w:p>
+        </w:tc>
+      </w:tr>
+      <w:tr>
+        <w:tc>
+          <w:tcPr>
+            <w:tcW w:type="dxa" w:w="1080"/>
+          </w:tcPr>
+          <w:p>
+            <w:r>
+              <w:t>zx=0.5</w:t>
+            </w:r>
+          </w:p>
+        </w:tc>
+        <w:tc>
+          <w:tcPr>
+            <w:tcW w:type="dxa" w:w="1080"/>
+          </w:tcPr>
+          <w:p>
+            <w:r>
+              <w:t>GMM</w:t>
+            </w:r>
+          </w:p>
+        </w:tc>
+        <w:tc>
+          <w:tcPr>
+            <w:tcW w:type="dxa" w:w="1080"/>
+          </w:tcPr>
+          <w:p>
+            <w:r>
+              <w:t>0.002</w:t>
+            </w:r>
+          </w:p>
+        </w:tc>
+        <w:tc>
+          <w:tcPr>
+            <w:tcW w:type="dxa" w:w="1080"/>
+          </w:tcPr>
+          <w:p>
+            <w:r>
+              <w:t>0.909</w:t>
+            </w:r>
+          </w:p>
+        </w:tc>
+        <w:tc>
+          <w:tcPr>
+            <w:tcW w:type="dxa" w:w="1080"/>
+          </w:tcPr>
+          <w:p>
+            <w:r>
+              <w:t>0.072</w:t>
+            </w:r>
+          </w:p>
+        </w:tc>
+        <w:tc>
+          <w:tcPr>
+            <w:tcW w:type="dxa" w:w="1080"/>
+          </w:tcPr>
+          <w:p>
+            <w:r>
+              <w:t>0.01634</w:t>
+            </w:r>
+          </w:p>
+        </w:tc>
+        <w:tc>
+          <w:tcPr>
+            <w:tcW w:type="dxa" w:w="1080"/>
+          </w:tcPr>
+          <w:p>
+            <w:r>
+              <w:t>-0.068</w:t>
+            </w:r>
+          </w:p>
+        </w:tc>
+        <w:tc>
+          <w:tcPr>
+            <w:tcW w:type="dxa" w:w="1080"/>
+          </w:tcPr>
+          <w:p>
+            <w:r>
+              <w:t>0.097</w:t>
+            </w:r>
+          </w:p>
+        </w:tc>
+      </w:tr>
+      <w:tr>
+        <w:tc>
+          <w:tcPr>
+            <w:tcW w:type="dxa" w:w="1080"/>
+          </w:tcPr>
+          <w:p>
+            <w:r>
+              <w:t>zx=0.5</w:t>
+            </w:r>
+          </w:p>
+        </w:tc>
+        <w:tc>
+          <w:tcPr>
+            <w:tcW w:type="dxa" w:w="1080"/>
+          </w:tcPr>
+          <w:p>
+            <w:r>
+              <w:t>Prognostic_score</w:t>
+            </w:r>
+          </w:p>
+        </w:tc>
+        <w:tc>
+          <w:tcPr>
+            <w:tcW w:type="dxa" w:w="1080"/>
+          </w:tcPr>
+          <w:p>
+            <w:r>
+              <w:t>0.009</w:t>
+            </w:r>
+          </w:p>
+        </w:tc>
+        <w:tc>
+          <w:tcPr>
+            <w:tcW w:type="dxa" w:w="1080"/>
+          </w:tcPr>
+          <w:p>
+            <w:r>
+              <w:t>0.933</w:t>
+            </w:r>
+          </w:p>
+        </w:tc>
+        <w:tc>
+          <w:tcPr>
+            <w:tcW w:type="dxa" w:w="1080"/>
+          </w:tcPr>
+          <w:p>
+            <w:r>
+              <w:t>0.068</w:t>
+            </w:r>
+          </w:p>
+        </w:tc>
+        <w:tc>
+          <w:tcPr>
+            <w:tcW w:type="dxa" w:w="1080"/>
+          </w:tcPr>
+          <w:p>
+            <w:r>
+              <w:t>0.01465</w:t>
+            </w:r>
+          </w:p>
+        </w:tc>
+        <w:tc>
+          <w:tcPr>
+            <w:tcW w:type="dxa" w:w="1080"/>
+          </w:tcPr>
+          <w:p>
+            <w:r>
+              <w:t>0.043</w:t>
+            </w:r>
+          </w:p>
+        </w:tc>
+        <w:tc>
+          <w:tcPr>
+            <w:tcW w:type="dxa" w:w="1080"/>
+          </w:tcPr>
+          <w:p>
+            <w:r>
+              <w:t>0.086</w:t>
+            </w:r>
+          </w:p>
+        </w:tc>
+      </w:tr>
+      <w:tr>
+        <w:tc>
+          <w:tcPr>
+            <w:tcW w:type="dxa" w:w="1080"/>
+          </w:tcPr>
+          <w:p>
+            <w:r>
+              <w:t>zx=0.5</w:t>
+            </w:r>
+          </w:p>
+        </w:tc>
+        <w:tc>
+          <w:tcPr>
+            <w:tcW w:type="dxa" w:w="1080"/>
+          </w:tcPr>
+          <w:p>
+            <w:r>
+              <w:t>2B_clustering</w:t>
+            </w:r>
+          </w:p>
+        </w:tc>
+        <w:tc>
+          <w:tcPr>
+            <w:tcW w:type="dxa" w:w="1080"/>
+          </w:tcPr>
+          <w:p>
+            <w:r>
+              <w:t>0.006</w:t>
+            </w:r>
+          </w:p>
+        </w:tc>
+        <w:tc>
+          <w:tcPr>
+            <w:tcW w:type="dxa" w:w="1080"/>
+          </w:tcPr>
+          <w:p>
+            <w:r>
+              <w:t>0.835</w:t>
+            </w:r>
+          </w:p>
+        </w:tc>
+        <w:tc>
+          <w:tcPr>
+            <w:tcW w:type="dxa" w:w="1080"/>
+          </w:tcPr>
+          <w:p>
+            <w:r>
+              <w:t>0.146</w:t>
+            </w:r>
+          </w:p>
+        </w:tc>
+        <w:tc>
+          <w:tcPr>
+            <w:tcW w:type="dxa" w:w="1080"/>
+          </w:tcPr>
+          <w:p>
+            <w:r>
+              <w:t>0.01280</w:t>
+            </w:r>
+          </w:p>
+        </w:tc>
+        <w:tc>
+          <w:tcPr>
+            <w:tcW w:type="dxa" w:w="1080"/>
+          </w:tcPr>
+          <w:p>
+            <w:r>
+              <w:t>0.163</w:t>
+            </w:r>
+          </w:p>
+        </w:tc>
+        <w:tc>
+          <w:tcPr>
+            <w:tcW w:type="dxa" w:w="1080"/>
+          </w:tcPr>
+          <w:p>
+            <w:r>
+              <w:t>0.172</w:t>
+            </w:r>
+          </w:p>
+        </w:tc>
+      </w:tr>
+      <w:tr>
+        <w:tc>
+          <w:tcPr>
+            <w:tcW w:type="dxa" w:w="1080"/>
+          </w:tcPr>
+          <w:p>
+            <w:r>
+              <w:t>zx=1.0</w:t>
+            </w:r>
+          </w:p>
+        </w:tc>
+        <w:tc>
+          <w:tcPr>
+            <w:tcW w:type="dxa" w:w="1080"/>
+          </w:tcPr>
+          <w:p>
+            <w:r>
+              <w:t>1B_residual</w:t>
+            </w:r>
+          </w:p>
+        </w:tc>
+        <w:tc>
+          <w:tcPr>
+            <w:tcW w:type="dxa" w:w="1080"/>
+          </w:tcPr>
+          <w:p>
+            <w:r>
+              <w:t>0.032</w:t>
+            </w:r>
+          </w:p>
+        </w:tc>
+        <w:tc>
+          <w:tcPr>
+            <w:tcW w:type="dxa" w:w="1080"/>
+          </w:tcPr>
+          <w:p>
+            <w:r>
+              <w:t>0.976</w:t>
+            </w:r>
+          </w:p>
+        </w:tc>
+        <w:tc>
+          <w:tcPr>
+            <w:tcW w:type="dxa" w:w="1080"/>
+          </w:tcPr>
+          <w:p>
+            <w:r>
+              <w:t>0.064</w:t>
+            </w:r>
+          </w:p>
+        </w:tc>
+        <w:tc>
+          <w:tcPr>
+            <w:tcW w:type="dxa" w:w="1080"/>
+          </w:tcPr>
+          <w:p>
+            <w:r>
+              <w:t>0.00852</w:t>
+            </w:r>
+          </w:p>
+        </w:tc>
+        <w:tc>
+          <w:tcPr>
+            <w:tcW w:type="dxa" w:w="1080"/>
+          </w:tcPr>
+          <w:p>
+            <w:r>
+              <w:t>0.602</w:t>
+            </w:r>
+          </w:p>
+        </w:tc>
+        <w:tc>
+          <w:tcPr>
+            <w:tcW w:type="dxa" w:w="1080"/>
+          </w:tcPr>
+          <w:p>
+            <w:r>
+              <w:t>0.000</w:t>
+            </w:r>
+          </w:p>
+        </w:tc>
+      </w:tr>
+      <w:tr>
+        <w:tc>
+          <w:tcPr>
+            <w:tcW w:type="dxa" w:w="1080"/>
+          </w:tcPr>
+          <w:p>
+            <w:r>
+              <w:t>zx=1.0</w:t>
+            </w:r>
+          </w:p>
+        </w:tc>
+        <w:tc>
+          <w:tcPr>
+            <w:tcW w:type="dxa" w:w="1080"/>
+          </w:tcPr>
+          <w:p>
+            <w:r>
+              <w:t>PS_propensity_score</w:t>
+            </w:r>
+          </w:p>
+        </w:tc>
+        <w:tc>
+          <w:tcPr>
+            <w:tcW w:type="dxa" w:w="1080"/>
+          </w:tcPr>
+          <w:p>
+            <w:r>
+              <w:t>0.007</w:t>
+            </w:r>
+          </w:p>
+        </w:tc>
+        <w:tc>
+          <w:tcPr>
+            <w:tcW w:type="dxa" w:w="1080"/>
+          </w:tcPr>
+          <w:p>
+            <w:r>
+              <w:t>0.828</w:t>
+            </w:r>
+          </w:p>
+        </w:tc>
+        <w:tc>
+          <w:tcPr>
+            <w:tcW w:type="dxa" w:w="1080"/>
+          </w:tcPr>
+          <w:p>
+            <w:r>
+              <w:t>0.080</w:t>
+            </w:r>
+          </w:p>
+        </w:tc>
+        <w:tc>
+          <w:tcPr>
+            <w:tcW w:type="dxa" w:w="1080"/>
+          </w:tcPr>
+          <w:p>
+            <w:r>
+              <w:t>0.02162</w:t>
+            </w:r>
+          </w:p>
+        </w:tc>
+        <w:tc>
+          <w:tcPr>
+            <w:tcW w:type="dxa" w:w="1080"/>
+          </w:tcPr>
+          <w:p>
+            <w:r>
+              <w:t>-0.011</w:t>
+            </w:r>
+          </w:p>
+        </w:tc>
+        <w:tc>
+          <w:tcPr>
+            <w:tcW w:type="dxa" w:w="1080"/>
+          </w:tcPr>
+          <w:p>
+            <w:r>
+              <w:t>0.189</w:t>
+            </w:r>
+          </w:p>
+        </w:tc>
+      </w:tr>
+      <w:tr>
+        <w:tc>
+          <w:tcPr>
+            <w:tcW w:type="dxa" w:w="1080"/>
+          </w:tcPr>
+          <w:p>
+            <w:r>
+              <w:t>zx=1.0</w:t>
+            </w:r>
+          </w:p>
+        </w:tc>
+        <w:tc>
+          <w:tcPr>
+            <w:tcW w:type="dxa" w:w="1080"/>
+          </w:tcPr>
+          <w:p>
+            <w:r>
+              <w:t>GMM</w:t>
+            </w:r>
+          </w:p>
+        </w:tc>
+        <w:tc>
+          <w:tcPr>
+            <w:tcW w:type="dxa" w:w="1080"/>
+          </w:tcPr>
+          <w:p>
+            <w:r>
+              <w:t>0.006</w:t>
+            </w:r>
+          </w:p>
+        </w:tc>
+        <w:tc>
+          <w:tcPr>
+            <w:tcW w:type="dxa" w:w="1080"/>
+          </w:tcPr>
+          <w:p>
+            <w:r>
+              <w:t>0.956</w:t>
+            </w:r>
+          </w:p>
+        </w:tc>
+        <w:tc>
+          <w:tcPr>
+            <w:tcW w:type="dxa" w:w="1080"/>
+          </w:tcPr>
+          <w:p>
+            <w:r>
+              <w:t>0.057</w:t>
+            </w:r>
+          </w:p>
+        </w:tc>
+        <w:tc>
+          <w:tcPr>
+            <w:tcW w:type="dxa" w:w="1080"/>
+          </w:tcPr>
+          <w:p>
+            <w:r>
+              <w:t>0.02180</w:t>
+            </w:r>
+          </w:p>
+        </w:tc>
+        <w:tc>
+          <w:tcPr>
+            <w:tcW w:type="dxa" w:w="1080"/>
+          </w:tcPr>
+          <w:p>
+            <w:r>
+              <w:t>-0.020</w:t>
+            </w:r>
+          </w:p>
+        </w:tc>
+        <w:tc>
+          <w:tcPr>
+            <w:tcW w:type="dxa" w:w="1080"/>
+          </w:tcPr>
+          <w:p>
+            <w:r>
+              <w:t>0.074</w:t>
+            </w:r>
+          </w:p>
+        </w:tc>
+      </w:tr>
+      <w:tr>
+        <w:tc>
+          <w:tcPr>
+            <w:tcW w:type="dxa" w:w="1080"/>
+          </w:tcPr>
+          <w:p>
+            <w:r>
+              <w:t>zx=1.0</w:t>
+            </w:r>
+          </w:p>
+        </w:tc>
+        <w:tc>
+          <w:tcPr>
+            <w:tcW w:type="dxa" w:w="1080"/>
+          </w:tcPr>
+          <w:p>
+            <w:r>
+              <w:t>Prognostic_score</w:t>
+            </w:r>
+          </w:p>
+        </w:tc>
+        <w:tc>
+          <w:tcPr>
+            <w:tcW w:type="dxa" w:w="1080"/>
+          </w:tcPr>
+          <w:p>
+            <w:r>
+              <w:t>0.025</w:t>
+            </w:r>
+          </w:p>
+        </w:tc>
+        <w:tc>
+          <w:tcPr>
+            <w:tcW w:type="dxa" w:w="1080"/>
+          </w:tcPr>
+          <w:p>
+            <w:r>
+              <w:t>0.905</w:t>
+            </w:r>
+          </w:p>
+        </w:tc>
+        <w:tc>
+          <w:tcPr>
+            <w:tcW w:type="dxa" w:w="1080"/>
+          </w:tcPr>
+          <w:p>
+            <w:r>
+              <w:t>0.080</w:t>
+            </w:r>
+          </w:p>
+        </w:tc>
+        <w:tc>
+          <w:tcPr>
+            <w:tcW w:type="dxa" w:w="1080"/>
+          </w:tcPr>
+          <w:p>
+            <w:r>
+              <w:t>0.01536</w:t>
+            </w:r>
+          </w:p>
+        </w:tc>
+        <w:tc>
+          <w:tcPr>
+            <w:tcW w:type="dxa" w:w="1080"/>
+          </w:tcPr>
+          <w:p>
+            <w:r>
+              <w:t>0.281</w:t>
+            </w:r>
+          </w:p>
+        </w:tc>
+        <w:tc>
+          <w:tcPr>
+            <w:tcW w:type="dxa" w:w="1080"/>
+          </w:tcPr>
+          <w:p>
+            <w:r>
+              <w:t>0.141</w:t>
+            </w:r>
+          </w:p>
+        </w:tc>
+      </w:tr>
+      <w:tr>
+        <w:tc>
+          <w:tcPr>
+            <w:tcW w:type="dxa" w:w="1080"/>
+          </w:tcPr>
+          <w:p>
+            <w:r>
+              <w:t>zx=1.0</w:t>
+            </w:r>
+          </w:p>
+        </w:tc>
+        <w:tc>
+          <w:tcPr>
+            <w:tcW w:type="dxa" w:w="1080"/>
+          </w:tcPr>
+          <w:p>
+            <w:r>
+              <w:t>2B_clustering</w:t>
+            </w:r>
+          </w:p>
+        </w:tc>
+        <w:tc>
+          <w:tcPr>
+            <w:tcW w:type="dxa" w:w="1080"/>
+          </w:tcPr>
+          <w:p>
+            <w:r>
+              <w:t>0.022</w:t>
+            </w:r>
+          </w:p>
+        </w:tc>
+        <w:tc>
+          <w:tcPr>
+            <w:tcW w:type="dxa" w:w="1080"/>
+          </w:tcPr>
+          <w:p>
+            <w:r>
+              <w:t>0.914</w:t>
+            </w:r>
+          </w:p>
+        </w:tc>
+        <w:tc>
+          <w:tcPr>
+            <w:tcW w:type="dxa" w:w="1080"/>
+          </w:tcPr>
+          <w:p>
+            <w:r>
+              <w:t>0.108</w:t>
+            </w:r>
+          </w:p>
+        </w:tc>
+        <w:tc>
+          <w:tcPr>
+            <w:tcW w:type="dxa" w:w="1080"/>
+          </w:tcPr>
+          <w:p>
+            <w:r>
+              <w:t>0.02077</w:t>
+            </w:r>
+          </w:p>
+        </w:tc>
+        <w:tc>
+          <w:tcPr>
+            <w:tcW w:type="dxa" w:w="1080"/>
+          </w:tcPr>
+          <w:p>
+            <w:r>
+              <w:t>0.028</w:t>
+            </w:r>
+          </w:p>
+        </w:tc>
+        <w:tc>
+          <w:tcPr>
+            <w:tcW w:type="dxa" w:w="1080"/>
+          </w:tcPr>
+          <w:p>
+            <w:r>
+              <w:t>0.037</w:t>
+            </w:r>
+          </w:p>
+        </w:tc>
+      </w:tr>
+    </w:tbl>
+    <w:p>
+      <w:pPr>
+        <w:spacing w:before="240"/>
+      </w:pPr>
+      <w:r/>
+      <w:r>
+        <w:rPr>
+          <w:i/>
+        </w:rPr>
+        <w:t>Table 5. Sensitivity to Z-to-X influence strength (n=2000, K=5, z=1.0, zx=0.2, 0.5, 1.0): means over 10 simulations.</w:t>
+      </w:r>
+      <w:r/>
+    </w:p>
+    <w:p>
+      <w:pPr>
+        <w:pStyle w:val="Heading2"/>
+      </w:pPr>
+      <w:r>
+        <w:t>Sensitivity to Z-to-Y effect strength</w:t>
+      </w:r>
+    </w:p>
+    <w:p>
+      <w:r>
+        <w:t xml:space="preserve">The Z-to-Y effect scale determines the magnitude of the hidden effect modification. Table 6 shows results for z effect scale = 0.5, 1.0 and 2.0. When effect modification was weak (z = 0.5), C1 and </w:t>
+      </w:r>
+      <m:oMath>
+        <m:sSub>
+          <m:e>
+            <m:r>
+              <m:t xml:space="preserve">W</m:t>
+            </m:r>
+          </m:e>
+          <m:sub>
+            <m:r>
+              <m:t xml:space="preserve">est</m:t>
+            </m:r>
+          </m:sub>
+        </m:sSub>
+      </m:oMath>
+      <w:r>
+        <w:t xml:space="preserve"> were close to their null values, reflecting limited detectable heterogeneity. As the effect increased, C1 decreased and </w:t>
+      </w:r>
+      <m:oMath>
+        <m:sSub>
+          <m:e>
+            <m:r>
+              <m:t xml:space="preserve">W</m:t>
+            </m:r>
+          </m:e>
+          <m:sub>
+            <m:r>
+              <m:t xml:space="preserve">est</m:t>
+            </m:r>
+          </m:sub>
+        </m:sSub>
+      </m:oMath>
+      <w:r>
+        <w:t xml:space="preserve"> increased for most methods, and the relative random-effects bias reduction improved for all leading approaches. The outcome-residual approach already produced a substantial relative bias reduction at z = 0.5, suggesting that it can exploit the moderate covariate trace even when the marginal modification signal is weak. Overall, the diagnostics are most informative when hidden effect modification is strong enough to bias the marginal ATE.</w:t>
+      </w:r>
+    </w:p>
+    <w:tbl>
+      <w:tblPr>
+        <w:tblStyle w:val="TableGrid"/>
+        <w:tblW w:type="auto" w:w="0"/>
+        <w:tblLook w:firstColumn="1" w:firstRow="1" w:lastColumn="0" w:lastRow="0" w:noHBand="0" w:noVBand="1" w:val="04A0"/>
+      </w:tblPr>
+      <w:tblGrid>
+        <w:gridCol w:w="1080"/>
+        <w:gridCol w:w="1080"/>
+        <w:gridCol w:w="1080"/>
+        <w:gridCol w:w="1080"/>
+        <w:gridCol w:w="1080"/>
+        <w:gridCol w:w="1080"/>
+        <w:gridCol w:w="1080"/>
+        <w:gridCol w:w="1080"/>
+      </w:tblGrid>
+      <w:tr>
+        <w:tc>
+          <w:tcPr>
+            <w:tcW w:type="dxa" w:w="1080"/>
+          </w:tcPr>
+          <w:p>
+            <w:r>
+              <w:rPr>
+                <w:b/>
+              </w:rPr>
+              <w:t>Condition</w:t>
+            </w:r>
+          </w:p>
+        </w:tc>
+        <w:tc>
+          <w:tcPr>
+            <w:tcW w:type="dxa" w:w="1080"/>
+          </w:tcPr>
+          <w:p>
+            <w:r>
+              <w:rPr>
+                <w:b/>
+              </w:rPr>
+              <w:t>Method</w:t>
+            </w:r>
+          </w:p>
+        </w:tc>
+        <w:tc>
+          <w:tcPr>
+            <w:tcW w:type="dxa" w:w="1080"/>
+          </w:tcPr>
+          <w:p>
+            <w:r>
+              <w:rPr>
+                <w:b/>
+              </w:rPr>
+              <w:t>ARI</w:t>
+            </w:r>
+          </w:p>
+        </w:tc>
+        <w:tc>
+          <w:tcPr>
+            <w:tcW w:type="dxa" w:w="1080"/>
+          </w:tcPr>
+          <w:p>
+            <w:r>
+              <w:rPr>
+                <w:b/>
+              </w:rPr>
+              <w:t>C1</w:t>
+            </w:r>
+          </w:p>
+        </w:tc>
+        <w:tc>
+          <w:tcPr>
+            <w:tcW w:type="dxa" w:w="1080"/>
+          </w:tcPr>
+          <w:p>
+            <m:oMath>
+              <m:sSub>
+                <m:e>
+                  <m:r>
+                    <m:t xml:space="preserve">W</m:t>
+                  </m:r>
+                </m:e>
+                <m:sub>
+                  <m:r>
+                    <m:t xml:space="preserve">est</m:t>
+                  </m:r>
+                </m:sub>
+              </m:sSub>
+            </m:oMath>
+          </w:p>
+        </w:tc>
+        <w:tc>
+          <w:tcPr>
+            <w:tcW w:type="dxa" w:w="1080"/>
+          </w:tcPr>
+          <w:p>
+            <w:r>
+              <w:rPr>
+                <w:b/>
+              </w:rPr>
+              <w:t>RE bias</w:t>
+            </w:r>
+          </w:p>
+        </w:tc>
+        <w:tc>
+          <w:tcPr>
+            <w:tcW w:type="dxa" w:w="1080"/>
+          </w:tcPr>
+          <w:p>
+            <w:r>
+              <w:rPr>
+                <w:b/>
+              </w:rPr>
+              <w:t>Rel reduction RE</w:t>
+            </w:r>
+          </w:p>
+        </w:tc>
+        <w:tc>
+          <w:tcPr>
+            <w:tcW w:type="dxa" w:w="1080"/>
+          </w:tcPr>
+          <w:p>
+            <w:r>
+              <w:rPr>
+                <w:b/>
+              </w:rPr>
+              <w:t>RE I2</w:t>
+            </w:r>
+          </w:p>
+        </w:tc>
+      </w:tr>
+      <w:tr>
+        <w:tc>
+          <w:tcPr>
+            <w:tcW w:type="dxa" w:w="1080"/>
+          </w:tcPr>
+          <w:p>
+            <w:r>
+              <w:t>z=0.5</w:t>
+            </w:r>
+          </w:p>
+        </w:tc>
+        <w:tc>
+          <w:tcPr>
+            <w:tcW w:type="dxa" w:w="1080"/>
+          </w:tcPr>
+          <w:p>
+            <w:r>
+              <w:t>1B_residual</w:t>
+            </w:r>
+          </w:p>
+        </w:tc>
+        <w:tc>
+          <w:tcPr>
+            <w:tcW w:type="dxa" w:w="1080"/>
+          </w:tcPr>
+          <w:p>
+            <w:r>
+              <w:t>0.027</w:t>
+            </w:r>
+          </w:p>
+        </w:tc>
+        <w:tc>
+          <w:tcPr>
+            <w:tcW w:type="dxa" w:w="1080"/>
+          </w:tcPr>
+          <w:p>
+            <w:r>
+              <w:t>1.000</w:t>
+            </w:r>
+          </w:p>
+        </w:tc>
+        <w:tc>
+          <w:tcPr>
+            <w:tcW w:type="dxa" w:w="1080"/>
+          </w:tcPr>
+          <w:p>
+            <w:r>
+              <w:t>0.039</w:t>
+            </w:r>
+          </w:p>
+        </w:tc>
+        <w:tc>
+          <w:tcPr>
+            <w:tcW w:type="dxa" w:w="1080"/>
+          </w:tcPr>
+          <w:p>
+            <w:r>
+              <w:t>0.00959</w:t>
+            </w:r>
+          </w:p>
+        </w:tc>
+        <w:tc>
+          <w:tcPr>
+            <w:tcW w:type="dxa" w:w="1080"/>
+          </w:tcPr>
+          <w:p>
+            <w:r>
+              <w:t>0.578</w:t>
+            </w:r>
+          </w:p>
+        </w:tc>
+        <w:tc>
+          <w:tcPr>
+            <w:tcW w:type="dxa" w:w="1080"/>
+          </w:tcPr>
+          <w:p>
+            <w:r>
+              <w:t>0.002</w:t>
+            </w:r>
+          </w:p>
+        </w:tc>
+      </w:tr>
+      <w:tr>
+        <w:tc>
+          <w:tcPr>
+            <w:tcW w:type="dxa" w:w="1080"/>
+          </w:tcPr>
+          <w:p>
+            <w:r>
+              <w:t>z=0.5</w:t>
+            </w:r>
+          </w:p>
+        </w:tc>
+        <w:tc>
+          <w:tcPr>
+            <w:tcW w:type="dxa" w:w="1080"/>
+          </w:tcPr>
+          <w:p>
+            <w:r>
+              <w:t>PS_propensity_score</w:t>
+            </w:r>
+          </w:p>
+        </w:tc>
+        <w:tc>
+          <w:tcPr>
+            <w:tcW w:type="dxa" w:w="1080"/>
+          </w:tcPr>
+          <w:p>
+            <w:r>
+              <w:t>0.012</w:t>
+            </w:r>
+          </w:p>
+        </w:tc>
+        <w:tc>
+          <w:tcPr>
+            <w:tcW w:type="dxa" w:w="1080"/>
+          </w:tcPr>
+          <w:p>
+            <w:r>
+              <w:t>0.841</w:t>
+            </w:r>
+          </w:p>
+        </w:tc>
+        <w:tc>
+          <w:tcPr>
+            <w:tcW w:type="dxa" w:w="1080"/>
+          </w:tcPr>
+          <w:p>
+            <w:r>
+              <w:t>0.068</w:t>
+            </w:r>
+          </w:p>
+        </w:tc>
+        <w:tc>
+          <w:tcPr>
+            <w:tcW w:type="dxa" w:w="1080"/>
+          </w:tcPr>
+          <w:p>
+            <w:r>
+              <w:t>0.02281</w:t>
+            </w:r>
+          </w:p>
+        </w:tc>
+        <w:tc>
+          <w:tcPr>
+            <w:tcW w:type="dxa" w:w="1080"/>
+          </w:tcPr>
+          <w:p>
+            <w:r>
+              <w:t>-0.003</w:t>
+            </w:r>
+          </w:p>
+        </w:tc>
+        <w:tc>
+          <w:tcPr>
+            <w:tcW w:type="dxa" w:w="1080"/>
+          </w:tcPr>
+          <w:p>
+            <w:r>
+              <w:t>0.210</w:t>
+            </w:r>
+          </w:p>
+        </w:tc>
+      </w:tr>
+      <w:tr>
+        <w:tc>
+          <w:tcPr>
+            <w:tcW w:type="dxa" w:w="1080"/>
+          </w:tcPr>
+          <w:p>
+            <w:r>
+              <w:t>z=0.5</w:t>
+            </w:r>
+          </w:p>
+        </w:tc>
+        <w:tc>
+          <w:tcPr>
+            <w:tcW w:type="dxa" w:w="1080"/>
+          </w:tcPr>
+          <w:p>
+            <w:r>
+              <w:t>GMM</w:t>
+            </w:r>
+          </w:p>
+        </w:tc>
+        <w:tc>
+          <w:tcPr>
+            <w:tcW w:type="dxa" w:w="1080"/>
+          </w:tcPr>
+          <w:p>
+            <w:r>
+              <w:t>0.006</w:t>
+            </w:r>
+          </w:p>
+        </w:tc>
+        <w:tc>
+          <w:tcPr>
+            <w:tcW w:type="dxa" w:w="1080"/>
+          </w:tcPr>
+          <w:p>
+            <w:r>
+              <w:t>0.948</w:t>
+            </w:r>
+          </w:p>
+        </w:tc>
+        <w:tc>
+          <w:tcPr>
+            <w:tcW w:type="dxa" w:w="1080"/>
+          </w:tcPr>
+          <w:p>
+            <w:r>
+              <w:t>0.075</w:t>
+            </w:r>
+          </w:p>
+        </w:tc>
+        <w:tc>
+          <w:tcPr>
+            <w:tcW w:type="dxa" w:w="1080"/>
+          </w:tcPr>
+          <w:p>
+            <w:r>
+              <w:t>0.02043</w:t>
+            </w:r>
+          </w:p>
+        </w:tc>
+        <w:tc>
+          <w:tcPr>
+            <w:tcW w:type="dxa" w:w="1080"/>
+          </w:tcPr>
+          <w:p>
+            <w:r>
+              <w:t>0.102</w:t>
+            </w:r>
+          </w:p>
+        </w:tc>
+        <w:tc>
+          <w:tcPr>
+            <w:tcW w:type="dxa" w:w="1080"/>
+          </w:tcPr>
+          <w:p>
+            <w:r>
+              <w:t>0.047</w:t>
+            </w:r>
+          </w:p>
+        </w:tc>
+      </w:tr>
+      <w:tr>
+        <w:tc>
+          <w:tcPr>
+            <w:tcW w:type="dxa" w:w="1080"/>
+          </w:tcPr>
+          <w:p>
+            <w:r>
+              <w:t>z=0.5</w:t>
+            </w:r>
+          </w:p>
+        </w:tc>
+        <w:tc>
+          <w:tcPr>
+            <w:tcW w:type="dxa" w:w="1080"/>
+          </w:tcPr>
+          <w:p>
+            <w:r>
+              <w:t>Prognostic_score</w:t>
+            </w:r>
+          </w:p>
+        </w:tc>
+        <w:tc>
+          <w:tcPr>
+            <w:tcW w:type="dxa" w:w="1080"/>
+          </w:tcPr>
+          <w:p>
+            <w:r>
+              <w:t>0.024</w:t>
+            </w:r>
+          </w:p>
+        </w:tc>
+        <w:tc>
+          <w:tcPr>
+            <w:tcW w:type="dxa" w:w="1080"/>
+          </w:tcPr>
+          <w:p>
+            <w:r>
+              <w:t>0.908</w:t>
+            </w:r>
+          </w:p>
+        </w:tc>
+        <w:tc>
+          <w:tcPr>
+            <w:tcW w:type="dxa" w:w="1080"/>
+          </w:tcPr>
+          <w:p>
+            <w:r>
+              <w:t>0.058</w:t>
+            </w:r>
+          </w:p>
+        </w:tc>
+        <w:tc>
+          <w:tcPr>
+            <w:tcW w:type="dxa" w:w="1080"/>
+          </w:tcPr>
+          <w:p>
+            <w:r>
+              <w:t>0.02073</w:t>
+            </w:r>
+          </w:p>
+        </w:tc>
+        <w:tc>
+          <w:tcPr>
+            <w:tcW w:type="dxa" w:w="1080"/>
+          </w:tcPr>
+          <w:p>
+            <w:r>
+              <w:t>0.089</w:t>
+            </w:r>
+          </w:p>
+        </w:tc>
+        <w:tc>
+          <w:tcPr>
+            <w:tcW w:type="dxa" w:w="1080"/>
+          </w:tcPr>
+          <w:p>
+            <w:r>
+              <w:t>0.101</w:t>
+            </w:r>
+          </w:p>
+        </w:tc>
+      </w:tr>
+      <w:tr>
+        <w:tc>
+          <w:tcPr>
+            <w:tcW w:type="dxa" w:w="1080"/>
+          </w:tcPr>
+          <w:p>
+            <w:r>
+              <w:t>z=0.5</w:t>
+            </w:r>
+          </w:p>
+        </w:tc>
+        <w:tc>
+          <w:tcPr>
+            <w:tcW w:type="dxa" w:w="1080"/>
+          </w:tcPr>
+          <w:p>
+            <w:r>
+              <w:t>2B_clustering</w:t>
+            </w:r>
+          </w:p>
+        </w:tc>
+        <w:tc>
+          <w:tcPr>
+            <w:tcW w:type="dxa" w:w="1080"/>
+          </w:tcPr>
+          <w:p>
+            <w:r>
+              <w:t>0.024</w:t>
+            </w:r>
+          </w:p>
+        </w:tc>
+        <w:tc>
+          <w:tcPr>
+            <w:tcW w:type="dxa" w:w="1080"/>
+          </w:tcPr>
+          <w:p>
+            <w:r>
+              <w:t>0.857</w:t>
+            </w:r>
+          </w:p>
+        </w:tc>
+        <w:tc>
+          <w:tcPr>
+            <w:tcW w:type="dxa" w:w="1080"/>
+          </w:tcPr>
+          <w:p>
+            <w:r>
+              <w:t>0.112</w:t>
+            </w:r>
+          </w:p>
+        </w:tc>
+        <w:tc>
+          <w:tcPr>
+            <w:tcW w:type="dxa" w:w="1080"/>
+          </w:tcPr>
+          <w:p>
+            <w:r>
+              <w:t>0.02072</w:t>
+            </w:r>
+          </w:p>
+        </w:tc>
+        <w:tc>
+          <w:tcPr>
+            <w:tcW w:type="dxa" w:w="1080"/>
+          </w:tcPr>
+          <w:p>
+            <w:r>
+              <w:t>0.089</w:t>
+            </w:r>
+          </w:p>
+        </w:tc>
+        <w:tc>
+          <w:tcPr>
+            <w:tcW w:type="dxa" w:w="1080"/>
+          </w:tcPr>
+          <w:p>
+            <w:r>
+              <w:t>0.138</w:t>
+            </w:r>
+          </w:p>
+        </w:tc>
+      </w:tr>
+      <w:tr>
+        <w:tc>
+          <w:tcPr>
+            <w:tcW w:type="dxa" w:w="1080"/>
+          </w:tcPr>
+          <w:p>
+            <w:r>
+              <w:t>z=1.0</w:t>
+            </w:r>
+          </w:p>
+        </w:tc>
+        <w:tc>
+          <w:tcPr>
+            <w:tcW w:type="dxa" w:w="1080"/>
+          </w:tcPr>
+          <w:p>
+            <w:r>
+              <w:t>1B_residual</w:t>
+            </w:r>
+          </w:p>
+        </w:tc>
+        <w:tc>
+          <w:tcPr>
+            <w:tcW w:type="dxa" w:w="1080"/>
+          </w:tcPr>
+          <w:p>
+            <w:r>
+              <w:t>0.032</w:t>
+            </w:r>
+          </w:p>
+        </w:tc>
+        <w:tc>
+          <w:tcPr>
+            <w:tcW w:type="dxa" w:w="1080"/>
+          </w:tcPr>
+          <w:p>
+            <w:r>
+              <w:t>0.976</w:t>
+            </w:r>
+          </w:p>
+        </w:tc>
+        <w:tc>
+          <w:tcPr>
+            <w:tcW w:type="dxa" w:w="1080"/>
+          </w:tcPr>
+          <w:p>
+            <w:r>
+              <w:t>0.064</w:t>
+            </w:r>
+          </w:p>
+        </w:tc>
+        <w:tc>
+          <w:tcPr>
+            <w:tcW w:type="dxa" w:w="1080"/>
+          </w:tcPr>
+          <w:p>
+            <w:r>
+              <w:t>0.00852</w:t>
+            </w:r>
+          </w:p>
+        </w:tc>
+        <w:tc>
+          <w:tcPr>
+            <w:tcW w:type="dxa" w:w="1080"/>
+          </w:tcPr>
+          <w:p>
+            <w:r>
+              <w:t>0.602</w:t>
+            </w:r>
+          </w:p>
+        </w:tc>
+        <w:tc>
+          <w:tcPr>
+            <w:tcW w:type="dxa" w:w="1080"/>
+          </w:tcPr>
+          <w:p>
+            <w:r>
+              <w:t>0.000</w:t>
+            </w:r>
+          </w:p>
+        </w:tc>
+      </w:tr>
+      <w:tr>
+        <w:tc>
+          <w:tcPr>
+            <w:tcW w:type="dxa" w:w="1080"/>
+          </w:tcPr>
+          <w:p>
+            <w:r>
+              <w:t>z=1.0</w:t>
+            </w:r>
+          </w:p>
+        </w:tc>
+        <w:tc>
+          <w:tcPr>
+            <w:tcW w:type="dxa" w:w="1080"/>
+          </w:tcPr>
+          <w:p>
+            <w:r>
+              <w:t>PS_propensity_score</w:t>
+            </w:r>
+          </w:p>
+        </w:tc>
+        <w:tc>
+          <w:tcPr>
+            <w:tcW w:type="dxa" w:w="1080"/>
+          </w:tcPr>
+          <w:p>
+            <w:r>
+              <w:t>0.007</w:t>
+            </w:r>
+          </w:p>
+        </w:tc>
+        <w:tc>
+          <w:tcPr>
+            <w:tcW w:type="dxa" w:w="1080"/>
+          </w:tcPr>
+          <w:p>
+            <w:r>
+              <w:t>0.828</w:t>
+            </w:r>
+          </w:p>
+        </w:tc>
+        <w:tc>
+          <w:tcPr>
+            <w:tcW w:type="dxa" w:w="1080"/>
+          </w:tcPr>
+          <w:p>
+            <w:r>
+              <w:t>0.080</w:t>
+            </w:r>
+          </w:p>
+        </w:tc>
+        <w:tc>
+          <w:tcPr>
+            <w:tcW w:type="dxa" w:w="1080"/>
+          </w:tcPr>
+          <w:p>
+            <w:r>
+              <w:t>0.02162</w:t>
+            </w:r>
+          </w:p>
+        </w:tc>
+        <w:tc>
+          <w:tcPr>
+            <w:tcW w:type="dxa" w:w="1080"/>
+          </w:tcPr>
+          <w:p>
+            <w:r>
+              <w:t>-0.011</w:t>
+            </w:r>
+          </w:p>
+        </w:tc>
+        <w:tc>
+          <w:tcPr>
+            <w:tcW w:type="dxa" w:w="1080"/>
+          </w:tcPr>
+          <w:p>
+            <w:r>
+              <w:t>0.189</w:t>
+            </w:r>
+          </w:p>
+        </w:tc>
+      </w:tr>
+      <w:tr>
+        <w:tc>
+          <w:tcPr>
+            <w:tcW w:type="dxa" w:w="1080"/>
+          </w:tcPr>
+          <w:p>
+            <w:r>
+              <w:t>z=1.0</w:t>
+            </w:r>
+          </w:p>
+        </w:tc>
+        <w:tc>
+          <w:tcPr>
+            <w:tcW w:type="dxa" w:w="1080"/>
+          </w:tcPr>
+          <w:p>
+            <w:r>
+              <w:t>GMM</w:t>
+            </w:r>
+          </w:p>
+        </w:tc>
+        <w:tc>
+          <w:tcPr>
+            <w:tcW w:type="dxa" w:w="1080"/>
+          </w:tcPr>
+          <w:p>
+            <w:r>
+              <w:t>0.006</w:t>
+            </w:r>
+          </w:p>
+        </w:tc>
+        <w:tc>
+          <w:tcPr>
+            <w:tcW w:type="dxa" w:w="1080"/>
+          </w:tcPr>
+          <w:p>
+            <w:r>
+              <w:t>0.956</w:t>
+            </w:r>
+          </w:p>
+        </w:tc>
+        <w:tc>
+          <w:tcPr>
+            <w:tcW w:type="dxa" w:w="1080"/>
+          </w:tcPr>
+          <w:p>
+            <w:r>
+              <w:t>0.057</w:t>
+            </w:r>
+          </w:p>
+        </w:tc>
+        <w:tc>
+          <w:tcPr>
+            <w:tcW w:type="dxa" w:w="1080"/>
+          </w:tcPr>
+          <w:p>
+            <w:r>
+              <w:t>0.02180</w:t>
+            </w:r>
+          </w:p>
+        </w:tc>
+        <w:tc>
+          <w:tcPr>
+            <w:tcW w:type="dxa" w:w="1080"/>
+          </w:tcPr>
+          <w:p>
+            <w:r>
+              <w:t>-0.020</w:t>
+            </w:r>
+          </w:p>
+        </w:tc>
+        <w:tc>
+          <w:tcPr>
+            <w:tcW w:type="dxa" w:w="1080"/>
+          </w:tcPr>
+          <w:p>
+            <w:r>
+              <w:t>0.074</w:t>
+            </w:r>
+          </w:p>
+        </w:tc>
+      </w:tr>
+      <w:tr>
+        <w:tc>
+          <w:tcPr>
+            <w:tcW w:type="dxa" w:w="1080"/>
+          </w:tcPr>
+          <w:p>
+            <w:r>
+              <w:t>z=1.0</w:t>
+            </w:r>
+          </w:p>
+        </w:tc>
+        <w:tc>
+          <w:tcPr>
+            <w:tcW w:type="dxa" w:w="1080"/>
+          </w:tcPr>
+          <w:p>
+            <w:r>
+              <w:t>Prognostic_score</w:t>
+            </w:r>
+          </w:p>
+        </w:tc>
+        <w:tc>
+          <w:tcPr>
+            <w:tcW w:type="dxa" w:w="1080"/>
+          </w:tcPr>
+          <w:p>
+            <w:r>
+              <w:t>0.025</w:t>
+            </w:r>
+          </w:p>
+        </w:tc>
+        <w:tc>
+          <w:tcPr>
+            <w:tcW w:type="dxa" w:w="1080"/>
+          </w:tcPr>
+          <w:p>
+            <w:r>
+              <w:t>0.905</w:t>
+            </w:r>
+          </w:p>
+        </w:tc>
+        <w:tc>
+          <w:tcPr>
+            <w:tcW w:type="dxa" w:w="1080"/>
+          </w:tcPr>
+          <w:p>
+            <w:r>
+              <w:t>0.080</w:t>
+            </w:r>
+          </w:p>
+        </w:tc>
+        <w:tc>
+          <w:tcPr>
+            <w:tcW w:type="dxa" w:w="1080"/>
+          </w:tcPr>
+          <w:p>
+            <w:r>
+              <w:t>0.01536</w:t>
+            </w:r>
+          </w:p>
+        </w:tc>
+        <w:tc>
+          <w:tcPr>
+            <w:tcW w:type="dxa" w:w="1080"/>
+          </w:tcPr>
+          <w:p>
+            <w:r>
+              <w:t>0.281</w:t>
+            </w:r>
+          </w:p>
+        </w:tc>
+        <w:tc>
+          <w:tcPr>
+            <w:tcW w:type="dxa" w:w="1080"/>
+          </w:tcPr>
+          <w:p>
+            <w:r>
+              <w:t>0.141</w:t>
+            </w:r>
+          </w:p>
+        </w:tc>
+      </w:tr>
+      <w:tr>
+        <w:tc>
+          <w:tcPr>
+            <w:tcW w:type="dxa" w:w="1080"/>
+          </w:tcPr>
+          <w:p>
+            <w:r>
+              <w:t>z=1.0</w:t>
+            </w:r>
+          </w:p>
+        </w:tc>
+        <w:tc>
+          <w:tcPr>
+            <w:tcW w:type="dxa" w:w="1080"/>
+          </w:tcPr>
+          <w:p>
+            <w:r>
+              <w:t>2B_clustering</w:t>
+            </w:r>
+          </w:p>
+        </w:tc>
+        <w:tc>
+          <w:tcPr>
+            <w:tcW w:type="dxa" w:w="1080"/>
+          </w:tcPr>
+          <w:p>
+            <w:r>
+              <w:t>0.022</w:t>
+            </w:r>
+          </w:p>
+        </w:tc>
+        <w:tc>
+          <w:tcPr>
+            <w:tcW w:type="dxa" w:w="1080"/>
+          </w:tcPr>
+          <w:p>
+            <w:r>
+              <w:t>0.914</w:t>
+            </w:r>
+          </w:p>
+        </w:tc>
+        <w:tc>
+          <w:tcPr>
+            <w:tcW w:type="dxa" w:w="1080"/>
+          </w:tcPr>
+          <w:p>
+            <w:r>
+              <w:t>0.108</w:t>
+            </w:r>
+          </w:p>
+        </w:tc>
+        <w:tc>
+          <w:tcPr>
+            <w:tcW w:type="dxa" w:w="1080"/>
+          </w:tcPr>
+          <w:p>
+            <w:r>
+              <w:t>0.02077</w:t>
+            </w:r>
+          </w:p>
+        </w:tc>
+        <w:tc>
+          <w:tcPr>
+            <w:tcW w:type="dxa" w:w="1080"/>
+          </w:tcPr>
+          <w:p>
+            <w:r>
+              <w:t>0.028</w:t>
+            </w:r>
+          </w:p>
+        </w:tc>
+        <w:tc>
+          <w:tcPr>
+            <w:tcW w:type="dxa" w:w="1080"/>
+          </w:tcPr>
+          <w:p>
+            <w:r>
+              <w:t>0.037</w:t>
+            </w:r>
+          </w:p>
+        </w:tc>
+      </w:tr>
+      <w:tr>
+        <w:tc>
+          <w:tcPr>
+            <w:tcW w:type="dxa" w:w="1080"/>
+          </w:tcPr>
+          <w:p>
+            <w:r>
+              <w:t>z=2.0</w:t>
+            </w:r>
+          </w:p>
+        </w:tc>
+        <w:tc>
+          <w:tcPr>
+            <w:tcW w:type="dxa" w:w="1080"/>
+          </w:tcPr>
+          <w:p>
+            <w:r>
+              <w:t>1B_residual</w:t>
+            </w:r>
+          </w:p>
+        </w:tc>
+        <w:tc>
+          <w:tcPr>
+            <w:tcW w:type="dxa" w:w="1080"/>
+          </w:tcPr>
+          <w:p>
+            <w:r>
+              <w:t>0.035</w:t>
+            </w:r>
+          </w:p>
+        </w:tc>
+        <w:tc>
+          <w:tcPr>
+            <w:tcW w:type="dxa" w:w="1080"/>
+          </w:tcPr>
+          <w:p>
+            <w:r>
+              <w:t>0.921</w:t>
+            </w:r>
+          </w:p>
+        </w:tc>
+        <w:tc>
+          <w:tcPr>
+            <w:tcW w:type="dxa" w:w="1080"/>
+          </w:tcPr>
+          <w:p>
+            <w:r>
+              <w:t>0.062</w:t>
+            </w:r>
+          </w:p>
+        </w:tc>
+        <w:tc>
+          <w:tcPr>
+            <w:tcW w:type="dxa" w:w="1080"/>
+          </w:tcPr>
+          <w:p>
+            <w:r>
+              <w:t>0.00498</w:t>
+            </w:r>
+          </w:p>
+        </w:tc>
+        <w:tc>
+          <w:tcPr>
+            <w:tcW w:type="dxa" w:w="1080"/>
+          </w:tcPr>
+          <w:p>
+            <w:r>
+              <w:t>0.807</w:t>
+            </w:r>
+          </w:p>
+        </w:tc>
+        <w:tc>
+          <w:tcPr>
+            <w:tcW w:type="dxa" w:w="1080"/>
+          </w:tcPr>
+          <w:p>
+            <w:r>
+              <w:t>0.007</w:t>
+            </w:r>
+          </w:p>
+        </w:tc>
+      </w:tr>
+      <w:tr>
+        <w:tc>
+          <w:tcPr>
+            <w:tcW w:type="dxa" w:w="1080"/>
+          </w:tcPr>
+          <w:p>
+            <w:r>
+              <w:t>z=2.0</w:t>
+            </w:r>
+          </w:p>
+        </w:tc>
+        <w:tc>
+          <w:tcPr>
+            <w:tcW w:type="dxa" w:w="1080"/>
+          </w:tcPr>
+          <w:p>
+            <w:r>
+              <w:t>PS_propensity_score</w:t>
+            </w:r>
+          </w:p>
+        </w:tc>
+        <w:tc>
+          <w:tcPr>
+            <w:tcW w:type="dxa" w:w="1080"/>
+          </w:tcPr>
+          <w:p>
+            <w:r>
+              <w:t>0.009</w:t>
+            </w:r>
+          </w:p>
+        </w:tc>
+        <w:tc>
+          <w:tcPr>
+            <w:tcW w:type="dxa" w:w="1080"/>
+          </w:tcPr>
+          <w:p>
+            <w:r>
+              <w:t>0.975</w:t>
+            </w:r>
+          </w:p>
+        </w:tc>
+        <w:tc>
+          <w:tcPr>
+            <w:tcW w:type="dxa" w:w="1080"/>
+          </w:tcPr>
+          <w:p>
+            <w:r>
+              <w:t>0.072</w:t>
+            </w:r>
+          </w:p>
+        </w:tc>
+        <w:tc>
+          <w:tcPr>
+            <w:tcW w:type="dxa" w:w="1080"/>
+          </w:tcPr>
+          <w:p>
+            <w:r>
+              <w:t>0.01613</w:t>
+            </w:r>
+          </w:p>
+        </w:tc>
+        <w:tc>
+          <w:tcPr>
+            <w:tcW w:type="dxa" w:w="1080"/>
+          </w:tcPr>
+          <w:p>
+            <w:r>
+              <w:t>0.376</w:t>
+            </w:r>
+          </w:p>
+        </w:tc>
+        <w:tc>
+          <w:tcPr>
+            <w:tcW w:type="dxa" w:w="1080"/>
+          </w:tcPr>
+          <w:p>
+            <w:r>
+              <w:t>0.069</w:t>
+            </w:r>
+          </w:p>
+        </w:tc>
+      </w:tr>
+      <w:tr>
+        <w:tc>
+          <w:tcPr>
+            <w:tcW w:type="dxa" w:w="1080"/>
+          </w:tcPr>
+          <w:p>
+            <w:r>
+              <w:t>z=2.0</w:t>
+            </w:r>
+          </w:p>
+        </w:tc>
+        <w:tc>
+          <w:tcPr>
+            <w:tcW w:type="dxa" w:w="1080"/>
+          </w:tcPr>
+          <w:p>
+            <w:r>
+              <w:t>GMM</w:t>
+            </w:r>
+          </w:p>
+        </w:tc>
+        <w:tc>
+          <w:tcPr>
+            <w:tcW w:type="dxa" w:w="1080"/>
+          </w:tcPr>
+          <w:p>
+            <w:r>
+              <w:t>0.004</w:t>
+            </w:r>
+          </w:p>
+        </w:tc>
+        <w:tc>
+          <w:tcPr>
+            <w:tcW w:type="dxa" w:w="1080"/>
+          </w:tcPr>
+          <w:p>
+            <w:r>
+              <w:t>0.925</w:t>
+            </w:r>
+          </w:p>
+        </w:tc>
+        <w:tc>
+          <w:tcPr>
+            <w:tcW w:type="dxa" w:w="1080"/>
+          </w:tcPr>
+          <w:p>
+            <w:r>
+              <w:t>0.062</w:t>
+            </w:r>
+          </w:p>
+        </w:tc>
+        <w:tc>
+          <w:tcPr>
+            <w:tcW w:type="dxa" w:w="1080"/>
+          </w:tcPr>
+          <w:p>
+            <w:r>
+              <w:t>0.01914</w:t>
+            </w:r>
+          </w:p>
+        </w:tc>
+        <w:tc>
+          <w:tcPr>
+            <w:tcW w:type="dxa" w:w="1080"/>
+          </w:tcPr>
+          <w:p>
+            <w:r>
+              <w:t>0.259</w:t>
+            </w:r>
+          </w:p>
+        </w:tc>
+        <w:tc>
+          <w:tcPr>
+            <w:tcW w:type="dxa" w:w="1080"/>
+          </w:tcPr>
+          <w:p>
+            <w:r>
+              <w:t>0.101</w:t>
+            </w:r>
+          </w:p>
+        </w:tc>
+      </w:tr>
+      <w:tr>
+        <w:tc>
+          <w:tcPr>
+            <w:tcW w:type="dxa" w:w="1080"/>
+          </w:tcPr>
+          <w:p>
+            <w:r>
+              <w:t>z=2.0</w:t>
+            </w:r>
+          </w:p>
+        </w:tc>
+        <w:tc>
+          <w:tcPr>
+            <w:tcW w:type="dxa" w:w="1080"/>
+          </w:tcPr>
+          <w:p>
+            <w:r>
+              <w:t>Prognostic_score</w:t>
+            </w:r>
+          </w:p>
+        </w:tc>
+        <w:tc>
+          <w:tcPr>
+            <w:tcW w:type="dxa" w:w="1080"/>
+          </w:tcPr>
+          <w:p>
+            <w:r>
+              <w:t>0.027</w:t>
+            </w:r>
+          </w:p>
+        </w:tc>
+        <w:tc>
+          <w:tcPr>
+            <w:tcW w:type="dxa" w:w="1080"/>
+          </w:tcPr>
+          <w:p>
+            <w:r>
+              <w:t>1.000</w:t>
+            </w:r>
+          </w:p>
+        </w:tc>
+        <w:tc>
+          <w:tcPr>
+            <w:tcW w:type="dxa" w:w="1080"/>
+          </w:tcPr>
+          <w:p>
+            <w:r>
+              <w:t>0.088</w:t>
+            </w:r>
+          </w:p>
+        </w:tc>
+        <w:tc>
+          <w:tcPr>
+            <w:tcW w:type="dxa" w:w="1080"/>
+          </w:tcPr>
+          <w:p>
+            <w:r>
+              <w:t>0.00855</w:t>
+            </w:r>
+          </w:p>
+        </w:tc>
+        <w:tc>
+          <w:tcPr>
+            <w:tcW w:type="dxa" w:w="1080"/>
+          </w:tcPr>
+          <w:p>
+            <w:r>
+              <w:t>0.669</w:t>
+            </w:r>
+          </w:p>
+        </w:tc>
+        <w:tc>
+          <w:tcPr>
+            <w:tcW w:type="dxa" w:w="1080"/>
+          </w:tcPr>
+          <w:p>
+            <w:r>
+              <w:t>0.039</w:t>
+            </w:r>
+          </w:p>
+        </w:tc>
+      </w:tr>
+      <w:tr>
+        <w:tc>
+          <w:tcPr>
+            <w:tcW w:type="dxa" w:w="1080"/>
+          </w:tcPr>
+          <w:p>
+            <w:r>
+              <w:t>z=2.0</w:t>
+            </w:r>
+          </w:p>
+        </w:tc>
+        <w:tc>
+          <w:tcPr>
+            <w:tcW w:type="dxa" w:w="1080"/>
+          </w:tcPr>
+          <w:p>
+            <w:r>
+              <w:t>2B_clustering</w:t>
+            </w:r>
+          </w:p>
+        </w:tc>
+        <w:tc>
+          <w:tcPr>
+            <w:tcW w:type="dxa" w:w="1080"/>
+          </w:tcPr>
+          <w:p>
+            <w:r>
+              <w:t>0.022</w:t>
+            </w:r>
+          </w:p>
+        </w:tc>
+        <w:tc>
+          <w:tcPr>
+            <w:tcW w:type="dxa" w:w="1080"/>
+          </w:tcPr>
+          <w:p>
+            <w:r>
+              <w:t>0.900</w:t>
+            </w:r>
+          </w:p>
+        </w:tc>
+        <w:tc>
+          <w:tcPr>
+            <w:tcW w:type="dxa" w:w="1080"/>
+          </w:tcPr>
+          <w:p>
+            <w:r>
+              <w:t>0.063</w:t>
+            </w:r>
+          </w:p>
+        </w:tc>
+        <w:tc>
+          <w:tcPr>
+            <w:tcW w:type="dxa" w:w="1080"/>
+          </w:tcPr>
+          <w:p>
+            <w:r>
+              <w:t>0.01606</w:t>
+            </w:r>
+          </w:p>
+        </w:tc>
+        <w:tc>
+          <w:tcPr>
+            <w:tcW w:type="dxa" w:w="1080"/>
+          </w:tcPr>
+          <w:p>
+            <w:r>
+              <w:t>0.379</w:t>
+            </w:r>
+          </w:p>
+        </w:tc>
+        <w:tc>
+          <w:tcPr>
+            <w:tcW w:type="dxa" w:w="1080"/>
+          </w:tcPr>
+          <w:p>
+            <w:r>
+              <w:t>0.163</w:t>
+            </w:r>
+          </w:p>
+        </w:tc>
+      </w:tr>
+    </w:tbl>
+    <w:p>
+      <w:pPr>
+        <w:spacing w:before="240"/>
+      </w:pPr>
+      <w:r/>
+      <w:r>
+        <w:rPr>
+          <w:i/>
+        </w:rPr>
+        <w:t>Table 6. Sensitivity to Z-to-Y effect strength (n=2000, K=5, zx=1.0, z=0.5, 1.0, 2.0): means over 10 simulations.</w:t>
+      </w:r>
+      <w:r/>
+    </w:p>
+    <w:p>
+      <w:pPr>
+        <w:pStyle w:val="Heading2"/>
+      </w:pPr>
+      <w:r>
+        <w:t>Robustness to non-linear Z-to-X mappings</w:t>
+      </w:r>
+    </w:p>
+    <w:p>
+      <w:r>
+        <w:t>In real applications the mapping from hidden modifiers to measured covariates need not be linear. We therefore repeated the primary scenario with a non-linear Z-to-X transformation that included a quadratic term and a log-normal scale transformation. Table 7 compares the random-effects bias under the linear and non-linear mappings for the leading methods, and Figure 5 displays the same comparison. The effect of non-linearity was method-dependent: the outcome-residual and clustering-based approaches achieved somewhat larger relative bias reductions under the transformed mapping, the propensity-score and GMM approaches showed small improvements, and the prognostic-score approach showed a modest decline. No leading method was dramatically degraded by the transformation, indicating that the IONE diagnostics remain useful when measured covariates are non-linear functions of the hidden structure, although the relative ranking of methods can shift.</w:t>
+      </w:r>
+    </w:p>
+    <w:tbl>
+      <w:tblPr>
+        <w:tblStyle w:val="TableGrid"/>
+        <w:tblW w:type="auto" w:w="0"/>
+        <w:tblLook w:firstColumn="1" w:firstRow="1" w:lastColumn="0" w:lastRow="0" w:noHBand="0" w:noVBand="1" w:val="04A0"/>
+      </w:tblPr>
+      <w:tblGrid>
+        <w:gridCol w:w="1728"/>
+        <w:gridCol w:w="1728"/>
+        <w:gridCol w:w="1728"/>
+        <w:gridCol w:w="1728"/>
+        <w:gridCol w:w="1728"/>
+      </w:tblGrid>
+      <w:tr>
+        <w:tc>
+          <w:tcPr>
+            <w:tcW w:type="dxa" w:w="1728"/>
+          </w:tcPr>
+          <w:p>
+            <w:r>
+              <w:rPr>
+                <w:b/>
+              </w:rPr>
+              <w:t>Method</w:t>
+            </w:r>
+          </w:p>
+        </w:tc>
+        <w:tc>
+          <w:tcPr>
+            <w:tcW w:type="dxa" w:w="1728"/>
+          </w:tcPr>
+          <w:p>
+            <w:r>
+              <w:rPr>
+                <w:b/>
+              </w:rPr>
+              <w:t>Linear RE bias</w:t>
+            </w:r>
+          </w:p>
+        </w:tc>
+        <w:tc>
+          <w:tcPr>
+            <w:tcW w:type="dxa" w:w="1728"/>
+          </w:tcPr>
+          <w:p>
+            <w:r>
+              <w:rPr>
+                <w:b/>
+              </w:rPr>
+              <w:t>Linear rel reduction</w:t>
+            </w:r>
+          </w:p>
+        </w:tc>
+        <w:tc>
+          <w:tcPr>
+            <w:tcW w:type="dxa" w:w="1728"/>
+          </w:tcPr>
+          <w:p>
+            <w:r>
+              <w:rPr>
+                <w:b/>
+              </w:rPr>
+              <w:t>Non-linear RE bias</w:t>
+            </w:r>
+          </w:p>
+        </w:tc>
+        <w:tc>
+          <w:tcPr>
+            <w:tcW w:type="dxa" w:w="1728"/>
+          </w:tcPr>
+          <w:p>
+            <w:r>
+              <w:rPr>
+                <w:b/>
+              </w:rPr>
+              <w:t>Non-linear rel reduction</w:t>
+            </w:r>
+          </w:p>
+        </w:tc>
+      </w:tr>
+      <w:tr>
+        <w:tc>
+          <w:tcPr>
+            <w:tcW w:type="dxa" w:w="1728"/>
+          </w:tcPr>
+          <w:p>
+            <w:r>
+              <w:t>1B_residual</w:t>
+            </w:r>
+          </w:p>
+        </w:tc>
+        <w:tc>
+          <w:tcPr>
+            <w:tcW w:type="dxa" w:w="1728"/>
+          </w:tcPr>
+          <w:p>
+            <w:r>
+              <w:t>0.00852</w:t>
+            </w:r>
+          </w:p>
+        </w:tc>
+        <w:tc>
+          <w:tcPr>
+            <w:tcW w:type="dxa" w:w="1728"/>
+          </w:tcPr>
+          <w:p>
+            <w:r>
+              <w:t>0.602</w:t>
+            </w:r>
+          </w:p>
+        </w:tc>
+        <w:tc>
+          <w:tcPr>
+            <w:tcW w:type="dxa" w:w="1728"/>
+          </w:tcPr>
+          <w:p>
+            <w:r>
+              <w:t>0.00664</w:t>
+            </w:r>
+          </w:p>
+        </w:tc>
+        <w:tc>
+          <w:tcPr>
+            <w:tcW w:type="dxa" w:w="1728"/>
+          </w:tcPr>
+          <w:p>
+            <w:r>
+              <w:t>0.690</w:t>
+            </w:r>
+          </w:p>
+        </w:tc>
+      </w:tr>
+      <w:tr>
+        <w:tc>
+          <w:tcPr>
+            <w:tcW w:type="dxa" w:w="1728"/>
+          </w:tcPr>
+          <w:p>
+            <w:r>
+              <w:t>PS_propensity_score</w:t>
+            </w:r>
+          </w:p>
+        </w:tc>
+        <w:tc>
+          <w:tcPr>
+            <w:tcW w:type="dxa" w:w="1728"/>
+          </w:tcPr>
+          <w:p>
+            <w:r>
+              <w:t>0.02162</w:t>
+            </w:r>
+          </w:p>
+        </w:tc>
+        <w:tc>
+          <w:tcPr>
+            <w:tcW w:type="dxa" w:w="1728"/>
+          </w:tcPr>
+          <w:p>
+            <w:r>
+              <w:t>-0.011</w:t>
+            </w:r>
+          </w:p>
+        </w:tc>
+        <w:tc>
+          <w:tcPr>
+            <w:tcW w:type="dxa" w:w="1728"/>
+          </w:tcPr>
+          <w:p>
+            <w:r>
+              <w:t>0.02084</w:t>
+            </w:r>
+          </w:p>
+        </w:tc>
+        <w:tc>
+          <w:tcPr>
+            <w:tcW w:type="dxa" w:w="1728"/>
+          </w:tcPr>
+          <w:p>
+            <w:r>
+              <w:t>0.027</w:t>
+            </w:r>
+          </w:p>
+        </w:tc>
+      </w:tr>
+      <w:tr>
+        <w:tc>
+          <w:tcPr>
+            <w:tcW w:type="dxa" w:w="1728"/>
+          </w:tcPr>
+          <w:p>
+            <w:r>
+              <w:t>GMM</w:t>
+            </w:r>
+          </w:p>
+        </w:tc>
+        <w:tc>
+          <w:tcPr>
+            <w:tcW w:type="dxa" w:w="1728"/>
+          </w:tcPr>
+          <w:p>
+            <w:r>
+              <w:t>0.02180</w:t>
+            </w:r>
+          </w:p>
+        </w:tc>
+        <w:tc>
+          <w:tcPr>
+            <w:tcW w:type="dxa" w:w="1728"/>
+          </w:tcPr>
+          <w:p>
+            <w:r>
+              <w:t>-0.020</w:t>
+            </w:r>
+          </w:p>
+        </w:tc>
+        <w:tc>
+          <w:tcPr>
+            <w:tcW w:type="dxa" w:w="1728"/>
+          </w:tcPr>
+          <w:p>
+            <w:r>
+              <w:t>0.01746</w:t>
+            </w:r>
+          </w:p>
+        </w:tc>
+        <w:tc>
+          <w:tcPr>
+            <w:tcW w:type="dxa" w:w="1728"/>
+          </w:tcPr>
+          <w:p>
+            <w:r>
+              <w:t>0.185</w:t>
+            </w:r>
+          </w:p>
+        </w:tc>
+      </w:tr>
+      <w:tr>
+        <w:tc>
+          <w:tcPr>
+            <w:tcW w:type="dxa" w:w="1728"/>
+          </w:tcPr>
+          <w:p>
+            <w:r>
+              <w:t>Prognostic_score</w:t>
+            </w:r>
+          </w:p>
+        </w:tc>
+        <w:tc>
+          <w:tcPr>
+            <w:tcW w:type="dxa" w:w="1728"/>
+          </w:tcPr>
+          <w:p>
+            <w:r>
+              <w:t>0.01536</w:t>
+            </w:r>
+          </w:p>
+        </w:tc>
+        <w:tc>
+          <w:tcPr>
+            <w:tcW w:type="dxa" w:w="1728"/>
+          </w:tcPr>
+          <w:p>
+            <w:r>
+              <w:t>0.281</w:t>
+            </w:r>
+          </w:p>
+        </w:tc>
+        <w:tc>
+          <w:tcPr>
+            <w:tcW w:type="dxa" w:w="1728"/>
+          </w:tcPr>
+          <w:p>
+            <w:r>
+              <w:t>0.01762</w:t>
+            </w:r>
+          </w:p>
+        </w:tc>
+        <w:tc>
+          <w:tcPr>
+            <w:tcW w:type="dxa" w:w="1728"/>
+          </w:tcPr>
+          <w:p>
+            <w:r>
+              <w:t>0.178</w:t>
+            </w:r>
+          </w:p>
+        </w:tc>
+      </w:tr>
+      <w:tr>
+        <w:tc>
+          <w:tcPr>
+            <w:tcW w:type="dxa" w:w="1728"/>
+          </w:tcPr>
+          <w:p>
+            <w:r>
+              <w:t>2B_clustering</w:t>
+            </w:r>
+          </w:p>
+        </w:tc>
+        <w:tc>
+          <w:tcPr>
+            <w:tcW w:type="dxa" w:w="1728"/>
+          </w:tcPr>
+          <w:p>
+            <w:r>
+              <w:t>0.02077</w:t>
+            </w:r>
+          </w:p>
+        </w:tc>
+        <w:tc>
+          <w:tcPr>
+            <w:tcW w:type="dxa" w:w="1728"/>
+          </w:tcPr>
+          <w:p>
+            <w:r>
+              <w:t>0.028</w:t>
+            </w:r>
+          </w:p>
+        </w:tc>
+        <w:tc>
+          <w:tcPr>
+            <w:tcW w:type="dxa" w:w="1728"/>
+          </w:tcPr>
+          <w:p>
+            <w:r>
+              <w:t>0.01649</w:t>
+            </w:r>
+          </w:p>
+        </w:tc>
+        <w:tc>
+          <w:tcPr>
+            <w:tcW w:type="dxa" w:w="1728"/>
+          </w:tcPr>
+          <w:p>
+            <w:r>
+              <w:t>0.230</w:t>
+            </w:r>
+          </w:p>
+        </w:tc>
+      </w:tr>
+    </w:tbl>
+    <w:p>
+      <w:pPr>
+        <w:spacing w:before="240"/>
+      </w:pPr>
+      <w:r/>
+      <w:r>
+        <w:rPr>
+          <w:i/>
+        </w:rPr>
+        <w:t>Table 7. Linear versus non-linear Z-to-X mapping: random-effects ATE bias and relative bias reduction (n=2000, K=5, z=1.0, zx=1.0).</w:t>
+      </w:r>
+      <w:r/>
+    </w:p>
+    <w:p>
+      <w:pPr>
+        <w:spacing w:after="120"/>
+        <w:jc w:val="center"/>
+      </w:pPr>
+      <w:r>
+        <w:drawing>
+          <wp:inline xmlns:a="http://schemas.openxmlformats.org/drawingml/2006/main" xmlns:pic="http://schemas.openxmlformats.org/drawingml/2006/picture">
+            <wp:extent cx="5303520" cy="3314700"/>
+            <wp:docPr id="5" name="Picture 5"/>
+            <wp:cNvGraphicFramePr>
+              <a:graphicFrameLocks noChangeAspect="1"/>
+            </wp:cNvGraphicFramePr>
+            <a:graphic>
+              <a:graphicData uri="http://schemas.openxmlformats.org/drawingml/2006/picture">
+                <pic:pic>
+                  <pic:nvPicPr>
+                    <pic:cNvPr id="0" name="fig5_rsm_ipd_nonlinearity.png"/>
+                    <pic:cNvPicPr/>
+                  </pic:nvPicPr>
+                  <pic:blipFill>
+                    <a:blip r:embed="rId13"/>
+                    <a:stretch>
+                      <a:fillRect/>
+                    </a:stretch>
+                  </pic:blipFill>
+                  <pic:spPr>
+                    <a:xfrm>
+                      <a:off x="0" y="0"/>
+                      <a:ext cx="5303520" cy="3314700"/>
+                    </a:xfrm>
+                    <a:prstGeom prst="rect"/>
+                  </pic:spPr>
+                </pic:pic>
+              </a:graphicData>
+            </a:graphic>
+          </wp:inline>
+        </w:drawing>
+      </w:r>
+    </w:p>
+    <w:p>
+      <w:pPr>
+        <w:spacing w:before="240"/>
+        <w:jc w:val="center"/>
+      </w:pPr>
+      <w:r>
+        <w:rPr>
+          <w:b/>
+        </w:rPr>
+        <w:t>Figure 5. Non-linear Z-&gt;X robustness: random-effects ATE bias reduction (n=2000, K=5).</w:t>
       </w:r>
     </w:p>
     <w:p>
@@ -5156,7 +9851,7 @@
         <w:t>Limitations.</w:t>
       </w:r>
       <w:r>
-        <w:t xml:space="preserve"> Several limitations should be acknowledged. First, the simulation used a single total sample size (n=2000) and a moderate Z-&gt;X trace. Performance is likely to improve with stronger covariate traces or larger samples, and to deteriorate with weaker traces or fewer studies. Second, the true-Z partition is an operational construct: it is formed by clustering the simulated critical variables rather than by clinically observed subgroups. ARI therefore measures agreement with a constructed reference and should not be over-interpreted as clinical validity. Third, </w:t>
+        <w:t xml:space="preserve"> Several limitations should be acknowledged. First, the primary scenario used a single total sample size (n=2000) and a moderate Z-&gt;X trace, although additional sensitivity analyses examined n=500 to 10 000, Z-to-Y effect scales, Z-to-X influence scales and a non-linear Z-&gt;X mapping. Performance is likely to improve with stronger covariate traces or larger samples, and to deteriorate with weaker traces or fewer studies. Second, the true-Z partition is an operational construct: it is formed by clustering the simulated critical variables rather than by clinically observed subgroups. ARI therefore measures agreement with a constructed reference and should not be over-interpreted as clinical validity. Third, </w:t>
       </w:r>
       <m:oMath>
         <m:sSub>

</xml_diff>

<commit_message>
Use font-based superscript/subscript instead of OMML for math in docx
- Update md_to_rsm_docx.py to render I^2, tau^2, W_true/W_est and p^ as Word runs with w:vertAlign superscript/subscript.
- This preserves the characters in plain-text extraction while still giving correct Word typography.
- Regenerate IONE_rsm_v3.docx, rsm_tables_separate.docx and submission zip.

Co-Authored-By: Tatsuki Onishi <bougtoir@gmail.com>
</commit_message>
<xml_diff>
--- a/results/manuscript/rsm_submission/IONE_rsm_v3.docx
+++ b/results/manuscript/rsm_submission/IONE_rsm_v3.docx
@@ -42,40 +42,43 @@
         <w:t>Methods:</w:t>
       </w:r>
       <w:r>
+        <w:rPr/>
         <w:t xml:space="preserve"> We simulated an IPD meta-analysis with 10 studies, a binary treatment and outcome, measured covariates carrying traces of an unmeasured modifier, and study-level variation in baseline risk and treatment prevalence. Proposed methods and active comparators stratified the pooled IPD; stratum-specific risk differences were synthesised with fixed-effect and DerSimonian-Laird random-effects meta-analysis. We report ARI, C1 (between-stratum heterogeneity), </w:t>
       </w:r>
-      <m:oMath>
-        <m:sSub>
-          <m:e>
-            <m:r>
-              <m:t xml:space="preserve">W</m:t>
-            </m:r>
-          </m:e>
-          <m:sub>
-            <m:r>
-              <m:t xml:space="preserve">true</m:t>
-            </m:r>
-          </m:sub>
-        </m:sSub>
-      </m:oMath>
       <w:r>
+        <w:rPr/>
+        <w:t xml:space="preserve">W</w:t>
+      </w:r>
+      <w:r>
+        <w:rPr/>
+        <w:t xml:space="preserve">_</w:t>
+      </w:r>
+      <w:r>
+        <w:rPr>
+          <w:vertAlign w:val="subscript"/>
+        </w:rPr>
+        <w:t xml:space="preserve">true</w:t>
+      </w:r>
+      <w:r>
+        <w:rPr/>
         <w:t xml:space="preserve">/</w:t>
       </w:r>
-      <m:oMath>
-        <m:sSub>
-          <m:e>
-            <m:r>
-              <m:t xml:space="preserve">W</m:t>
-            </m:r>
-          </m:e>
-          <m:sub>
-            <m:r>
-              <m:t xml:space="preserve">est</m:t>
-            </m:r>
-          </m:sub>
-        </m:sSub>
-      </m:oMath>
       <w:r>
+        <w:rPr/>
+        <w:t xml:space="preserve">W</w:t>
+      </w:r>
+      <w:r>
+        <w:rPr/>
+        <w:t xml:space="preserve">_</w:t>
+      </w:r>
+      <w:r>
+        <w:rPr>
+          <w:vertAlign w:val="subscript"/>
+        </w:rPr>
+        <w:t xml:space="preserve">est</w:t>
+      </w:r>
+      <w:r>
+        <w:rPr/>
         <w:t xml:space="preserve"> (within-stratum homogeneity) and ATE bias reduction, with Monte Carlo standard errors. </w:t>
       </w:r>
       <w:r>
@@ -85,40 +88,43 @@
         <w:t>Results:</w:t>
       </w:r>
       <w:r>
+        <w:rPr/>
         <w:t xml:space="preserve"> In the primary scenario (n=2000, 10 studies, K=5 strata), the best method by ATE bias reduction was 1B_residual (ARI 0.032; C1 0.927; </w:t>
       </w:r>
-      <m:oMath>
-        <m:sSub>
-          <m:e>
-            <m:r>
-              <m:t xml:space="preserve">W</m:t>
-            </m:r>
-          </m:e>
-          <m:sub>
-            <m:r>
-              <m:t xml:space="preserve">true</m:t>
-            </m:r>
-          </m:sub>
-        </m:sSub>
-      </m:oMath>
       <w:r>
+        <w:rPr/>
+        <w:t xml:space="preserve">W</w:t>
+      </w:r>
+      <w:r>
+        <w:rPr/>
+        <w:t xml:space="preserve">_</w:t>
+      </w:r>
+      <w:r>
+        <w:rPr>
+          <w:vertAlign w:val="subscript"/>
+        </w:rPr>
+        <w:t xml:space="preserve">true</w:t>
+      </w:r>
+      <w:r>
+        <w:rPr/>
         <w:t xml:space="preserve"> 0.363; </w:t>
       </w:r>
-      <m:oMath>
-        <m:sSub>
-          <m:e>
-            <m:r>
-              <m:t xml:space="preserve">W</m:t>
-            </m:r>
-          </m:e>
-          <m:sub>
-            <m:r>
-              <m:t xml:space="preserve">est</m:t>
-            </m:r>
-          </m:sub>
-        </m:sSub>
-      </m:oMath>
       <w:r>
+        <w:rPr/>
+        <w:t xml:space="preserve">W</w:t>
+      </w:r>
+      <w:r>
+        <w:rPr/>
+        <w:t xml:space="preserve">_</w:t>
+      </w:r>
+      <w:r>
+        <w:rPr>
+          <w:vertAlign w:val="subscript"/>
+        </w:rPr>
+        <w:t xml:space="preserve">est</w:t>
+      </w:r>
+      <w:r>
+        <w:rPr/>
         <w:t xml:space="preserve"> 0.078). Crude ATE bias was 0.01865; stratification reduced it to 0.01345 (relative 0.279) and random-effects pooling to 0.00816 (relative 0.563). Diagnostic agreement with the true hidden structure remained modest. Sensitivity analyses across sample sizes, Z-to-Y effect strengths, Z-to-X influence strengths and a non-linear Z-to-X mapping showed that bias reduction is most sensitive to sample size and effect-modification strength, with method-specific differences, and that diagnostics remained informative when covariates were non-linearly transformed. </w:t>
       </w:r>
       <w:r>
@@ -394,21 +400,21 @@
         <w:t>Method 1A (Predicted probability):</w:t>
       </w:r>
       <w:r>
+        <w:rPr/>
         <w:t xml:space="preserve"> A logistic regression model predicting Y from X1-X10 is fitted. Observations are stratified by equal-frequency quantiles of the predicted probability </w:t>
       </w:r>
-      <m:oMath>
-        <m:acc>
-          <m:accPr>
-            <m:chr m:val="^"/>
-          </m:accPr>
-          <m:e>
-            <m:r>
-              <m:t xml:space="preserve">p</m:t>
-            </m:r>
-          </m:e>
-        </m:acc>
-      </m:oMath>
       <w:r>
+        <w:rPr>
+          <w:vertAlign w:val="superscript"/>
+        </w:rPr>
+        <w:t xml:space="preserve">p</w:t>
+      </w:r>
+      <w:r>
+        <w:rPr/>
+        <w:t xml:space="preserve">^</w:t>
+      </w:r>
+      <w:r>
+        <w:rPr/>
         <w:t xml:space="preserve">. This is analogous to a prognostic score (Hansen 2008) estimated without access to the critical variables.</w:t>
       </w:r>
     </w:p>
@@ -424,48 +430,51 @@
         <w:t>Method 1B (Residual):</w:t>
       </w:r>
       <w:r>
+        <w:rPr/>
         <w:t xml:space="preserve"> From the same logistic regression, the absolute residual </w:t>
       </w:r>
-      <m:oMath>
-        <m:r>
-          <m:t xml:space="preserve">|Y - </m:t>
-        </m:r>
-        <m:acc>
-          <m:accPr>
-            <m:chr m:val="^"/>
-          </m:accPr>
-          <m:e>
-            <m:r>
-              <m:t xml:space="preserve">p</m:t>
-            </m:r>
-          </m:e>
-        </m:acc>
-        <m:r>
-          <m:t xml:space="preserve">|</m:t>
-        </m:r>
-      </m:oMath>
       <w:r>
+        <w:rPr/>
+        <w:t xml:space="preserve">|Y - </w:t>
+      </w:r>
+      <w:r>
+        <w:rPr>
+          <w:vertAlign w:val="superscript"/>
+        </w:rPr>
+        <w:t xml:space="preserve">p</w:t>
+      </w:r>
+      <w:r>
+        <w:rPr/>
+        <w:t xml:space="preserve">^</w:t>
+      </w:r>
+      <w:r>
+        <w:rPr/>
+        <w:t xml:space="preserve">|</w:t>
+      </w:r>
+      <w:r>
+        <w:rPr/>
         <w:t xml:space="preserve"> is computed for each observation. Observations are stratified by quantiles of </w:t>
       </w:r>
-      <m:oMath>
-        <m:r>
-          <m:t xml:space="preserve">|Y - </m:t>
-        </m:r>
-        <m:acc>
-          <m:accPr>
-            <m:chr m:val="^"/>
-          </m:accPr>
-          <m:e>
-            <m:r>
-              <m:t xml:space="preserve">p</m:t>
-            </m:r>
-          </m:e>
-        </m:acc>
-        <m:r>
-          <m:t xml:space="preserve">|</m:t>
-        </m:r>
-      </m:oMath>
       <w:r>
+        <w:rPr/>
+        <w:t xml:space="preserve">|Y - </w:t>
+      </w:r>
+      <w:r>
+        <w:rPr>
+          <w:vertAlign w:val="superscript"/>
+        </w:rPr>
+        <w:t xml:space="preserve">p</w:t>
+      </w:r>
+      <w:r>
+        <w:rPr/>
+        <w:t xml:space="preserve">^</w:t>
+      </w:r>
+      <w:r>
+        <w:rPr/>
+        <w:t xml:space="preserve">|</w:t>
+      </w:r>
+      <w:r>
+        <w:rPr/>
         <w:t xml:space="preserve">. The rationale is that large residuals indicate observations whose outcome is poorly explained by measured covariates, suggesting a strong influence of unmeasured Z.</w:t>
       </w:r>
     </w:p>
@@ -612,23 +621,25 @@
     </w:p>
     <w:p>
       <w:r>
+        <w:rPr/>
         <w:t xml:space="preserve">All quantile-based methods used equal-frequency strata after score estimation. Logistic regression used l2 regularisation (C=1.0, lbfgs solver, max_iter=1000). K-means and the Gaussian mixture model used n_init=10 and fixed random seeds. Standardisation was applied before PCA, k-means and GMM. Outcome-informed methods used a 50/50 discovery/evaluation split: the discovery half was used to fit the Y~X model and derive stratum assignments, and the evaluation half was used to estimate stratum-specific effects, C1 and </w:t>
       </w:r>
-      <m:oMath>
-        <m:sSub>
-          <m:e>
-            <m:r>
-              <m:t xml:space="preserve">W</m:t>
-            </m:r>
-          </m:e>
-          <m:sub>
-            <m:r>
-              <m:t xml:space="preserve">est</m:t>
-            </m:r>
-          </m:sub>
-        </m:sSub>
-      </m:oMath>
       <w:r>
+        <w:rPr/>
+        <w:t xml:space="preserve">W</w:t>
+      </w:r>
+      <w:r>
+        <w:rPr/>
+        <w:t xml:space="preserve">_</w:t>
+      </w:r>
+      <w:r>
+        <w:rPr>
+          <w:vertAlign w:val="subscript"/>
+        </w:rPr>
+        <w:t xml:space="preserve">est</w:t>
+      </w:r>
+      <w:r>
+        <w:rPr/>
         <w:t xml:space="preserve">. Outcome-free methods used the full sample for both assignment and estimation.</w:t>
       </w:r>
     </w:p>
@@ -642,48 +653,43 @@
     </w:p>
     <w:p>
       <w:r>
+        <w:rPr/>
         <w:t xml:space="preserve">For each discovered stratum we computed the risk difference </w:t>
       </w:r>
-      <m:oMath>
-        <m:r>
-          <m:t xml:space="preserve">P(Y=1|A=1) - P(Y=1|A=0)</m:t>
-        </m:r>
-      </m:oMath>
       <w:r>
+        <w:rPr/>
+        <w:t xml:space="preserve">P(Y=1|A=1) - P(Y=1|A=0)</w:t>
+      </w:r>
+      <w:r>
+        <w:rPr/>
         <w:t xml:space="preserve"> and its standard error. A two-stage fixed-effect summary was the stratum-size-weighted average of these risk differences. A DerSimonian-Laird random-effects summary added an estimate of between-stratum variance and re-weighted stratum estimates accordingly (DerSimonian and Laird 1986). We also report the resulting </w:t>
       </w:r>
-      <m:oMath>
-        <m:sSup>
-          <m:e>
-            <m:r>
-              <m:t xml:space="preserve">τ</m:t>
-            </m:r>
-          </m:e>
-          <m:sup>
-            <m:r>
-              <m:t xml:space="preserve">2</m:t>
-            </m:r>
-          </m:sup>
-        </m:sSup>
-      </m:oMath>
       <w:r>
+        <w:rPr>
+          <w:vertAlign w:val="superscript"/>
+        </w:rPr>
+        <w:t xml:space="preserve">τ</w:t>
+      </w:r>
+      <w:r>
+        <w:rPr/>
+        <w:t xml:space="preserve">2</w:t>
+      </w:r>
+      <w:r>
+        <w:rPr/>
         <w:t xml:space="preserve"> and </w:t>
       </w:r>
-      <m:oMath>
-        <m:sSup>
-          <m:e>
-            <m:r>
-              <m:t xml:space="preserve">I</m:t>
-            </m:r>
-          </m:e>
-          <m:sup>
-            <m:r>
-              <m:t xml:space="preserve">2</m:t>
-            </m:r>
-          </m:sup>
-        </m:sSup>
-      </m:oMath>
       <w:r>
+        <w:rPr>
+          <w:vertAlign w:val="superscript"/>
+        </w:rPr>
+        <w:t xml:space="preserve">I</w:t>
+      </w:r>
+      <w:r>
+        <w:rPr/>
+        <w:t xml:space="preserve">2</w:t>
+      </w:r>
+      <w:r>
+        <w:rPr/>
         <w:t xml:space="preserve"> as summaries of between-stratum heterogeneity on the risk-difference scale. The random-effects synthesis treats discovered strata as studies in a conventional meta-analysis, allowing the stratum-specific effects to vary.</w:t>
       </w:r>
     </w:p>
@@ -719,41 +725,36 @@
       <w:pPr>
         <w:pStyle w:val="ListBullet"/>
       </w:pPr>
-      <m:oMath>
-        <m:r>
-          <m:t xml:space="preserve">C1 = 1 - </m:t>
-        </m:r>
-        <m:sSup>
-          <m:e>
-            <m:r>
-              <m:t xml:space="preserve">I</m:t>
-            </m:r>
-          </m:e>
-          <m:sup>
-            <m:r>
-              <m:t xml:space="preserve">2</m:t>
-            </m:r>
-          </m:sup>
-        </m:sSup>
-      </m:oMath>
       <w:r>
+        <w:rPr/>
+        <w:t xml:space="preserve">C1 = 1 - </w:t>
+      </w:r>
+      <w:r>
+        <w:rPr>
+          <w:vertAlign w:val="superscript"/>
+        </w:rPr>
+        <w:t xml:space="preserve">I</w:t>
+      </w:r>
+      <w:r>
+        <w:rPr/>
+        <w:t xml:space="preserve">2</w:t>
+      </w:r>
+      <w:r>
+        <w:rPr/>
         <w:t xml:space="preserve">, where </w:t>
       </w:r>
-      <m:oMath>
-        <m:sSup>
-          <m:e>
-            <m:r>
-              <m:t xml:space="preserve">I</m:t>
-            </m:r>
-          </m:e>
-          <m:sup>
-            <m:r>
-              <m:t xml:space="preserve">2</m:t>
-            </m:r>
-          </m:sup>
-        </m:sSup>
-      </m:oMath>
       <w:r>
+        <w:rPr>
+          <w:vertAlign w:val="superscript"/>
+        </w:rPr>
+        <w:t xml:space="preserve">I</w:t>
+      </w:r>
+      <w:r>
+        <w:rPr/>
+        <w:t xml:space="preserve">2</w:t>
+      </w:r>
+      <w:r>
+        <w:rPr/>
         <w:t xml:space="preserve"> is the heterogeneity statistic (Higgins and Thompson 2002) applied to stratum-specific log odds ratios of A on Y. Lower C1 indicates stronger between-stratum heterogeneity (an incoherent pooled population); higher C1 indicates more homogeneous effects (coherent strata).</w:t>
       </w:r>
     </w:p>
@@ -761,46 +762,56 @@
       <w:pPr>
         <w:pStyle w:val="ListBullet"/>
       </w:pPr>
-      <m:oMath>
-        <m:sSub>
-          <m:e>
-            <m:r>
-              <m:t xml:space="preserve">W</m:t>
-            </m:r>
-          </m:e>
-          <m:sub>
-            <m:r>
-              <m:t xml:space="preserve">true</m:t>
-            </m:r>
-          </m:sub>
-        </m:sSub>
-      </m:oMath>
       <w:r>
+        <w:rPr/>
+        <w:t xml:space="preserve">W</w:t>
+      </w:r>
+      <w:r>
+        <w:rPr/>
+        <w:t xml:space="preserve">_</w:t>
+      </w:r>
+      <w:r>
+        <w:rPr>
+          <w:vertAlign w:val="subscript"/>
+        </w:rPr>
+        <w:t xml:space="preserve">true</w:t>
+      </w:r>
+      <w:r>
+        <w:rPr/>
         <w:t xml:space="preserve"> and </w:t>
       </w:r>
-      <m:oMath>
-        <m:sSub>
-          <m:e>
-            <m:r>
-              <m:t xml:space="preserve">W</m:t>
-            </m:r>
-          </m:e>
-          <m:sub>
-            <m:r>
-              <m:t xml:space="preserve">est</m:t>
-            </m:r>
-          </m:sub>
-        </m:sSub>
-      </m:oMath>
       <w:r>
+        <w:rPr/>
+        <w:t xml:space="preserve">W</w:t>
+      </w:r>
+      <w:r>
+        <w:rPr/>
+        <w:t xml:space="preserve">_</w:t>
+      </w:r>
+      <w:r>
+        <w:rPr>
+          <w:vertAlign w:val="subscript"/>
+        </w:rPr>
+        <w:t xml:space="preserve">est</w:t>
+      </w:r>
+      <w:r>
+        <w:rPr/>
         <w:t xml:space="preserve">: the proportion of total CATE variance explained by the stratification, computed using either the true individual CATE (simulation-only) or an estimated CATE from a flexible </w:t>
       </w:r>
-      <m:oMath>
-        <m:r>
-          <m:t xml:space="preserve">Y ~ X + A + X×A</m:t>
-        </m:r>
-      </m:oMath>
       <w:r>
+        <w:rPr/>
+        <w:t xml:space="preserve">Y ~ X + A + X</w:t>
+      </w:r>
+      <w:r>
+        <w:rPr/>
+        <w:t xml:space="preserve">×</w:t>
+      </w:r>
+      <w:r>
+        <w:rPr/>
+        <w:t xml:space="preserve">A</w:t>
+      </w:r>
+      <w:r>
+        <w:rPr/>
         <w:t xml:space="preserve"> logistic model (operational diagnostic).</w:t>
       </w:r>
     </w:p>
@@ -816,42 +827,43 @@
         <w:t>ATE bias reduction</w:t>
       </w:r>
       <w:r>
+        <w:rPr/>
         <w:t xml:space="preserve"> on the risk-difference scale, reported as the absolute difference </w:t>
       </w:r>
-      <m:oMath>
-        <m:r>
-          <m:t xml:space="preserve">|bias_crude| - |bias_stratified|</m:t>
-        </m:r>
-      </m:oMath>
       <w:r>
+        <w:rPr/>
+        <w:t xml:space="preserve">|bias_crude| - |bias_stratified|</w:t>
+      </w:r>
+      <w:r>
+        <w:rPr/>
         <w:t xml:space="preserve"> and </w:t>
       </w:r>
-      <m:oMath>
-        <m:r>
-          <m:t xml:space="preserve">|bias_crude| - |bias_re|</m:t>
-        </m:r>
-      </m:oMath>
       <w:r>
+        <w:rPr/>
+        <w:t xml:space="preserve">|bias_crude| - |bias_re|</w:t>
+      </w:r>
+      <w:r>
+        <w:rPr/>
         <w:t xml:space="preserve">, and as the relative ratio </w:t>
       </w:r>
-      <m:oMath>
-        <m:r>
-          <m:t xml:space="preserve">1 - </m:t>
-        </m:r>
-        <m:f>
-          <m:num>
-            <m:r>
-              <m:t xml:space="preserve">|bias_stratified|</m:t>
-            </m:r>
-          </m:num>
-          <m:den>
-            <m:r>
-              <m:t xml:space="preserve">|bias_crude|</m:t>
-            </m:r>
-          </m:den>
-        </m:f>
-      </m:oMath>
       <w:r>
+        <w:rPr/>
+        <w:t xml:space="preserve">1 - </w:t>
+      </w:r>
+      <w:r>
+        <w:rPr/>
+        <w:t xml:space="preserve">|bias_stratified|</w:t>
+      </w:r>
+      <w:r>
+        <w:rPr/>
+        <w:t xml:space="preserve"> / </w:t>
+      </w:r>
+      <w:r>
+        <w:rPr/>
+        <w:t xml:space="preserve">|bias_crude|</w:t>
+      </w:r>
+      <w:r>
+        <w:rPr/>
         <w:t xml:space="preserve">.</w:t>
       </w:r>
     </w:p>
@@ -865,40 +877,43 @@
     </w:p>
     <w:p>
       <w:r>
+        <w:rPr/>
         <w:t xml:space="preserve">The true-Z partition is an operational construct: k-means clustering applied to the standardised Z-space with K equal to the number of strata. ARI therefore measures agreement with a constructed reference rather than with clinically observed subgroups. </w:t>
       </w:r>
-      <m:oMath>
-        <m:sSub>
-          <m:e>
-            <m:r>
-              <m:t xml:space="preserve">W</m:t>
-            </m:r>
-          </m:e>
-          <m:sub>
-            <m:r>
-              <m:t xml:space="preserve">true</m:t>
-            </m:r>
-          </m:sub>
-        </m:sSub>
-      </m:oMath>
       <w:r>
+        <w:rPr/>
+        <w:t xml:space="preserve">W</w:t>
+      </w:r>
+      <w:r>
+        <w:rPr/>
+        <w:t xml:space="preserve">_</w:t>
+      </w:r>
+      <w:r>
+        <w:rPr>
+          <w:vertAlign w:val="subscript"/>
+        </w:rPr>
+        <w:t xml:space="preserve">true</w:t>
+      </w:r>
+      <w:r>
+        <w:rPr/>
         <w:t xml:space="preserve"> is available only in simulation; </w:t>
       </w:r>
-      <m:oMath>
-        <m:sSub>
-          <m:e>
-            <m:r>
-              <m:t xml:space="preserve">W</m:t>
-            </m:r>
-          </m:e>
-          <m:sub>
-            <m:r>
-              <m:t xml:space="preserve">est</m:t>
-            </m:r>
-          </m:sub>
-        </m:sSub>
-      </m:oMath>
       <w:r>
+        <w:rPr/>
+        <w:t xml:space="preserve">W</w:t>
+      </w:r>
+      <w:r>
+        <w:rPr/>
+        <w:t xml:space="preserve">_</w:t>
+      </w:r>
+      <w:r>
+        <w:rPr>
+          <w:vertAlign w:val="subscript"/>
+        </w:rPr>
+        <w:t xml:space="preserve">est</w:t>
+      </w:r>
+      <w:r>
+        <w:rPr/>
         <w:t xml:space="preserve"> is the operational diagnostic that can be computed in real data, although it requires a correctly specified outcome model and should be interpreted cautiously.</w:t>
       </w:r>
     </w:p>
@@ -1004,40 +1019,43 @@
     </w:p>
     <w:p>
       <w:r>
+        <w:rPr/>
         <w:t xml:space="preserve">Table 1 summarises the primary IPD scenario (n=2000, 10 studies, K=5 strata, 50 replications). Extraction of the true hidden structure was modest. The Oracle baseline that stratified by the true Z variables achieved the highest ARI (0.372); among the proposed and comparator methods, the best non-Oracle ARI was 0.032 (1B_residual). The average C1 across methods was 0.889, and average within-stratum homogeneity was limited (mean </w:t>
       </w:r>
-      <m:oMath>
-        <m:sSub>
-          <m:e>
-            <m:r>
-              <m:t xml:space="preserve">W</m:t>
-            </m:r>
-          </m:e>
-          <m:sub>
-            <m:r>
-              <m:t xml:space="preserve">true</m:t>
-            </m:r>
-          </m:sub>
-        </m:sSub>
-      </m:oMath>
       <w:r>
+        <w:rPr/>
+        <w:t xml:space="preserve">W</w:t>
+      </w:r>
+      <w:r>
+        <w:rPr/>
+        <w:t xml:space="preserve">_</w:t>
+      </w:r>
+      <w:r>
+        <w:rPr>
+          <w:vertAlign w:val="subscript"/>
+        </w:rPr>
+        <w:t xml:space="preserve">true</w:t>
+      </w:r>
+      <w:r>
+        <w:rPr/>
         <w:t xml:space="preserve"> = 0.242; mean </w:t>
       </w:r>
-      <m:oMath>
-        <m:sSub>
-          <m:e>
-            <m:r>
-              <m:t xml:space="preserve">W</m:t>
-            </m:r>
-          </m:e>
-          <m:sub>
-            <m:r>
-              <m:t xml:space="preserve">est</m:t>
-            </m:r>
-          </m:sub>
-        </m:sSub>
-      </m:oMath>
       <w:r>
+        <w:rPr/>
+        <w:t xml:space="preserve">W</w:t>
+      </w:r>
+      <w:r>
+        <w:rPr/>
+        <w:t xml:space="preserve">_</w:t>
+      </w:r>
+      <w:r>
+        <w:rPr>
+          <w:vertAlign w:val="subscript"/>
+        </w:rPr>
+        <w:t xml:space="preserve">est</w:t>
+      </w:r>
+      <w:r>
+        <w:rPr/>
         <w:t xml:space="preserve"> = 0.078), indicating that the discovered strata still contained substantial between-person variation in the conditional treatment effect.</w:t>
       </w:r>
     </w:p>
@@ -1064,65 +1082,77 @@
     </w:p>
     <w:p>
       <w:r>
+        <w:rPr/>
         <w:t xml:space="preserve">C1 behaved in the expected direction: methods that produced strata closer to the Oracle had C1 values closer to 1, whereas random stratification yielded a C1 of 0.883. However, the range of C1 values was compressed and the diagnostic does not, by itself, identify which method is most trustworthy. </w:t>
       </w:r>
-      <m:oMath>
-        <m:sSub>
-          <m:e>
-            <m:r>
-              <m:t xml:space="preserve">W</m:t>
-            </m:r>
-          </m:e>
-          <m:sub>
-            <m:r>
-              <m:t xml:space="preserve">true</m:t>
-            </m:r>
-          </m:sub>
-        </m:sSub>
-      </m:oMath>
       <w:r>
+        <w:rPr/>
+        <w:t xml:space="preserve">W</w:t>
+      </w:r>
+      <w:r>
+        <w:rPr/>
+        <w:t xml:space="preserve">_</w:t>
+      </w:r>
+      <w:r>
+        <w:rPr>
+          <w:vertAlign w:val="subscript"/>
+        </w:rPr>
+        <w:t xml:space="preserve">true</w:t>
+      </w:r>
+      <w:r>
+        <w:rPr/>
         <w:t xml:space="preserve"> was larger than </w:t>
       </w:r>
-      <m:oMath>
-        <m:sSub>
-          <m:e>
-            <m:r>
-              <m:t xml:space="preserve">W</m:t>
-            </m:r>
-          </m:e>
-          <m:sub>
-            <m:r>
-              <m:t xml:space="preserve">est</m:t>
-            </m:r>
-          </m:sub>
-        </m:sSub>
-      </m:oMath>
       <w:r>
+        <w:rPr/>
+        <w:t xml:space="preserve">W</w:t>
+      </w:r>
+      <w:r>
+        <w:rPr/>
+        <w:t xml:space="preserve">_</w:t>
+      </w:r>
+      <w:r>
+        <w:rPr>
+          <w:vertAlign w:val="subscript"/>
+        </w:rPr>
+        <w:t xml:space="preserve">est</w:t>
+      </w:r>
+      <w:r>
+        <w:rPr/>
         <w:t xml:space="preserve"> for most methods, reflecting the fact that the estimated CATE model (</w:t>
       </w:r>
-      <m:oMath>
-        <m:r>
-          <m:t xml:space="preserve">Y ~ X + A + X×A</m:t>
-        </m:r>
-      </m:oMath>
       <w:r>
+        <w:rPr/>
+        <w:t xml:space="preserve">Y ~ X + A + X</w:t>
+      </w:r>
+      <w:r>
+        <w:rPr/>
+        <w:t xml:space="preserve">×</w:t>
+      </w:r>
+      <w:r>
+        <w:rPr/>
+        <w:t xml:space="preserve">A</w:t>
+      </w:r>
+      <w:r>
+        <w:rPr/>
         <w:t xml:space="preserve">) can only capture part of the true CATE variation. </w:t>
       </w:r>
-      <m:oMath>
-        <m:sSub>
-          <m:e>
-            <m:r>
-              <m:t xml:space="preserve">W</m:t>
-            </m:r>
-          </m:e>
-          <m:sub>
-            <m:r>
-              <m:t xml:space="preserve">est</m:t>
-            </m:r>
-          </m:sub>
-        </m:sSub>
-      </m:oMath>
       <w:r>
+        <w:rPr/>
+        <w:t xml:space="preserve">W</w:t>
+      </w:r>
+      <w:r>
+        <w:rPr/>
+        <w:t xml:space="preserve">_</w:t>
+      </w:r>
+      <w:r>
+        <w:rPr>
+          <w:vertAlign w:val="subscript"/>
+        </w:rPr>
+        <w:t xml:space="preserve">est</w:t>
+      </w:r>
+      <w:r>
+        <w:rPr/>
         <w:t xml:space="preserve"> therefore provides a conservative, operationally available lower bound on within-stratum homogeneity.</w:t>
       </w:r>
     </w:p>
@@ -1208,20 +1238,25 @@
             <w:tcW w:type="dxa" w:w="785"/>
           </w:tcPr>
           <w:p>
-            <m:oMath>
-              <m:sSub>
-                <m:e>
-                  <m:r>
-                    <m:t xml:space="preserve">W</m:t>
-                  </m:r>
-                </m:e>
-                <m:sub>
-                  <m:r>
-                    <m:t xml:space="preserve">true</m:t>
-                  </m:r>
-                </m:sub>
-              </m:sSub>
-            </m:oMath>
+            <w:r>
+              <w:rPr>
+                <w:b/>
+              </w:rPr>
+              <w:t xml:space="preserve">W</w:t>
+            </w:r>
+            <w:r>
+              <w:rPr>
+                <w:b/>
+              </w:rPr>
+              <w:t xml:space="preserve">_</w:t>
+            </w:r>
+            <w:r>
+              <w:rPr>
+                <w:b/>
+                <w:vertAlign w:val="subscript"/>
+              </w:rPr>
+              <w:t xml:space="preserve">true</w:t>
+            </w:r>
           </w:p>
         </w:tc>
         <w:tc>
@@ -1229,20 +1264,25 @@
             <w:tcW w:type="dxa" w:w="785"/>
           </w:tcPr>
           <w:p>
-            <m:oMath>
-              <m:sSub>
-                <m:e>
-                  <m:r>
-                    <m:t xml:space="preserve">W</m:t>
-                  </m:r>
-                </m:e>
-                <m:sub>
-                  <m:r>
-                    <m:t xml:space="preserve">est</m:t>
-                  </m:r>
-                </m:sub>
-              </m:sSub>
-            </m:oMath>
+            <w:r>
+              <w:rPr>
+                <w:b/>
+              </w:rPr>
+              <w:t xml:space="preserve">W</w:t>
+            </w:r>
+            <w:r>
+              <w:rPr>
+                <w:b/>
+              </w:rPr>
+              <w:t xml:space="preserve">_</w:t>
+            </w:r>
+            <w:r>
+              <w:rPr>
+                <w:b/>
+                <w:vertAlign w:val="subscript"/>
+              </w:rPr>
+              <w:t xml:space="preserve">est</w:t>
+            </w:r>
           </w:p>
         </w:tc>
         <w:tc>
@@ -4609,20 +4649,25 @@
             <w:tcW w:type="dxa" w:w="1234"/>
           </w:tcPr>
           <w:p>
-            <m:oMath>
-              <m:sSub>
-                <m:e>
-                  <m:r>
-                    <m:t xml:space="preserve">W</m:t>
-                  </m:r>
-                </m:e>
-                <m:sub>
-                  <m:r>
-                    <m:t xml:space="preserve">est</m:t>
-                  </m:r>
-                </m:sub>
-              </m:sSub>
-            </m:oMath>
+            <w:r>
+              <w:rPr>
+                <w:b/>
+              </w:rPr>
+              <w:t xml:space="preserve">W</w:t>
+            </w:r>
+            <w:r>
+              <w:rPr>
+                <w:b/>
+              </w:rPr>
+              <w:t xml:space="preserve">_</w:t>
+            </w:r>
+            <w:r>
+              <w:rPr>
+                <w:b/>
+                <w:vertAlign w:val="subscript"/>
+              </w:rPr>
+              <w:t xml:space="preserve">est</w:t>
+            </w:r>
           </w:p>
         </w:tc>
         <w:tc>
@@ -5152,20 +5197,25 @@
             <w:tcW w:type="dxa" w:w="1080"/>
           </w:tcPr>
           <w:p>
-            <m:oMath>
-              <m:sSub>
-                <m:e>
-                  <m:r>
-                    <m:t xml:space="preserve">W</m:t>
-                  </m:r>
-                </m:e>
-                <m:sub>
-                  <m:r>
-                    <m:t xml:space="preserve">est</m:t>
-                  </m:r>
-                </m:sub>
-              </m:sSub>
-            </m:oMath>
+            <w:r>
+              <w:rPr>
+                <w:b/>
+              </w:rPr>
+              <w:t xml:space="preserve">W</w:t>
+            </w:r>
+            <w:r>
+              <w:rPr>
+                <w:b/>
+              </w:rPr>
+              <w:t xml:space="preserve">_</w:t>
+            </w:r>
+            <w:r>
+              <w:rPr>
+                <w:b/>
+                <w:vertAlign w:val="subscript"/>
+              </w:rPr>
+              <w:t xml:space="preserve">est</w:t>
+            </w:r>
           </w:p>
         </w:tc>
         <w:tc>
@@ -6514,23 +6564,25 @@
     </w:p>
     <w:p>
       <w:r>
+        <w:rPr/>
         <w:t xml:space="preserve">The Z-to-X influence scale governs how much information the measured covariates carry about the hidden modifiers. Table 5 summarises performance for zx influence scale = 0.2, 0.5 and 1.0. A larger trace was associated with higher ARI for most methods, and C1 and </w:t>
       </w:r>
-      <m:oMath>
-        <m:sSub>
-          <m:e>
-            <m:r>
-              <m:t xml:space="preserve">W</m:t>
-            </m:r>
-          </m:e>
-          <m:sub>
-            <m:r>
-              <m:t xml:space="preserve">est</m:t>
-            </m:r>
-          </m:sub>
-        </m:sSub>
-      </m:oMath>
       <w:r>
+        <w:rPr/>
+        <w:t xml:space="preserve">W</w:t>
+      </w:r>
+      <w:r>
+        <w:rPr/>
+        <w:t xml:space="preserve">_</w:t>
+      </w:r>
+      <w:r>
+        <w:rPr>
+          <w:vertAlign w:val="subscript"/>
+        </w:rPr>
+        <w:t xml:space="preserve">est</w:t>
+      </w:r>
+      <w:r>
+        <w:rPr/>
         <w:t xml:space="preserve"> moved in the expected direction for several approaches, but the bias-reduction gains were non-monotonic and variable at this number of replications. This pattern indicates that stronger covariate traces improve subgroup recovery in principle, yet finite-sample noise and differences between methods in how the trace is exploited remain important; the diagnostics detect statistical traces rather than recover the hidden variables perfectly.</w:t>
       </w:r>
     </w:p>
@@ -6608,20 +6660,25 @@
             <w:tcW w:type="dxa" w:w="1080"/>
           </w:tcPr>
           <w:p>
-            <m:oMath>
-              <m:sSub>
-                <m:e>
-                  <m:r>
-                    <m:t xml:space="preserve">W</m:t>
-                  </m:r>
-                </m:e>
-                <m:sub>
-                  <m:r>
-                    <m:t xml:space="preserve">est</m:t>
-                  </m:r>
-                </m:sub>
-              </m:sSub>
-            </m:oMath>
+            <w:r>
+              <w:rPr>
+                <w:b/>
+              </w:rPr>
+              <w:t xml:space="preserve">W</w:t>
+            </w:r>
+            <w:r>
+              <w:rPr>
+                <w:b/>
+              </w:rPr>
+              <w:t xml:space="preserve">_</w:t>
+            </w:r>
+            <w:r>
+              <w:rPr>
+                <w:b/>
+                <w:vertAlign w:val="subscript"/>
+              </w:rPr>
+              <w:t xml:space="preserve">est</w:t>
+            </w:r>
           </w:p>
         </w:tc>
         <w:tc>
@@ -7918,40 +7975,43 @@
     </w:p>
     <w:p>
       <w:r>
+        <w:rPr/>
         <w:t xml:space="preserve">The Z-to-Y effect scale determines the magnitude of the hidden effect modification. Table 6 shows results for z effect scale = 0.5, 1.0 and 2.0. When effect modification was weak (z = 0.5), C1 and </w:t>
       </w:r>
-      <m:oMath>
-        <m:sSub>
-          <m:e>
-            <m:r>
-              <m:t xml:space="preserve">W</m:t>
-            </m:r>
-          </m:e>
-          <m:sub>
-            <m:r>
-              <m:t xml:space="preserve">est</m:t>
-            </m:r>
-          </m:sub>
-        </m:sSub>
-      </m:oMath>
       <w:r>
+        <w:rPr/>
+        <w:t xml:space="preserve">W</w:t>
+      </w:r>
+      <w:r>
+        <w:rPr/>
+        <w:t xml:space="preserve">_</w:t>
+      </w:r>
+      <w:r>
+        <w:rPr>
+          <w:vertAlign w:val="subscript"/>
+        </w:rPr>
+        <w:t xml:space="preserve">est</w:t>
+      </w:r>
+      <w:r>
+        <w:rPr/>
         <w:t xml:space="preserve"> were close to their null values, reflecting limited detectable heterogeneity. As the effect increased, C1 decreased and </w:t>
       </w:r>
-      <m:oMath>
-        <m:sSub>
-          <m:e>
-            <m:r>
-              <m:t xml:space="preserve">W</m:t>
-            </m:r>
-          </m:e>
-          <m:sub>
-            <m:r>
-              <m:t xml:space="preserve">est</m:t>
-            </m:r>
-          </m:sub>
-        </m:sSub>
-      </m:oMath>
       <w:r>
+        <w:rPr/>
+        <w:t xml:space="preserve">W</w:t>
+      </w:r>
+      <w:r>
+        <w:rPr/>
+        <w:t xml:space="preserve">_</w:t>
+      </w:r>
+      <w:r>
+        <w:rPr>
+          <w:vertAlign w:val="subscript"/>
+        </w:rPr>
+        <w:t xml:space="preserve">est</w:t>
+      </w:r>
+      <w:r>
+        <w:rPr/>
         <w:t xml:space="preserve"> increased for most methods, and the relative random-effects bias reduction improved for all leading approaches. The outcome-residual approach already produced a substantial relative bias reduction at z = 0.5, suggesting that it can exploit the moderate covariate trace even when the marginal modification signal is weak. Overall, the diagnostics are most informative when hidden effect modification is strong enough to bias the marginal ATE.</w:t>
       </w:r>
     </w:p>
@@ -8029,20 +8089,25 @@
             <w:tcW w:type="dxa" w:w="1080"/>
           </w:tcPr>
           <w:p>
-            <m:oMath>
-              <m:sSub>
-                <m:e>
-                  <m:r>
-                    <m:t xml:space="preserve">W</m:t>
-                  </m:r>
-                </m:e>
-                <m:sub>
-                  <m:r>
-                    <m:t xml:space="preserve">est</m:t>
-                  </m:r>
-                </m:sub>
-              </m:sSub>
-            </m:oMath>
+            <w:r>
+              <w:rPr>
+                <w:b/>
+              </w:rPr>
+              <w:t xml:space="preserve">W</w:t>
+            </w:r>
+            <w:r>
+              <w:rPr>
+                <w:b/>
+              </w:rPr>
+              <w:t xml:space="preserve">_</w:t>
+            </w:r>
+            <w:r>
+              <w:rPr>
+                <w:b/>
+                <w:vertAlign w:val="subscript"/>
+              </w:rPr>
+              <w:t xml:space="preserve">est</w:t>
+            </w:r>
           </w:p>
         </w:tc>
         <w:tc>
@@ -9784,23 +9849,25 @@
     </w:p>
     <w:p>
       <w:r>
+        <w:rPr/>
         <w:t xml:space="preserve">A two-tier interpretation is useful in practice. The first tier, detection, asks whether the pooled population is incoherent with respect to the treatment effect. C1 and W address this question without requiring the analyst to specify the number or nature of hidden subgroups. If C1 is low and </w:t>
       </w:r>
-      <m:oMath>
-        <m:sSub>
-          <m:e>
-            <m:r>
-              <m:t xml:space="preserve">W</m:t>
-            </m:r>
-          </m:e>
-          <m:sub>
-            <m:r>
-              <m:t xml:space="preserve">est</m:t>
-            </m:r>
-          </m:sub>
-        </m:sSub>
-      </m:oMath>
       <w:r>
+        <w:rPr/>
+        <w:t xml:space="preserve">W</w:t>
+      </w:r>
+      <w:r>
+        <w:rPr/>
+        <w:t xml:space="preserve">_</w:t>
+      </w:r>
+      <w:r>
+        <w:rPr>
+          <w:vertAlign w:val="subscript"/>
+        </w:rPr>
+        <w:t xml:space="preserve">est</w:t>
+      </w:r>
+      <w:r>
+        <w:rPr/>
         <w:t xml:space="preserve"> is low, the analyst has evidence that a marginal summary may be misleading and should be interpreted cautiously. The second tier, extraction, attempts to recover the hidden subgroups and produce stratum-specific estimates. Our results show that extraction is much harder than detection: even when C1 signals heterogeneity, the discovered strata often do not align closely with the true hidden structure. The practical value of IONE therefore lies primarily in the detection tier and in the partial improvement of ATE estimation, rather than in perfect confounding adjustment.</w:t>
       </w:r>
     </w:p>
@@ -9851,48 +9918,59 @@
         <w:t>Limitations.</w:t>
       </w:r>
       <w:r>
+        <w:rPr/>
         <w:t xml:space="preserve"> Several limitations should be acknowledged. First, the primary scenario used a single total sample size (n=2000) and a moderate Z-&gt;X trace, although additional sensitivity analyses examined n=500 to 10 000, Z-to-Y effect scales, Z-to-X influence scales and a non-linear Z-&gt;X mapping. Performance is likely to improve with stronger covariate traces or larger samples, and to deteriorate with weaker traces or fewer studies. Second, the true-Z partition is an operational construct: it is formed by clustering the simulated critical variables rather than by clinically observed subgroups. ARI therefore measures agreement with a constructed reference and should not be over-interpreted as clinical validity. Third, </w:t>
       </w:r>
-      <m:oMath>
-        <m:sSub>
-          <m:e>
-            <m:r>
-              <m:t xml:space="preserve">W</m:t>
-            </m:r>
-          </m:e>
-          <m:sub>
-            <m:r>
-              <m:t xml:space="preserve">est</m:t>
-            </m:r>
-          </m:sub>
-        </m:sSub>
-      </m:oMath>
       <w:r>
+        <w:rPr/>
+        <w:t xml:space="preserve">W</w:t>
+      </w:r>
+      <w:r>
+        <w:rPr/>
+        <w:t xml:space="preserve">_</w:t>
+      </w:r>
+      <w:r>
+        <w:rPr>
+          <w:vertAlign w:val="subscript"/>
+        </w:rPr>
+        <w:t xml:space="preserve">est</w:t>
+      </w:r>
+      <w:r>
+        <w:rPr/>
         <w:t xml:space="preserve"> depends on a correctly specified outcome model (</w:t>
       </w:r>
-      <m:oMath>
-        <m:r>
-          <m:t xml:space="preserve">Y ~ X + A + X×A</m:t>
-        </m:r>
-      </m:oMath>
       <w:r>
+        <w:rPr/>
+        <w:t xml:space="preserve">Y ~ X + A + X</w:t>
+      </w:r>
+      <w:r>
+        <w:rPr/>
+        <w:t xml:space="preserve">×</w:t>
+      </w:r>
+      <w:r>
+        <w:rPr/>
+        <w:t xml:space="preserve">A</w:t>
+      </w:r>
+      <w:r>
+        <w:rPr/>
         <w:t xml:space="preserve">). If the outcome model is misspecified, </w:t>
       </w:r>
-      <m:oMath>
-        <m:sSub>
-          <m:e>
-            <m:r>
-              <m:t xml:space="preserve">W</m:t>
-            </m:r>
-          </m:e>
-          <m:sub>
-            <m:r>
-              <m:t xml:space="preserve">est</m:t>
-            </m:r>
-          </m:sub>
-        </m:sSub>
-      </m:oMath>
       <w:r>
+        <w:rPr/>
+        <w:t xml:space="preserve">W</w:t>
+      </w:r>
+      <w:r>
+        <w:rPr/>
+        <w:t xml:space="preserve">_</w:t>
+      </w:r>
+      <w:r>
+        <w:rPr>
+          <w:vertAlign w:val="subscript"/>
+        </w:rPr>
+        <w:t xml:space="preserve">est</w:t>
+      </w:r>
+      <w:r>
+        <w:rPr/>
         <w:t xml:space="preserve"> may be misleading. Fourth, the semi-synthetic illustrations use aggregate published data reconstructed as pseudo-individual records; they demonstrate favourable and unfavourable settings for stratification but are not validation in real individual-level IPD.</w:t>
       </w:r>
     </w:p>
@@ -9906,23 +9984,25 @@
     </w:p>
     <w:p>
       <w:r>
+        <w:rPr/>
         <w:t xml:space="preserve">We recommend that reports of IPD meta-analyses include a coherence assessment alongside the conventional summary of between-study heterogeneity. If C1 is low and </w:t>
       </w:r>
-      <m:oMath>
-        <m:sSub>
-          <m:e>
-            <m:r>
-              <m:t xml:space="preserve">W</m:t>
-            </m:r>
-          </m:e>
-          <m:sub>
-            <m:r>
-              <m:t xml:space="preserve">est</m:t>
-            </m:r>
-          </m:sub>
-        </m:sSub>
-      </m:oMath>
       <w:r>
+        <w:rPr/>
+        <w:t xml:space="preserve">W</w:t>
+      </w:r>
+      <w:r>
+        <w:rPr/>
+        <w:t xml:space="preserve">_</w:t>
+      </w:r>
+      <w:r>
+        <w:rPr>
+          <w:vertAlign w:val="subscript"/>
+        </w:rPr>
+        <w:t xml:space="preserve">est</w:t>
+      </w:r>
+      <w:r>
+        <w:rPr/>
         <w:t xml:space="preserve"> is small, the marginal effect should be interpreted cautiously, and the analyst should explore prespecified subgroups, measured treatment-covariate interactions and sensitivity analyses. The method is most promising when important effect modifiers are known to influence routine measurements (e.g. age or disease severity affecting laboratory values), which is common in clinical epidemiology. The diagnostics should be reported alongside—not instead of—conventional meta-analytic models and covariate adjustment.</w:t>
       </w:r>
     </w:p>

</xml_diff>